<commit_message>
docs: Sửa lại phần bảng file báo cáo
</commit_message>
<xml_diff>
--- a/docs/QuanLyGargaOto/BaoCao_GARA_OTO.docx
+++ b/docs/QuanLyGargaOto/BaoCao_GARA_OTO.docx
@@ -116,6 +116,14 @@
     </w:p>
     <w:sdt>
       <w:sdtPr>
+        <w:rPr>
+          <w:rFonts w:asciiTheme="minorHAnsi" w:eastAsiaTheme="minorHAnsi" w:hAnsiTheme="minorHAnsi" w:cstheme="minorBidi"/>
+          <w:color w:val="auto"/>
+          <w:kern w:val="2"/>
+          <w:sz w:val="24"/>
+          <w:szCs w:val="24"/>
+          <w14:ligatures w14:val="standardContextual"/>
+        </w:rPr>
         <w:id w:val="-1340538631"/>
         <w:docPartObj>
           <w:docPartGallery w:val="Table of Contents"/>
@@ -124,15 +132,9 @@
       </w:sdtPr>
       <w:sdtEndPr>
         <w:rPr>
-          <w:rFonts w:asciiTheme="minorHAnsi" w:eastAsiaTheme="minorHAnsi" w:hAnsiTheme="minorHAnsi" w:cstheme="minorBidi"/>
           <w:b/>
           <w:bCs/>
           <w:noProof/>
-          <w:color w:val="auto"/>
-          <w:kern w:val="2"/>
-          <w:sz w:val="24"/>
-          <w:szCs w:val="24"/>
-          <w14:ligatures w14:val="standardContextual"/>
         </w:rPr>
       </w:sdtEndPr>
       <w:sdtContent>
@@ -8285,7 +8287,7 @@
           <w:noProof/>
         </w:rPr>
         <w:drawing>
-          <wp:inline distT="0" distB="0" distL="0" distR="0" wp14:anchorId="3FECF3C4" wp14:editId="3E7DA8E5">
+          <wp:inline distT="0" distB="0" distL="0" distR="0" wp14:anchorId="3FECF3C4" wp14:editId="240094E3">
             <wp:extent cx="4808220" cy="3566415"/>
             <wp:effectExtent l="0" t="0" r="0" b="0"/>
             <wp:docPr id="232891468" name="Picture 1"/>
@@ -8525,6 +8527,14 @@
         <w:tblW w:w="12345" w:type="dxa"/>
         <w:tblCellSpacing w:w="15" w:type="dxa"/>
         <w:tblInd w:w="-1276" w:type="dxa"/>
+        <w:tblBorders>
+          <w:top w:val="single" w:sz="4" w:space="0" w:color="auto"/>
+          <w:left w:val="single" w:sz="4" w:space="0" w:color="auto"/>
+          <w:bottom w:val="single" w:sz="4" w:space="0" w:color="auto"/>
+          <w:right w:val="single" w:sz="4" w:space="0" w:color="auto"/>
+          <w:insideH w:val="single" w:sz="4" w:space="0" w:color="auto"/>
+          <w:insideV w:val="single" w:sz="4" w:space="0" w:color="auto"/>
+        </w:tblBorders>
         <w:tblCellMar>
           <w:top w:w="15" w:type="dxa"/>
           <w:left w:w="15" w:type="dxa"/>
@@ -8539,15 +8549,15 @@
         <w:gridCol w:w="1028"/>
         <w:gridCol w:w="848"/>
         <w:gridCol w:w="990"/>
-        <w:gridCol w:w="850"/>
-        <w:gridCol w:w="905"/>
-        <w:gridCol w:w="399"/>
-        <w:gridCol w:w="420"/>
-        <w:gridCol w:w="623"/>
-        <w:gridCol w:w="515"/>
-        <w:gridCol w:w="483"/>
-        <w:gridCol w:w="1021"/>
-        <w:gridCol w:w="1047"/>
+        <w:gridCol w:w="843"/>
+        <w:gridCol w:w="913"/>
+        <w:gridCol w:w="418"/>
+        <w:gridCol w:w="439"/>
+        <w:gridCol w:w="629"/>
+        <w:gridCol w:w="524"/>
+        <w:gridCol w:w="494"/>
+        <w:gridCol w:w="994"/>
+        <w:gridCol w:w="1009"/>
         <w:gridCol w:w="696"/>
       </w:tblGrid>
       <w:tr>
@@ -10341,6 +10351,14 @@
       <w:tblPr>
         <w:tblW w:w="0" w:type="auto"/>
         <w:tblCellSpacing w:w="15" w:type="dxa"/>
+        <w:tblBorders>
+          <w:top w:val="single" w:sz="4" w:space="0" w:color="auto"/>
+          <w:left w:val="single" w:sz="4" w:space="0" w:color="auto"/>
+          <w:bottom w:val="single" w:sz="4" w:space="0" w:color="auto"/>
+          <w:right w:val="single" w:sz="4" w:space="0" w:color="auto"/>
+          <w:insideH w:val="single" w:sz="4" w:space="0" w:color="auto"/>
+          <w:insideV w:val="single" w:sz="4" w:space="0" w:color="auto"/>
+        </w:tblBorders>
         <w:tblCellMar>
           <w:top w:w="15" w:type="dxa"/>
           <w:left w:w="15" w:type="dxa"/>
@@ -10350,21 +10368,21 @@
         <w:tblLook w:val="04A0" w:firstRow="1" w:lastRow="0" w:firstColumn="1" w:lastColumn="0" w:noHBand="0" w:noVBand="1"/>
       </w:tblPr>
       <w:tblGrid>
-        <w:gridCol w:w="416"/>
-        <w:gridCol w:w="943"/>
-        <w:gridCol w:w="730"/>
-        <w:gridCol w:w="585"/>
-        <w:gridCol w:w="667"/>
-        <w:gridCol w:w="727"/>
-        <w:gridCol w:w="865"/>
-        <w:gridCol w:w="381"/>
-        <w:gridCol w:w="410"/>
-        <w:gridCol w:w="577"/>
-        <w:gridCol w:w="479"/>
-        <w:gridCol w:w="451"/>
-        <w:gridCol w:w="1100"/>
-        <w:gridCol w:w="850"/>
-        <w:gridCol w:w="526"/>
+        <w:gridCol w:w="436"/>
+        <w:gridCol w:w="952"/>
+        <w:gridCol w:w="750"/>
+        <w:gridCol w:w="589"/>
+        <w:gridCol w:w="642"/>
+        <w:gridCol w:w="719"/>
+        <w:gridCol w:w="869"/>
+        <w:gridCol w:w="401"/>
+        <w:gridCol w:w="430"/>
+        <w:gridCol w:w="579"/>
+        <w:gridCol w:w="484"/>
+        <w:gridCol w:w="458"/>
+        <w:gridCol w:w="1069"/>
+        <w:gridCol w:w="792"/>
+        <w:gridCol w:w="527"/>
       </w:tblGrid>
       <w:tr>
         <w:trPr>
@@ -11539,6 +11557,14 @@
       <w:tblPr>
         <w:tblW w:w="0" w:type="auto"/>
         <w:tblCellSpacing w:w="15" w:type="dxa"/>
+        <w:tblBorders>
+          <w:top w:val="single" w:sz="4" w:space="0" w:color="auto"/>
+          <w:left w:val="single" w:sz="4" w:space="0" w:color="auto"/>
+          <w:bottom w:val="single" w:sz="4" w:space="0" w:color="auto"/>
+          <w:right w:val="single" w:sz="4" w:space="0" w:color="auto"/>
+          <w:insideH w:val="single" w:sz="4" w:space="0" w:color="auto"/>
+          <w:insideV w:val="single" w:sz="4" w:space="0" w:color="auto"/>
+        </w:tblBorders>
         <w:tblCellMar>
           <w:top w:w="15" w:type="dxa"/>
           <w:left w:w="15" w:type="dxa"/>
@@ -11548,21 +11574,21 @@
         <w:tblLook w:val="04A0" w:firstRow="1" w:lastRow="0" w:firstColumn="1" w:lastColumn="0" w:noHBand="0" w:noVBand="1"/>
       </w:tblPr>
       <w:tblGrid>
-        <w:gridCol w:w="416"/>
-        <w:gridCol w:w="1181"/>
-        <w:gridCol w:w="670"/>
-        <w:gridCol w:w="544"/>
-        <w:gridCol w:w="553"/>
-        <w:gridCol w:w="655"/>
-        <w:gridCol w:w="825"/>
-        <w:gridCol w:w="381"/>
-        <w:gridCol w:w="410"/>
-        <w:gridCol w:w="532"/>
-        <w:gridCol w:w="443"/>
-        <w:gridCol w:w="419"/>
-        <w:gridCol w:w="1423"/>
-        <w:gridCol w:w="655"/>
+        <w:gridCol w:w="437"/>
+        <w:gridCol w:w="1201"/>
+        <w:gridCol w:w="690"/>
+        <w:gridCol w:w="549"/>
+        <w:gridCol w:w="529"/>
+        <w:gridCol w:w="647"/>
+        <w:gridCol w:w="830"/>
+        <w:gridCol w:w="401"/>
+        <w:gridCol w:w="430"/>
+        <w:gridCol w:w="534"/>
+        <w:gridCol w:w="449"/>
+        <w:gridCol w:w="427"/>
+        <w:gridCol w:w="1394"/>
         <w:gridCol w:w="600"/>
+        <w:gridCol w:w="579"/>
       </w:tblGrid>
       <w:tr>
         <w:trPr>
@@ -13751,6 +13777,14 @@
         <w:tblOverlap w:val="never"/>
         <w:tblW w:w="0" w:type="auto"/>
         <w:tblCellSpacing w:w="15" w:type="dxa"/>
+        <w:tblBorders>
+          <w:top w:val="single" w:sz="4" w:space="0" w:color="auto"/>
+          <w:left w:val="single" w:sz="4" w:space="0" w:color="auto"/>
+          <w:bottom w:val="single" w:sz="4" w:space="0" w:color="auto"/>
+          <w:right w:val="single" w:sz="4" w:space="0" w:color="auto"/>
+          <w:insideH w:val="single" w:sz="4" w:space="0" w:color="auto"/>
+          <w:insideV w:val="single" w:sz="4" w:space="0" w:color="auto"/>
+        </w:tblBorders>
         <w:tblCellMar>
           <w:top w:w="15" w:type="dxa"/>
           <w:left w:w="15" w:type="dxa"/>
@@ -13760,21 +13794,21 @@
         <w:tblLook w:val="04A0" w:firstRow="1" w:lastRow="0" w:firstColumn="1" w:lastColumn="0" w:noHBand="0" w:noVBand="1"/>
       </w:tblPr>
       <w:tblGrid>
-        <w:gridCol w:w="417"/>
-        <w:gridCol w:w="958"/>
-        <w:gridCol w:w="730"/>
-        <w:gridCol w:w="550"/>
-        <w:gridCol w:w="570"/>
-        <w:gridCol w:w="1058"/>
-        <w:gridCol w:w="831"/>
-        <w:gridCol w:w="381"/>
-        <w:gridCol w:w="410"/>
-        <w:gridCol w:w="538"/>
-        <w:gridCol w:w="448"/>
-        <w:gridCol w:w="424"/>
-        <w:gridCol w:w="1062"/>
-        <w:gridCol w:w="684"/>
-        <w:gridCol w:w="646"/>
+        <w:gridCol w:w="437"/>
+        <w:gridCol w:w="969"/>
+        <w:gridCol w:w="750"/>
+        <w:gridCol w:w="557"/>
+        <w:gridCol w:w="552"/>
+        <w:gridCol w:w="1029"/>
+        <w:gridCol w:w="838"/>
+        <w:gridCol w:w="401"/>
+        <w:gridCol w:w="430"/>
+        <w:gridCol w:w="543"/>
+        <w:gridCol w:w="456"/>
+        <w:gridCol w:w="434"/>
+        <w:gridCol w:w="1041"/>
+        <w:gridCol w:w="640"/>
+        <w:gridCol w:w="620"/>
       </w:tblGrid>
       <w:tr>
         <w:trPr>
@@ -15940,6 +15974,14 @@
       <w:tblPr>
         <w:tblW w:w="0" w:type="auto"/>
         <w:tblCellSpacing w:w="15" w:type="dxa"/>
+        <w:tblBorders>
+          <w:top w:val="single" w:sz="4" w:space="0" w:color="auto"/>
+          <w:left w:val="single" w:sz="4" w:space="0" w:color="auto"/>
+          <w:bottom w:val="single" w:sz="4" w:space="0" w:color="auto"/>
+          <w:right w:val="single" w:sz="4" w:space="0" w:color="auto"/>
+          <w:insideH w:val="single" w:sz="4" w:space="0" w:color="auto"/>
+          <w:insideV w:val="single" w:sz="4" w:space="0" w:color="auto"/>
+        </w:tblBorders>
         <w:tblCellMar>
           <w:top w:w="15" w:type="dxa"/>
           <w:left w:w="15" w:type="dxa"/>
@@ -15949,21 +15991,21 @@
         <w:tblLook w:val="04A0" w:firstRow="1" w:lastRow="0" w:firstColumn="1" w:lastColumn="0" w:noHBand="0" w:noVBand="1"/>
       </w:tblPr>
       <w:tblGrid>
-        <w:gridCol w:w="417"/>
-        <w:gridCol w:w="1038"/>
-        <w:gridCol w:w="730"/>
-        <w:gridCol w:w="563"/>
-        <w:gridCol w:w="607"/>
-        <w:gridCol w:w="689"/>
-        <w:gridCol w:w="844"/>
-        <w:gridCol w:w="381"/>
-        <w:gridCol w:w="410"/>
-        <w:gridCol w:w="553"/>
-        <w:gridCol w:w="460"/>
-        <w:gridCol w:w="434"/>
-        <w:gridCol w:w="1167"/>
-        <w:gridCol w:w="747"/>
-        <w:gridCol w:w="667"/>
+        <w:gridCol w:w="437"/>
+        <w:gridCol w:w="1052"/>
+        <w:gridCol w:w="750"/>
+        <w:gridCol w:w="569"/>
+        <w:gridCol w:w="586"/>
+        <w:gridCol w:w="683"/>
+        <w:gridCol w:w="850"/>
+        <w:gridCol w:w="401"/>
+        <w:gridCol w:w="430"/>
+        <w:gridCol w:w="557"/>
+        <w:gridCol w:w="467"/>
+        <w:gridCol w:w="443"/>
+        <w:gridCol w:w="1147"/>
+        <w:gridCol w:w="698"/>
+        <w:gridCol w:w="627"/>
       </w:tblGrid>
       <w:tr>
         <w:trPr>
@@ -17445,6 +17487,14 @@
       <w:tblPr>
         <w:tblW w:w="0" w:type="auto"/>
         <w:tblCellSpacing w:w="15" w:type="dxa"/>
+        <w:tblBorders>
+          <w:top w:val="single" w:sz="4" w:space="0" w:color="auto"/>
+          <w:left w:val="single" w:sz="4" w:space="0" w:color="auto"/>
+          <w:bottom w:val="single" w:sz="4" w:space="0" w:color="auto"/>
+          <w:right w:val="single" w:sz="4" w:space="0" w:color="auto"/>
+          <w:insideH w:val="single" w:sz="4" w:space="0" w:color="auto"/>
+          <w:insideV w:val="single" w:sz="4" w:space="0" w:color="auto"/>
+        </w:tblBorders>
         <w:tblCellMar>
           <w:top w:w="15" w:type="dxa"/>
           <w:left w:w="15" w:type="dxa"/>
@@ -17454,21 +17504,21 @@
         <w:tblLook w:val="04A0" w:firstRow="1" w:lastRow="0" w:firstColumn="1" w:lastColumn="0" w:noHBand="0" w:noVBand="1"/>
       </w:tblPr>
       <w:tblGrid>
-        <w:gridCol w:w="417"/>
-        <w:gridCol w:w="1026"/>
-        <w:gridCol w:w="730"/>
-        <w:gridCol w:w="566"/>
-        <w:gridCol w:w="614"/>
-        <w:gridCol w:w="729"/>
-        <w:gridCol w:w="847"/>
-        <w:gridCol w:w="381"/>
-        <w:gridCol w:w="410"/>
-        <w:gridCol w:w="556"/>
-        <w:gridCol w:w="462"/>
         <w:gridCol w:w="436"/>
-        <w:gridCol w:w="1160"/>
-        <w:gridCol w:w="760"/>
-        <w:gridCol w:w="613"/>
+        <w:gridCol w:w="1037"/>
+        <w:gridCol w:w="750"/>
+        <w:gridCol w:w="571"/>
+        <w:gridCol w:w="591"/>
+        <w:gridCol w:w="712"/>
+        <w:gridCol w:w="852"/>
+        <w:gridCol w:w="401"/>
+        <w:gridCol w:w="430"/>
+        <w:gridCol w:w="559"/>
+        <w:gridCol w:w="468"/>
+        <w:gridCol w:w="444"/>
+        <w:gridCol w:w="1137"/>
+        <w:gridCol w:w="706"/>
+        <w:gridCol w:w="603"/>
       </w:tblGrid>
       <w:tr>
         <w:trPr>
@@ -19261,6 +19311,7 @@
                 <w:sz w:val="18"/>
                 <w:szCs w:val="18"/>
               </w:rPr>
+              <w:lastRenderedPageBreak/>
               <w:t>5</w:t>
             </w:r>
           </w:p>
@@ -19602,7 +19653,6 @@
                 <w:sz w:val="18"/>
                 <w:szCs w:val="18"/>
               </w:rPr>
-              <w:lastRenderedPageBreak/>
               <w:t>6</w:t>
             </w:r>
           </w:p>
@@ -19951,6 +20001,15 @@
       <w:tblPr>
         <w:tblW w:w="0" w:type="auto"/>
         <w:tblCellSpacing w:w="15" w:type="dxa"/>
+        <w:tblBorders>
+          <w:top w:val="single" w:sz="4" w:space="0" w:color="auto"/>
+          <w:left w:val="single" w:sz="4" w:space="0" w:color="auto"/>
+          <w:bottom w:val="single" w:sz="4" w:space="0" w:color="auto"/>
+          <w:right w:val="single" w:sz="4" w:space="0" w:color="auto"/>
+          <w:insideH w:val="single" w:sz="4" w:space="0" w:color="auto"/>
+          <w:insideV w:val="single" w:sz="4" w:space="0" w:color="auto"/>
+        </w:tblBorders>
+        <w:tblLayout w:type="fixed"/>
         <w:tblCellMar>
           <w:top w:w="15" w:type="dxa"/>
           <w:left w:w="15" w:type="dxa"/>
@@ -19960,21 +20019,21 @@
         <w:tblLook w:val="04A0" w:firstRow="1" w:lastRow="0" w:firstColumn="1" w:lastColumn="0" w:noHBand="0" w:noVBand="1"/>
       </w:tblPr>
       <w:tblGrid>
-        <w:gridCol w:w="416"/>
-        <w:gridCol w:w="1344"/>
-        <w:gridCol w:w="670"/>
-        <w:gridCol w:w="515"/>
-        <w:gridCol w:w="473"/>
-        <w:gridCol w:w="604"/>
-        <w:gridCol w:w="797"/>
-        <w:gridCol w:w="381"/>
-        <w:gridCol w:w="410"/>
-        <w:gridCol w:w="500"/>
-        <w:gridCol w:w="418"/>
+        <w:gridCol w:w="562"/>
+        <w:gridCol w:w="1218"/>
+        <w:gridCol w:w="682"/>
+        <w:gridCol w:w="522"/>
+        <w:gridCol w:w="466"/>
+        <w:gridCol w:w="603"/>
+        <w:gridCol w:w="800"/>
         <w:gridCol w:w="397"/>
-        <w:gridCol w:w="1691"/>
-        <w:gridCol w:w="518"/>
-        <w:gridCol w:w="573"/>
+        <w:gridCol w:w="425"/>
+        <w:gridCol w:w="505"/>
+        <w:gridCol w:w="426"/>
+        <w:gridCol w:w="407"/>
+        <w:gridCol w:w="1640"/>
+        <w:gridCol w:w="495"/>
+        <w:gridCol w:w="549"/>
       </w:tblGrid>
       <w:tr>
         <w:trPr>
@@ -19983,7 +20042,7 @@
         </w:trPr>
         <w:tc>
           <w:tcPr>
-            <w:tcW w:w="0" w:type="auto"/>
+            <w:tcW w:w="517" w:type="dxa"/>
             <w:vAlign w:val="center"/>
             <w:hideMark/>
           </w:tcPr>
@@ -20011,7 +20070,7 @@
         </w:tc>
         <w:tc>
           <w:tcPr>
-            <w:tcW w:w="0" w:type="auto"/>
+            <w:tcW w:w="1188" w:type="dxa"/>
             <w:vAlign w:val="center"/>
             <w:hideMark/>
           </w:tcPr>
@@ -20039,7 +20098,7 @@
         </w:tc>
         <w:tc>
           <w:tcPr>
-            <w:tcW w:w="0" w:type="auto"/>
+            <w:tcW w:w="652" w:type="dxa"/>
             <w:vAlign w:val="center"/>
             <w:hideMark/>
           </w:tcPr>
@@ -20067,7 +20126,7 @@
         </w:tc>
         <w:tc>
           <w:tcPr>
-            <w:tcW w:w="0" w:type="auto"/>
+            <w:tcW w:w="492" w:type="dxa"/>
             <w:vAlign w:val="center"/>
             <w:hideMark/>
           </w:tcPr>
@@ -20095,7 +20154,7 @@
         </w:tc>
         <w:tc>
           <w:tcPr>
-            <w:tcW w:w="0" w:type="auto"/>
+            <w:tcW w:w="436" w:type="dxa"/>
             <w:vAlign w:val="center"/>
             <w:hideMark/>
           </w:tcPr>
@@ -20123,7 +20182,7 @@
         </w:tc>
         <w:tc>
           <w:tcPr>
-            <w:tcW w:w="0" w:type="auto"/>
+            <w:tcW w:w="573" w:type="dxa"/>
             <w:vAlign w:val="center"/>
             <w:hideMark/>
           </w:tcPr>
@@ -20151,7 +20210,7 @@
         </w:tc>
         <w:tc>
           <w:tcPr>
-            <w:tcW w:w="0" w:type="auto"/>
+            <w:tcW w:w="770" w:type="dxa"/>
             <w:vAlign w:val="center"/>
             <w:hideMark/>
           </w:tcPr>
@@ -20179,7 +20238,7 @@
         </w:tc>
         <w:tc>
           <w:tcPr>
-            <w:tcW w:w="0" w:type="auto"/>
+            <w:tcW w:w="367" w:type="dxa"/>
             <w:vAlign w:val="center"/>
             <w:hideMark/>
           </w:tcPr>
@@ -20207,7 +20266,7 @@
         </w:tc>
         <w:tc>
           <w:tcPr>
-            <w:tcW w:w="0" w:type="auto"/>
+            <w:tcW w:w="395" w:type="dxa"/>
             <w:vAlign w:val="center"/>
             <w:hideMark/>
           </w:tcPr>
@@ -20235,7 +20294,7 @@
         </w:tc>
         <w:tc>
           <w:tcPr>
-            <w:tcW w:w="0" w:type="auto"/>
+            <w:tcW w:w="475" w:type="dxa"/>
             <w:vAlign w:val="center"/>
             <w:hideMark/>
           </w:tcPr>
@@ -20263,7 +20322,7 @@
         </w:tc>
         <w:tc>
           <w:tcPr>
-            <w:tcW w:w="0" w:type="auto"/>
+            <w:tcW w:w="396" w:type="dxa"/>
             <w:vAlign w:val="center"/>
             <w:hideMark/>
           </w:tcPr>
@@ -20291,7 +20350,7 @@
         </w:tc>
         <w:tc>
           <w:tcPr>
-            <w:tcW w:w="0" w:type="auto"/>
+            <w:tcW w:w="377" w:type="dxa"/>
             <w:vAlign w:val="center"/>
             <w:hideMark/>
           </w:tcPr>
@@ -20319,7 +20378,7 @@
         </w:tc>
         <w:tc>
           <w:tcPr>
-            <w:tcW w:w="0" w:type="auto"/>
+            <w:tcW w:w="1610" w:type="dxa"/>
             <w:vAlign w:val="center"/>
             <w:hideMark/>
           </w:tcPr>
@@ -20347,7 +20406,7 @@
         </w:tc>
         <w:tc>
           <w:tcPr>
-            <w:tcW w:w="0" w:type="auto"/>
+            <w:tcW w:w="465" w:type="dxa"/>
             <w:vAlign w:val="center"/>
             <w:hideMark/>
           </w:tcPr>
@@ -20375,7 +20434,7 @@
         </w:tc>
         <w:tc>
           <w:tcPr>
-            <w:tcW w:w="0" w:type="auto"/>
+            <w:tcW w:w="504" w:type="dxa"/>
             <w:vAlign w:val="center"/>
             <w:hideMark/>
           </w:tcPr>
@@ -20408,7 +20467,7 @@
         </w:trPr>
         <w:tc>
           <w:tcPr>
-            <w:tcW w:w="0" w:type="auto"/>
+            <w:tcW w:w="517" w:type="dxa"/>
             <w:vAlign w:val="center"/>
             <w:hideMark/>
           </w:tcPr>
@@ -20432,7 +20491,7 @@
         </w:tc>
         <w:tc>
           <w:tcPr>
-            <w:tcW w:w="0" w:type="auto"/>
+            <w:tcW w:w="1188" w:type="dxa"/>
             <w:vAlign w:val="center"/>
             <w:hideMark/>
           </w:tcPr>
@@ -20456,7 +20515,7 @@
         </w:tc>
         <w:tc>
           <w:tcPr>
-            <w:tcW w:w="0" w:type="auto"/>
+            <w:tcW w:w="652" w:type="dxa"/>
             <w:vAlign w:val="center"/>
             <w:hideMark/>
           </w:tcPr>
@@ -20480,7 +20539,7 @@
         </w:tc>
         <w:tc>
           <w:tcPr>
-            <w:tcW w:w="0" w:type="auto"/>
+            <w:tcW w:w="492" w:type="dxa"/>
             <w:vAlign w:val="center"/>
             <w:hideMark/>
           </w:tcPr>
@@ -20504,7 +20563,7 @@
         </w:tc>
         <w:tc>
           <w:tcPr>
-            <w:tcW w:w="0" w:type="auto"/>
+            <w:tcW w:w="436" w:type="dxa"/>
             <w:vAlign w:val="center"/>
             <w:hideMark/>
           </w:tcPr>
@@ -20528,7 +20587,7 @@
         </w:tc>
         <w:tc>
           <w:tcPr>
-            <w:tcW w:w="0" w:type="auto"/>
+            <w:tcW w:w="573" w:type="dxa"/>
             <w:vAlign w:val="center"/>
             <w:hideMark/>
           </w:tcPr>
@@ -20552,7 +20611,7 @@
         </w:tc>
         <w:tc>
           <w:tcPr>
-            <w:tcW w:w="0" w:type="auto"/>
+            <w:tcW w:w="770" w:type="dxa"/>
             <w:vAlign w:val="center"/>
             <w:hideMark/>
           </w:tcPr>
@@ -20576,7 +20635,7 @@
         </w:tc>
         <w:tc>
           <w:tcPr>
-            <w:tcW w:w="0" w:type="auto"/>
+            <w:tcW w:w="367" w:type="dxa"/>
             <w:vAlign w:val="center"/>
             <w:hideMark/>
           </w:tcPr>
@@ -20600,7 +20659,7 @@
         </w:tc>
         <w:tc>
           <w:tcPr>
-            <w:tcW w:w="0" w:type="auto"/>
+            <w:tcW w:w="395" w:type="dxa"/>
             <w:vAlign w:val="center"/>
             <w:hideMark/>
           </w:tcPr>
@@ -20624,7 +20683,7 @@
         </w:tc>
         <w:tc>
           <w:tcPr>
-            <w:tcW w:w="0" w:type="auto"/>
+            <w:tcW w:w="475" w:type="dxa"/>
             <w:vAlign w:val="center"/>
             <w:hideMark/>
           </w:tcPr>
@@ -20648,7 +20707,7 @@
         </w:tc>
         <w:tc>
           <w:tcPr>
-            <w:tcW w:w="0" w:type="auto"/>
+            <w:tcW w:w="396" w:type="dxa"/>
             <w:vAlign w:val="center"/>
             <w:hideMark/>
           </w:tcPr>
@@ -20672,7 +20731,7 @@
         </w:tc>
         <w:tc>
           <w:tcPr>
-            <w:tcW w:w="0" w:type="auto"/>
+            <w:tcW w:w="377" w:type="dxa"/>
             <w:vAlign w:val="center"/>
             <w:hideMark/>
           </w:tcPr>
@@ -20696,7 +20755,7 @@
         </w:tc>
         <w:tc>
           <w:tcPr>
-            <w:tcW w:w="0" w:type="auto"/>
+            <w:tcW w:w="1610" w:type="dxa"/>
             <w:vAlign w:val="center"/>
             <w:hideMark/>
           </w:tcPr>
@@ -20720,23 +20779,23 @@
         </w:tc>
         <w:tc>
           <w:tcPr>
-            <w:tcW w:w="0" w:type="auto"/>
-            <w:vAlign w:val="center"/>
-            <w:hideMark/>
-          </w:tcPr>
-          <w:p>
-            <w:pPr>
-              <w:rPr>
-                <w:rFonts w:ascii="Times New Roman" w:hAnsi="Times New Roman" w:cs="Times New Roman"/>
-                <w:sz w:val="18"/>
-                <w:szCs w:val="18"/>
-              </w:rPr>
-            </w:pPr>
-          </w:p>
-        </w:tc>
-        <w:tc>
-          <w:tcPr>
-            <w:tcW w:w="0" w:type="auto"/>
+            <w:tcW w:w="465" w:type="dxa"/>
+            <w:vAlign w:val="center"/>
+            <w:hideMark/>
+          </w:tcPr>
+          <w:p>
+            <w:pPr>
+              <w:rPr>
+                <w:rFonts w:ascii="Times New Roman" w:hAnsi="Times New Roman" w:cs="Times New Roman"/>
+                <w:sz w:val="18"/>
+                <w:szCs w:val="18"/>
+              </w:rPr>
+            </w:pPr>
+          </w:p>
+        </w:tc>
+        <w:tc>
+          <w:tcPr>
+            <w:tcW w:w="504" w:type="dxa"/>
             <w:vAlign w:val="center"/>
             <w:hideMark/>
           </w:tcPr>
@@ -20765,7 +20824,7 @@
         </w:trPr>
         <w:tc>
           <w:tcPr>
-            <w:tcW w:w="0" w:type="auto"/>
+            <w:tcW w:w="517" w:type="dxa"/>
             <w:vAlign w:val="center"/>
             <w:hideMark/>
           </w:tcPr>
@@ -20789,7 +20848,7 @@
         </w:tc>
         <w:tc>
           <w:tcPr>
-            <w:tcW w:w="0" w:type="auto"/>
+            <w:tcW w:w="1188" w:type="dxa"/>
             <w:vAlign w:val="center"/>
             <w:hideMark/>
           </w:tcPr>
@@ -20813,7 +20872,7 @@
         </w:tc>
         <w:tc>
           <w:tcPr>
-            <w:tcW w:w="0" w:type="auto"/>
+            <w:tcW w:w="652" w:type="dxa"/>
             <w:vAlign w:val="center"/>
             <w:hideMark/>
           </w:tcPr>
@@ -20837,7 +20896,7 @@
         </w:tc>
         <w:tc>
           <w:tcPr>
-            <w:tcW w:w="0" w:type="auto"/>
+            <w:tcW w:w="492" w:type="dxa"/>
             <w:vAlign w:val="center"/>
             <w:hideMark/>
           </w:tcPr>
@@ -20861,7 +20920,7 @@
         </w:tc>
         <w:tc>
           <w:tcPr>
-            <w:tcW w:w="0" w:type="auto"/>
+            <w:tcW w:w="436" w:type="dxa"/>
             <w:vAlign w:val="center"/>
             <w:hideMark/>
           </w:tcPr>
@@ -20885,7 +20944,7 @@
         </w:tc>
         <w:tc>
           <w:tcPr>
-            <w:tcW w:w="0" w:type="auto"/>
+            <w:tcW w:w="573" w:type="dxa"/>
             <w:vAlign w:val="center"/>
             <w:hideMark/>
           </w:tcPr>
@@ -20909,23 +20968,23 @@
         </w:tc>
         <w:tc>
           <w:tcPr>
-            <w:tcW w:w="0" w:type="auto"/>
-            <w:vAlign w:val="center"/>
-            <w:hideMark/>
-          </w:tcPr>
-          <w:p>
-            <w:pPr>
-              <w:rPr>
-                <w:rFonts w:ascii="Times New Roman" w:hAnsi="Times New Roman" w:cs="Times New Roman"/>
-                <w:sz w:val="18"/>
-                <w:szCs w:val="18"/>
-              </w:rPr>
-            </w:pPr>
-          </w:p>
-        </w:tc>
-        <w:tc>
-          <w:tcPr>
-            <w:tcW w:w="0" w:type="auto"/>
+            <w:tcW w:w="770" w:type="dxa"/>
+            <w:vAlign w:val="center"/>
+            <w:hideMark/>
+          </w:tcPr>
+          <w:p>
+            <w:pPr>
+              <w:rPr>
+                <w:rFonts w:ascii="Times New Roman" w:hAnsi="Times New Roman" w:cs="Times New Roman"/>
+                <w:sz w:val="18"/>
+                <w:szCs w:val="18"/>
+              </w:rPr>
+            </w:pPr>
+          </w:p>
+        </w:tc>
+        <w:tc>
+          <w:tcPr>
+            <w:tcW w:w="367" w:type="dxa"/>
             <w:vAlign w:val="center"/>
             <w:hideMark/>
           </w:tcPr>
@@ -20949,7 +21008,7 @@
         </w:tc>
         <w:tc>
           <w:tcPr>
-            <w:tcW w:w="0" w:type="auto"/>
+            <w:tcW w:w="395" w:type="dxa"/>
             <w:vAlign w:val="center"/>
             <w:hideMark/>
           </w:tcPr>
@@ -20973,39 +21032,39 @@
         </w:tc>
         <w:tc>
           <w:tcPr>
-            <w:tcW w:w="0" w:type="auto"/>
-            <w:vAlign w:val="center"/>
-            <w:hideMark/>
-          </w:tcPr>
-          <w:p>
-            <w:pPr>
-              <w:rPr>
-                <w:rFonts w:ascii="Times New Roman" w:hAnsi="Times New Roman" w:cs="Times New Roman"/>
-                <w:sz w:val="18"/>
-                <w:szCs w:val="18"/>
-              </w:rPr>
-            </w:pPr>
-          </w:p>
-        </w:tc>
-        <w:tc>
-          <w:tcPr>
-            <w:tcW w:w="0" w:type="auto"/>
-            <w:vAlign w:val="center"/>
-            <w:hideMark/>
-          </w:tcPr>
-          <w:p>
-            <w:pPr>
-              <w:rPr>
-                <w:rFonts w:ascii="Times New Roman" w:hAnsi="Times New Roman" w:cs="Times New Roman"/>
-                <w:sz w:val="18"/>
-                <w:szCs w:val="18"/>
-              </w:rPr>
-            </w:pPr>
-          </w:p>
-        </w:tc>
-        <w:tc>
-          <w:tcPr>
-            <w:tcW w:w="0" w:type="auto"/>
+            <w:tcW w:w="475" w:type="dxa"/>
+            <w:vAlign w:val="center"/>
+            <w:hideMark/>
+          </w:tcPr>
+          <w:p>
+            <w:pPr>
+              <w:rPr>
+                <w:rFonts w:ascii="Times New Roman" w:hAnsi="Times New Roman" w:cs="Times New Roman"/>
+                <w:sz w:val="18"/>
+                <w:szCs w:val="18"/>
+              </w:rPr>
+            </w:pPr>
+          </w:p>
+        </w:tc>
+        <w:tc>
+          <w:tcPr>
+            <w:tcW w:w="396" w:type="dxa"/>
+            <w:vAlign w:val="center"/>
+            <w:hideMark/>
+          </w:tcPr>
+          <w:p>
+            <w:pPr>
+              <w:rPr>
+                <w:rFonts w:ascii="Times New Roman" w:hAnsi="Times New Roman" w:cs="Times New Roman"/>
+                <w:sz w:val="18"/>
+                <w:szCs w:val="18"/>
+              </w:rPr>
+            </w:pPr>
+          </w:p>
+        </w:tc>
+        <w:tc>
+          <w:tcPr>
+            <w:tcW w:w="377" w:type="dxa"/>
             <w:vAlign w:val="center"/>
             <w:hideMark/>
           </w:tcPr>
@@ -21029,7 +21088,7 @@
         </w:tc>
         <w:tc>
           <w:tcPr>
-            <w:tcW w:w="0" w:type="auto"/>
+            <w:tcW w:w="1610" w:type="dxa"/>
             <w:vAlign w:val="center"/>
             <w:hideMark/>
           </w:tcPr>
@@ -21053,7 +21112,7 @@
         </w:tc>
         <w:tc>
           <w:tcPr>
-            <w:tcW w:w="0" w:type="auto"/>
+            <w:tcW w:w="465" w:type="dxa"/>
             <w:vAlign w:val="center"/>
             <w:hideMark/>
           </w:tcPr>
@@ -21077,7 +21136,7 @@
         </w:tc>
         <w:tc>
           <w:tcPr>
-            <w:tcW w:w="0" w:type="auto"/>
+            <w:tcW w:w="504" w:type="dxa"/>
             <w:vAlign w:val="center"/>
             <w:hideMark/>
           </w:tcPr>
@@ -21106,7 +21165,7 @@
         </w:trPr>
         <w:tc>
           <w:tcPr>
-            <w:tcW w:w="0" w:type="auto"/>
+            <w:tcW w:w="517" w:type="dxa"/>
             <w:vAlign w:val="center"/>
             <w:hideMark/>
           </w:tcPr>
@@ -21130,7 +21189,7 @@
         </w:tc>
         <w:tc>
           <w:tcPr>
-            <w:tcW w:w="0" w:type="auto"/>
+            <w:tcW w:w="1188" w:type="dxa"/>
             <w:vAlign w:val="center"/>
             <w:hideMark/>
           </w:tcPr>
@@ -21154,7 +21213,7 @@
         </w:tc>
         <w:tc>
           <w:tcPr>
-            <w:tcW w:w="0" w:type="auto"/>
+            <w:tcW w:w="652" w:type="dxa"/>
             <w:vAlign w:val="center"/>
             <w:hideMark/>
           </w:tcPr>
@@ -21178,7 +21237,7 @@
         </w:tc>
         <w:tc>
           <w:tcPr>
-            <w:tcW w:w="0" w:type="auto"/>
+            <w:tcW w:w="492" w:type="dxa"/>
             <w:vAlign w:val="center"/>
             <w:hideMark/>
           </w:tcPr>
@@ -21202,7 +21261,7 @@
         </w:tc>
         <w:tc>
           <w:tcPr>
-            <w:tcW w:w="0" w:type="auto"/>
+            <w:tcW w:w="436" w:type="dxa"/>
             <w:vAlign w:val="center"/>
             <w:hideMark/>
           </w:tcPr>
@@ -21226,7 +21285,7 @@
         </w:tc>
         <w:tc>
           <w:tcPr>
-            <w:tcW w:w="0" w:type="auto"/>
+            <w:tcW w:w="573" w:type="dxa"/>
             <w:vAlign w:val="center"/>
             <w:hideMark/>
           </w:tcPr>
@@ -21250,23 +21309,23 @@
         </w:tc>
         <w:tc>
           <w:tcPr>
-            <w:tcW w:w="0" w:type="auto"/>
-            <w:vAlign w:val="center"/>
-            <w:hideMark/>
-          </w:tcPr>
-          <w:p>
-            <w:pPr>
-              <w:rPr>
-                <w:rFonts w:ascii="Times New Roman" w:hAnsi="Times New Roman" w:cs="Times New Roman"/>
-                <w:sz w:val="18"/>
-                <w:szCs w:val="18"/>
-              </w:rPr>
-            </w:pPr>
-          </w:p>
-        </w:tc>
-        <w:tc>
-          <w:tcPr>
-            <w:tcW w:w="0" w:type="auto"/>
+            <w:tcW w:w="770" w:type="dxa"/>
+            <w:vAlign w:val="center"/>
+            <w:hideMark/>
+          </w:tcPr>
+          <w:p>
+            <w:pPr>
+              <w:rPr>
+                <w:rFonts w:ascii="Times New Roman" w:hAnsi="Times New Roman" w:cs="Times New Roman"/>
+                <w:sz w:val="18"/>
+                <w:szCs w:val="18"/>
+              </w:rPr>
+            </w:pPr>
+          </w:p>
+        </w:tc>
+        <w:tc>
+          <w:tcPr>
+            <w:tcW w:w="367" w:type="dxa"/>
             <w:vAlign w:val="center"/>
             <w:hideMark/>
           </w:tcPr>
@@ -21290,7 +21349,7 @@
         </w:tc>
         <w:tc>
           <w:tcPr>
-            <w:tcW w:w="0" w:type="auto"/>
+            <w:tcW w:w="395" w:type="dxa"/>
             <w:vAlign w:val="center"/>
             <w:hideMark/>
           </w:tcPr>
@@ -21314,39 +21373,39 @@
         </w:tc>
         <w:tc>
           <w:tcPr>
-            <w:tcW w:w="0" w:type="auto"/>
-            <w:vAlign w:val="center"/>
-            <w:hideMark/>
-          </w:tcPr>
-          <w:p>
-            <w:pPr>
-              <w:rPr>
-                <w:rFonts w:ascii="Times New Roman" w:hAnsi="Times New Roman" w:cs="Times New Roman"/>
-                <w:sz w:val="18"/>
-                <w:szCs w:val="18"/>
-              </w:rPr>
-            </w:pPr>
-          </w:p>
-        </w:tc>
-        <w:tc>
-          <w:tcPr>
-            <w:tcW w:w="0" w:type="auto"/>
-            <w:vAlign w:val="center"/>
-            <w:hideMark/>
-          </w:tcPr>
-          <w:p>
-            <w:pPr>
-              <w:rPr>
-                <w:rFonts w:ascii="Times New Roman" w:hAnsi="Times New Roman" w:cs="Times New Roman"/>
-                <w:sz w:val="18"/>
-                <w:szCs w:val="18"/>
-              </w:rPr>
-            </w:pPr>
-          </w:p>
-        </w:tc>
-        <w:tc>
-          <w:tcPr>
-            <w:tcW w:w="0" w:type="auto"/>
+            <w:tcW w:w="475" w:type="dxa"/>
+            <w:vAlign w:val="center"/>
+            <w:hideMark/>
+          </w:tcPr>
+          <w:p>
+            <w:pPr>
+              <w:rPr>
+                <w:rFonts w:ascii="Times New Roman" w:hAnsi="Times New Roman" w:cs="Times New Roman"/>
+                <w:sz w:val="18"/>
+                <w:szCs w:val="18"/>
+              </w:rPr>
+            </w:pPr>
+          </w:p>
+        </w:tc>
+        <w:tc>
+          <w:tcPr>
+            <w:tcW w:w="396" w:type="dxa"/>
+            <w:vAlign w:val="center"/>
+            <w:hideMark/>
+          </w:tcPr>
+          <w:p>
+            <w:pPr>
+              <w:rPr>
+                <w:rFonts w:ascii="Times New Roman" w:hAnsi="Times New Roman" w:cs="Times New Roman"/>
+                <w:sz w:val="18"/>
+                <w:szCs w:val="18"/>
+              </w:rPr>
+            </w:pPr>
+          </w:p>
+        </w:tc>
+        <w:tc>
+          <w:tcPr>
+            <w:tcW w:w="377" w:type="dxa"/>
             <w:vAlign w:val="center"/>
             <w:hideMark/>
           </w:tcPr>
@@ -21370,7 +21429,7 @@
         </w:tc>
         <w:tc>
           <w:tcPr>
-            <w:tcW w:w="0" w:type="auto"/>
+            <w:tcW w:w="1610" w:type="dxa"/>
             <w:vAlign w:val="center"/>
             <w:hideMark/>
           </w:tcPr>
@@ -21394,7 +21453,7 @@
         </w:tc>
         <w:tc>
           <w:tcPr>
-            <w:tcW w:w="0" w:type="auto"/>
+            <w:tcW w:w="465" w:type="dxa"/>
             <w:vAlign w:val="center"/>
             <w:hideMark/>
           </w:tcPr>
@@ -21418,7 +21477,7 @@
         </w:tc>
         <w:tc>
           <w:tcPr>
-            <w:tcW w:w="0" w:type="auto"/>
+            <w:tcW w:w="504" w:type="dxa"/>
             <w:vAlign w:val="center"/>
             <w:hideMark/>
           </w:tcPr>
@@ -21447,7 +21506,7 @@
         </w:trPr>
         <w:tc>
           <w:tcPr>
-            <w:tcW w:w="0" w:type="auto"/>
+            <w:tcW w:w="517" w:type="dxa"/>
             <w:vAlign w:val="center"/>
             <w:hideMark/>
           </w:tcPr>
@@ -21471,7 +21530,7 @@
         </w:tc>
         <w:tc>
           <w:tcPr>
-            <w:tcW w:w="0" w:type="auto"/>
+            <w:tcW w:w="1188" w:type="dxa"/>
             <w:vAlign w:val="center"/>
             <w:hideMark/>
           </w:tcPr>
@@ -21495,7 +21554,7 @@
         </w:tc>
         <w:tc>
           <w:tcPr>
-            <w:tcW w:w="0" w:type="auto"/>
+            <w:tcW w:w="652" w:type="dxa"/>
             <w:vAlign w:val="center"/>
             <w:hideMark/>
           </w:tcPr>
@@ -21519,7 +21578,7 @@
         </w:tc>
         <w:tc>
           <w:tcPr>
-            <w:tcW w:w="0" w:type="auto"/>
+            <w:tcW w:w="492" w:type="dxa"/>
             <w:vAlign w:val="center"/>
             <w:hideMark/>
           </w:tcPr>
@@ -21543,7 +21602,7 @@
         </w:tc>
         <w:tc>
           <w:tcPr>
-            <w:tcW w:w="0" w:type="auto"/>
+            <w:tcW w:w="436" w:type="dxa"/>
             <w:vAlign w:val="center"/>
             <w:hideMark/>
           </w:tcPr>
@@ -21567,7 +21626,7 @@
         </w:tc>
         <w:tc>
           <w:tcPr>
-            <w:tcW w:w="0" w:type="auto"/>
+            <w:tcW w:w="573" w:type="dxa"/>
             <w:vAlign w:val="center"/>
             <w:hideMark/>
           </w:tcPr>
@@ -21591,23 +21650,23 @@
         </w:tc>
         <w:tc>
           <w:tcPr>
-            <w:tcW w:w="0" w:type="auto"/>
-            <w:vAlign w:val="center"/>
-            <w:hideMark/>
-          </w:tcPr>
-          <w:p>
-            <w:pPr>
-              <w:rPr>
-                <w:rFonts w:ascii="Times New Roman" w:hAnsi="Times New Roman" w:cs="Times New Roman"/>
-                <w:sz w:val="18"/>
-                <w:szCs w:val="18"/>
-              </w:rPr>
-            </w:pPr>
-          </w:p>
-        </w:tc>
-        <w:tc>
-          <w:tcPr>
-            <w:tcW w:w="0" w:type="auto"/>
+            <w:tcW w:w="770" w:type="dxa"/>
+            <w:vAlign w:val="center"/>
+            <w:hideMark/>
+          </w:tcPr>
+          <w:p>
+            <w:pPr>
+              <w:rPr>
+                <w:rFonts w:ascii="Times New Roman" w:hAnsi="Times New Roman" w:cs="Times New Roman"/>
+                <w:sz w:val="18"/>
+                <w:szCs w:val="18"/>
+              </w:rPr>
+            </w:pPr>
+          </w:p>
+        </w:tc>
+        <w:tc>
+          <w:tcPr>
+            <w:tcW w:w="367" w:type="dxa"/>
             <w:vAlign w:val="center"/>
             <w:hideMark/>
           </w:tcPr>
@@ -21631,7 +21690,7 @@
         </w:tc>
         <w:tc>
           <w:tcPr>
-            <w:tcW w:w="0" w:type="auto"/>
+            <w:tcW w:w="395" w:type="dxa"/>
             <w:vAlign w:val="center"/>
             <w:hideMark/>
           </w:tcPr>
@@ -21655,39 +21714,39 @@
         </w:tc>
         <w:tc>
           <w:tcPr>
-            <w:tcW w:w="0" w:type="auto"/>
-            <w:vAlign w:val="center"/>
-            <w:hideMark/>
-          </w:tcPr>
-          <w:p>
-            <w:pPr>
-              <w:rPr>
-                <w:rFonts w:ascii="Times New Roman" w:hAnsi="Times New Roman" w:cs="Times New Roman"/>
-                <w:sz w:val="18"/>
-                <w:szCs w:val="18"/>
-              </w:rPr>
-            </w:pPr>
-          </w:p>
-        </w:tc>
-        <w:tc>
-          <w:tcPr>
-            <w:tcW w:w="0" w:type="auto"/>
-            <w:vAlign w:val="center"/>
-            <w:hideMark/>
-          </w:tcPr>
-          <w:p>
-            <w:pPr>
-              <w:rPr>
-                <w:rFonts w:ascii="Times New Roman" w:hAnsi="Times New Roman" w:cs="Times New Roman"/>
-                <w:sz w:val="18"/>
-                <w:szCs w:val="18"/>
-              </w:rPr>
-            </w:pPr>
-          </w:p>
-        </w:tc>
-        <w:tc>
-          <w:tcPr>
-            <w:tcW w:w="0" w:type="auto"/>
+            <w:tcW w:w="475" w:type="dxa"/>
+            <w:vAlign w:val="center"/>
+            <w:hideMark/>
+          </w:tcPr>
+          <w:p>
+            <w:pPr>
+              <w:rPr>
+                <w:rFonts w:ascii="Times New Roman" w:hAnsi="Times New Roman" w:cs="Times New Roman"/>
+                <w:sz w:val="18"/>
+                <w:szCs w:val="18"/>
+              </w:rPr>
+            </w:pPr>
+          </w:p>
+        </w:tc>
+        <w:tc>
+          <w:tcPr>
+            <w:tcW w:w="396" w:type="dxa"/>
+            <w:vAlign w:val="center"/>
+            <w:hideMark/>
+          </w:tcPr>
+          <w:p>
+            <w:pPr>
+              <w:rPr>
+                <w:rFonts w:ascii="Times New Roman" w:hAnsi="Times New Roman" w:cs="Times New Roman"/>
+                <w:sz w:val="18"/>
+                <w:szCs w:val="18"/>
+              </w:rPr>
+            </w:pPr>
+          </w:p>
+        </w:tc>
+        <w:tc>
+          <w:tcPr>
+            <w:tcW w:w="377" w:type="dxa"/>
             <w:vAlign w:val="center"/>
             <w:hideMark/>
           </w:tcPr>
@@ -21711,7 +21770,7 @@
         </w:tc>
         <w:tc>
           <w:tcPr>
-            <w:tcW w:w="0" w:type="auto"/>
+            <w:tcW w:w="1610" w:type="dxa"/>
             <w:vAlign w:val="center"/>
             <w:hideMark/>
           </w:tcPr>
@@ -21735,7 +21794,7 @@
         </w:tc>
         <w:tc>
           <w:tcPr>
-            <w:tcW w:w="0" w:type="auto"/>
+            <w:tcW w:w="465" w:type="dxa"/>
             <w:vAlign w:val="center"/>
             <w:hideMark/>
           </w:tcPr>
@@ -21759,7 +21818,7 @@
         </w:tc>
         <w:tc>
           <w:tcPr>
-            <w:tcW w:w="0" w:type="auto"/>
+            <w:tcW w:w="504" w:type="dxa"/>
             <w:vAlign w:val="center"/>
             <w:hideMark/>
           </w:tcPr>
@@ -21788,7 +21847,7 @@
         </w:trPr>
         <w:tc>
           <w:tcPr>
-            <w:tcW w:w="0" w:type="auto"/>
+            <w:tcW w:w="517" w:type="dxa"/>
             <w:vAlign w:val="center"/>
             <w:hideMark/>
           </w:tcPr>
@@ -21812,7 +21871,7 @@
         </w:tc>
         <w:tc>
           <w:tcPr>
-            <w:tcW w:w="0" w:type="auto"/>
+            <w:tcW w:w="1188" w:type="dxa"/>
             <w:vAlign w:val="center"/>
             <w:hideMark/>
           </w:tcPr>
@@ -21836,7 +21895,7 @@
         </w:tc>
         <w:tc>
           <w:tcPr>
-            <w:tcW w:w="0" w:type="auto"/>
+            <w:tcW w:w="652" w:type="dxa"/>
             <w:vAlign w:val="center"/>
             <w:hideMark/>
           </w:tcPr>
@@ -21860,7 +21919,7 @@
         </w:tc>
         <w:tc>
           <w:tcPr>
-            <w:tcW w:w="0" w:type="auto"/>
+            <w:tcW w:w="492" w:type="dxa"/>
             <w:vAlign w:val="center"/>
             <w:hideMark/>
           </w:tcPr>
@@ -21884,7 +21943,7 @@
         </w:tc>
         <w:tc>
           <w:tcPr>
-            <w:tcW w:w="0" w:type="auto"/>
+            <w:tcW w:w="436" w:type="dxa"/>
             <w:vAlign w:val="center"/>
             <w:hideMark/>
           </w:tcPr>
@@ -21908,55 +21967,65 @@
         </w:tc>
         <w:tc>
           <w:tcPr>
-            <w:tcW w:w="0" w:type="auto"/>
-            <w:vAlign w:val="center"/>
-            <w:hideMark/>
-          </w:tcPr>
-          <w:p>
-            <w:pPr>
-              <w:rPr>
-                <w:rFonts w:ascii="Times New Roman" w:hAnsi="Times New Roman" w:cs="Times New Roman"/>
-                <w:sz w:val="18"/>
-                <w:szCs w:val="18"/>
-              </w:rPr>
-            </w:pPr>
-            <w:r>
-              <w:rPr>
-                <w:rFonts w:ascii="Times New Roman" w:hAnsi="Times New Roman" w:cs="Times New Roman"/>
-                <w:sz w:val="18"/>
-                <w:szCs w:val="18"/>
-              </w:rPr>
-              <w:t>Số nguyên dương</w:t>
-            </w:r>
-          </w:p>
-        </w:tc>
-        <w:tc>
-          <w:tcPr>
-            <w:tcW w:w="0" w:type="auto"/>
-            <w:vAlign w:val="center"/>
-            <w:hideMark/>
-          </w:tcPr>
-          <w:p>
-            <w:pPr>
-              <w:rPr>
-                <w:rFonts w:ascii="Times New Roman" w:hAnsi="Times New Roman" w:cs="Times New Roman"/>
-                <w:sz w:val="18"/>
-                <w:szCs w:val="18"/>
-              </w:rPr>
-            </w:pPr>
-            <w:r>
-              <w:rPr>
-                <w:rFonts w:ascii="Times New Roman" w:hAnsi="Times New Roman" w:cs="Times New Roman"/>
-                <w:sz w:val="18"/>
-                <w:szCs w:val="18"/>
-              </w:rPr>
+            <w:tcW w:w="573" w:type="dxa"/>
+            <w:vAlign w:val="center"/>
+            <w:hideMark/>
+          </w:tcPr>
+          <w:p>
+            <w:pPr>
+              <w:rPr>
+                <w:rFonts w:ascii="Times New Roman" w:hAnsi="Times New Roman" w:cs="Times New Roman"/>
+                <w:sz w:val="18"/>
+                <w:szCs w:val="18"/>
+              </w:rPr>
+            </w:pPr>
+            <w:r>
+              <w:rPr>
+                <w:rFonts w:ascii="Times New Roman" w:hAnsi="Times New Roman" w:cs="Times New Roman"/>
+                <w:sz w:val="18"/>
+                <w:szCs w:val="18"/>
+              </w:rPr>
+              <w:t>Số nguyê</w:t>
+            </w:r>
+            <w:r>
+              <w:rPr>
+                <w:rFonts w:ascii="Times New Roman" w:hAnsi="Times New Roman" w:cs="Times New Roman"/>
+                <w:sz w:val="18"/>
+                <w:szCs w:val="18"/>
+              </w:rPr>
+              <w:lastRenderedPageBreak/>
+              <w:t>n dương</w:t>
+            </w:r>
+          </w:p>
+        </w:tc>
+        <w:tc>
+          <w:tcPr>
+            <w:tcW w:w="770" w:type="dxa"/>
+            <w:vAlign w:val="center"/>
+            <w:hideMark/>
+          </w:tcPr>
+          <w:p>
+            <w:pPr>
+              <w:rPr>
+                <w:rFonts w:ascii="Times New Roman" w:hAnsi="Times New Roman" w:cs="Times New Roman"/>
+                <w:sz w:val="18"/>
+                <w:szCs w:val="18"/>
+              </w:rPr>
+            </w:pPr>
+            <w:r>
+              <w:rPr>
+                <w:rFonts w:ascii="Times New Roman" w:hAnsi="Times New Roman" w:cs="Times New Roman"/>
+                <w:sz w:val="18"/>
+                <w:szCs w:val="18"/>
+              </w:rPr>
+              <w:lastRenderedPageBreak/>
               <w:t>1</w:t>
             </w:r>
           </w:p>
         </w:tc>
         <w:tc>
           <w:tcPr>
-            <w:tcW w:w="0" w:type="auto"/>
+            <w:tcW w:w="367" w:type="dxa"/>
             <w:vAlign w:val="center"/>
             <w:hideMark/>
           </w:tcPr>
@@ -21980,7 +22049,7 @@
         </w:tc>
         <w:tc>
           <w:tcPr>
-            <w:tcW w:w="0" w:type="auto"/>
+            <w:tcW w:w="395" w:type="dxa"/>
             <w:vAlign w:val="center"/>
             <w:hideMark/>
           </w:tcPr>
@@ -22004,39 +22073,39 @@
         </w:tc>
         <w:tc>
           <w:tcPr>
-            <w:tcW w:w="0" w:type="auto"/>
-            <w:vAlign w:val="center"/>
-            <w:hideMark/>
-          </w:tcPr>
-          <w:p>
-            <w:pPr>
-              <w:rPr>
-                <w:rFonts w:ascii="Times New Roman" w:hAnsi="Times New Roman" w:cs="Times New Roman"/>
-                <w:sz w:val="18"/>
-                <w:szCs w:val="18"/>
-              </w:rPr>
-            </w:pPr>
-          </w:p>
-        </w:tc>
-        <w:tc>
-          <w:tcPr>
-            <w:tcW w:w="0" w:type="auto"/>
-            <w:vAlign w:val="center"/>
-            <w:hideMark/>
-          </w:tcPr>
-          <w:p>
-            <w:pPr>
-              <w:rPr>
-                <w:rFonts w:ascii="Times New Roman" w:hAnsi="Times New Roman" w:cs="Times New Roman"/>
-                <w:sz w:val="18"/>
-                <w:szCs w:val="18"/>
-              </w:rPr>
-            </w:pPr>
-          </w:p>
-        </w:tc>
-        <w:tc>
-          <w:tcPr>
-            <w:tcW w:w="0" w:type="auto"/>
+            <w:tcW w:w="475" w:type="dxa"/>
+            <w:vAlign w:val="center"/>
+            <w:hideMark/>
+          </w:tcPr>
+          <w:p>
+            <w:pPr>
+              <w:rPr>
+                <w:rFonts w:ascii="Times New Roman" w:hAnsi="Times New Roman" w:cs="Times New Roman"/>
+                <w:sz w:val="18"/>
+                <w:szCs w:val="18"/>
+              </w:rPr>
+            </w:pPr>
+          </w:p>
+        </w:tc>
+        <w:tc>
+          <w:tcPr>
+            <w:tcW w:w="396" w:type="dxa"/>
+            <w:vAlign w:val="center"/>
+            <w:hideMark/>
+          </w:tcPr>
+          <w:p>
+            <w:pPr>
+              <w:rPr>
+                <w:rFonts w:ascii="Times New Roman" w:hAnsi="Times New Roman" w:cs="Times New Roman"/>
+                <w:sz w:val="18"/>
+                <w:szCs w:val="18"/>
+              </w:rPr>
+            </w:pPr>
+          </w:p>
+        </w:tc>
+        <w:tc>
+          <w:tcPr>
+            <w:tcW w:w="377" w:type="dxa"/>
             <w:vAlign w:val="center"/>
             <w:hideMark/>
           </w:tcPr>
@@ -22060,7 +22129,7 @@
         </w:tc>
         <w:tc>
           <w:tcPr>
-            <w:tcW w:w="0" w:type="auto"/>
+            <w:tcW w:w="1610" w:type="dxa"/>
             <w:vAlign w:val="center"/>
             <w:hideMark/>
           </w:tcPr>
@@ -22084,41 +22153,50 @@
         </w:tc>
         <w:tc>
           <w:tcPr>
-            <w:tcW w:w="0" w:type="auto"/>
-            <w:vAlign w:val="center"/>
-            <w:hideMark/>
-          </w:tcPr>
-          <w:p>
-            <w:pPr>
-              <w:rPr>
-                <w:rFonts w:ascii="Times New Roman" w:hAnsi="Times New Roman" w:cs="Times New Roman"/>
-                <w:sz w:val="18"/>
-                <w:szCs w:val="18"/>
-              </w:rPr>
-            </w:pPr>
-          </w:p>
-        </w:tc>
-        <w:tc>
-          <w:tcPr>
-            <w:tcW w:w="0" w:type="auto"/>
-            <w:vAlign w:val="center"/>
-            <w:hideMark/>
-          </w:tcPr>
-          <w:p>
-            <w:pPr>
-              <w:rPr>
-                <w:rFonts w:ascii="Times New Roman" w:hAnsi="Times New Roman" w:cs="Times New Roman"/>
-                <w:sz w:val="18"/>
-                <w:szCs w:val="18"/>
-              </w:rPr>
-            </w:pPr>
-            <w:r>
-              <w:rPr>
-                <w:rFonts w:ascii="Times New Roman" w:hAnsi="Times New Roman" w:cs="Times New Roman"/>
-                <w:sz w:val="18"/>
-                <w:szCs w:val="18"/>
-              </w:rPr>
-              <w:t>Số lượng vật tư sử dụng</w:t>
+            <w:tcW w:w="465" w:type="dxa"/>
+            <w:vAlign w:val="center"/>
+            <w:hideMark/>
+          </w:tcPr>
+          <w:p>
+            <w:pPr>
+              <w:rPr>
+                <w:rFonts w:ascii="Times New Roman" w:hAnsi="Times New Roman" w:cs="Times New Roman"/>
+                <w:sz w:val="18"/>
+                <w:szCs w:val="18"/>
+              </w:rPr>
+            </w:pPr>
+          </w:p>
+        </w:tc>
+        <w:tc>
+          <w:tcPr>
+            <w:tcW w:w="504" w:type="dxa"/>
+            <w:vAlign w:val="center"/>
+            <w:hideMark/>
+          </w:tcPr>
+          <w:p>
+            <w:pPr>
+              <w:rPr>
+                <w:rFonts w:ascii="Times New Roman" w:hAnsi="Times New Roman" w:cs="Times New Roman"/>
+                <w:sz w:val="18"/>
+                <w:szCs w:val="18"/>
+              </w:rPr>
+            </w:pPr>
+            <w:r>
+              <w:rPr>
+                <w:rFonts w:ascii="Times New Roman" w:hAnsi="Times New Roman" w:cs="Times New Roman"/>
+                <w:sz w:val="18"/>
+                <w:szCs w:val="18"/>
+              </w:rPr>
+              <w:t xml:space="preserve">Số lượng vật tư </w:t>
+            </w:r>
+            <w:r>
+              <w:rPr>
+                <w:rFonts w:ascii="Times New Roman" w:hAnsi="Times New Roman" w:cs="Times New Roman"/>
+                <w:sz w:val="18"/>
+                <w:szCs w:val="18"/>
+              </w:rPr>
+              <w:lastRenderedPageBreak/>
+              <w:t>sử dụng</w:t>
             </w:r>
           </w:p>
         </w:tc>
@@ -22129,31 +22207,32 @@
         </w:trPr>
         <w:tc>
           <w:tcPr>
-            <w:tcW w:w="0" w:type="auto"/>
-            <w:vAlign w:val="center"/>
-            <w:hideMark/>
-          </w:tcPr>
-          <w:p>
-            <w:pPr>
-              <w:rPr>
-                <w:rFonts w:ascii="Times New Roman" w:hAnsi="Times New Roman" w:cs="Times New Roman"/>
-                <w:sz w:val="18"/>
-                <w:szCs w:val="18"/>
-              </w:rPr>
-            </w:pPr>
-            <w:r>
-              <w:rPr>
-                <w:rFonts w:ascii="Times New Roman" w:hAnsi="Times New Roman" w:cs="Times New Roman"/>
-                <w:sz w:val="18"/>
-                <w:szCs w:val="18"/>
-              </w:rPr>
+            <w:tcW w:w="517" w:type="dxa"/>
+            <w:vAlign w:val="center"/>
+            <w:hideMark/>
+          </w:tcPr>
+          <w:p>
+            <w:pPr>
+              <w:rPr>
+                <w:rFonts w:ascii="Times New Roman" w:hAnsi="Times New Roman" w:cs="Times New Roman"/>
+                <w:sz w:val="18"/>
+                <w:szCs w:val="18"/>
+              </w:rPr>
+            </w:pPr>
+            <w:r>
+              <w:rPr>
+                <w:rFonts w:ascii="Times New Roman" w:hAnsi="Times New Roman" w:cs="Times New Roman"/>
+                <w:sz w:val="18"/>
+                <w:szCs w:val="18"/>
+              </w:rPr>
+              <w:lastRenderedPageBreak/>
               <w:t>6</w:t>
             </w:r>
           </w:p>
         </w:tc>
         <w:tc>
           <w:tcPr>
-            <w:tcW w:w="0" w:type="auto"/>
+            <w:tcW w:w="1188" w:type="dxa"/>
             <w:vAlign w:val="center"/>
             <w:hideMark/>
           </w:tcPr>
@@ -22177,7 +22256,7 @@
         </w:tc>
         <w:tc>
           <w:tcPr>
-            <w:tcW w:w="0" w:type="auto"/>
+            <w:tcW w:w="652" w:type="dxa"/>
             <w:vAlign w:val="center"/>
             <w:hideMark/>
           </w:tcPr>
@@ -22201,7 +22280,7 @@
         </w:tc>
         <w:tc>
           <w:tcPr>
-            <w:tcW w:w="0" w:type="auto"/>
+            <w:tcW w:w="492" w:type="dxa"/>
             <w:vAlign w:val="center"/>
             <w:hideMark/>
           </w:tcPr>
@@ -22225,7 +22304,7 @@
         </w:tc>
         <w:tc>
           <w:tcPr>
-            <w:tcW w:w="0" w:type="auto"/>
+            <w:tcW w:w="436" w:type="dxa"/>
             <w:vAlign w:val="center"/>
             <w:hideMark/>
           </w:tcPr>
@@ -22249,7 +22328,7 @@
         </w:tc>
         <w:tc>
           <w:tcPr>
-            <w:tcW w:w="0" w:type="auto"/>
+            <w:tcW w:w="573" w:type="dxa"/>
             <w:vAlign w:val="center"/>
             <w:hideMark/>
           </w:tcPr>
@@ -22273,7 +22352,7 @@
         </w:tc>
         <w:tc>
           <w:tcPr>
-            <w:tcW w:w="0" w:type="auto"/>
+            <w:tcW w:w="770" w:type="dxa"/>
             <w:vAlign w:val="center"/>
             <w:hideMark/>
           </w:tcPr>
@@ -22297,7 +22376,7 @@
         </w:tc>
         <w:tc>
           <w:tcPr>
-            <w:tcW w:w="0" w:type="auto"/>
+            <w:tcW w:w="367" w:type="dxa"/>
             <w:vAlign w:val="center"/>
             <w:hideMark/>
           </w:tcPr>
@@ -22321,7 +22400,7 @@
         </w:tc>
         <w:tc>
           <w:tcPr>
-            <w:tcW w:w="0" w:type="auto"/>
+            <w:tcW w:w="395" w:type="dxa"/>
             <w:vAlign w:val="center"/>
             <w:hideMark/>
           </w:tcPr>
@@ -22345,39 +22424,39 @@
         </w:tc>
         <w:tc>
           <w:tcPr>
-            <w:tcW w:w="0" w:type="auto"/>
-            <w:vAlign w:val="center"/>
-            <w:hideMark/>
-          </w:tcPr>
-          <w:p>
-            <w:pPr>
-              <w:rPr>
-                <w:rFonts w:ascii="Times New Roman" w:hAnsi="Times New Roman" w:cs="Times New Roman"/>
-                <w:sz w:val="18"/>
-                <w:szCs w:val="18"/>
-              </w:rPr>
-            </w:pPr>
-          </w:p>
-        </w:tc>
-        <w:tc>
-          <w:tcPr>
-            <w:tcW w:w="0" w:type="auto"/>
-            <w:vAlign w:val="center"/>
-            <w:hideMark/>
-          </w:tcPr>
-          <w:p>
-            <w:pPr>
-              <w:rPr>
-                <w:rFonts w:ascii="Times New Roman" w:hAnsi="Times New Roman" w:cs="Times New Roman"/>
-                <w:sz w:val="18"/>
-                <w:szCs w:val="18"/>
-              </w:rPr>
-            </w:pPr>
-          </w:p>
-        </w:tc>
-        <w:tc>
-          <w:tcPr>
-            <w:tcW w:w="0" w:type="auto"/>
+            <w:tcW w:w="475" w:type="dxa"/>
+            <w:vAlign w:val="center"/>
+            <w:hideMark/>
+          </w:tcPr>
+          <w:p>
+            <w:pPr>
+              <w:rPr>
+                <w:rFonts w:ascii="Times New Roman" w:hAnsi="Times New Roman" w:cs="Times New Roman"/>
+                <w:sz w:val="18"/>
+                <w:szCs w:val="18"/>
+              </w:rPr>
+            </w:pPr>
+          </w:p>
+        </w:tc>
+        <w:tc>
+          <w:tcPr>
+            <w:tcW w:w="396" w:type="dxa"/>
+            <w:vAlign w:val="center"/>
+            <w:hideMark/>
+          </w:tcPr>
+          <w:p>
+            <w:pPr>
+              <w:rPr>
+                <w:rFonts w:ascii="Times New Roman" w:hAnsi="Times New Roman" w:cs="Times New Roman"/>
+                <w:sz w:val="18"/>
+                <w:szCs w:val="18"/>
+              </w:rPr>
+            </w:pPr>
+          </w:p>
+        </w:tc>
+        <w:tc>
+          <w:tcPr>
+            <w:tcW w:w="377" w:type="dxa"/>
             <w:vAlign w:val="center"/>
             <w:hideMark/>
           </w:tcPr>
@@ -22401,7 +22480,7 @@
         </w:tc>
         <w:tc>
           <w:tcPr>
-            <w:tcW w:w="0" w:type="auto"/>
+            <w:tcW w:w="1610" w:type="dxa"/>
             <w:vAlign w:val="center"/>
             <w:hideMark/>
           </w:tcPr>
@@ -22425,23 +22504,23 @@
         </w:tc>
         <w:tc>
           <w:tcPr>
-            <w:tcW w:w="0" w:type="auto"/>
-            <w:vAlign w:val="center"/>
-            <w:hideMark/>
-          </w:tcPr>
-          <w:p>
-            <w:pPr>
-              <w:rPr>
-                <w:rFonts w:ascii="Times New Roman" w:hAnsi="Times New Roman" w:cs="Times New Roman"/>
-                <w:sz w:val="18"/>
-                <w:szCs w:val="18"/>
-              </w:rPr>
-            </w:pPr>
-          </w:p>
-        </w:tc>
-        <w:tc>
-          <w:tcPr>
-            <w:tcW w:w="0" w:type="auto"/>
+            <w:tcW w:w="465" w:type="dxa"/>
+            <w:vAlign w:val="center"/>
+            <w:hideMark/>
+          </w:tcPr>
+          <w:p>
+            <w:pPr>
+              <w:rPr>
+                <w:rFonts w:ascii="Times New Roman" w:hAnsi="Times New Roman" w:cs="Times New Roman"/>
+                <w:sz w:val="18"/>
+                <w:szCs w:val="18"/>
+              </w:rPr>
+            </w:pPr>
+          </w:p>
+        </w:tc>
+        <w:tc>
+          <w:tcPr>
+            <w:tcW w:w="504" w:type="dxa"/>
             <w:vAlign w:val="center"/>
             <w:hideMark/>
           </w:tcPr>
@@ -22470,32 +22549,31 @@
         </w:trPr>
         <w:tc>
           <w:tcPr>
-            <w:tcW w:w="0" w:type="auto"/>
-            <w:vAlign w:val="center"/>
-            <w:hideMark/>
-          </w:tcPr>
-          <w:p>
-            <w:pPr>
-              <w:rPr>
-                <w:rFonts w:ascii="Times New Roman" w:hAnsi="Times New Roman" w:cs="Times New Roman"/>
-                <w:sz w:val="18"/>
-                <w:szCs w:val="18"/>
-              </w:rPr>
-            </w:pPr>
-            <w:r>
-              <w:rPr>
-                <w:rFonts w:ascii="Times New Roman" w:hAnsi="Times New Roman" w:cs="Times New Roman"/>
-                <w:sz w:val="18"/>
-                <w:szCs w:val="18"/>
-              </w:rPr>
-              <w:lastRenderedPageBreak/>
+            <w:tcW w:w="517" w:type="dxa"/>
+            <w:vAlign w:val="center"/>
+            <w:hideMark/>
+          </w:tcPr>
+          <w:p>
+            <w:pPr>
+              <w:rPr>
+                <w:rFonts w:ascii="Times New Roman" w:hAnsi="Times New Roman" w:cs="Times New Roman"/>
+                <w:sz w:val="18"/>
+                <w:szCs w:val="18"/>
+              </w:rPr>
+            </w:pPr>
+            <w:r>
+              <w:rPr>
+                <w:rFonts w:ascii="Times New Roman" w:hAnsi="Times New Roman" w:cs="Times New Roman"/>
+                <w:sz w:val="18"/>
+                <w:szCs w:val="18"/>
+              </w:rPr>
               <w:t>7</w:t>
             </w:r>
           </w:p>
         </w:tc>
         <w:tc>
           <w:tcPr>
-            <w:tcW w:w="0" w:type="auto"/>
+            <w:tcW w:w="1188" w:type="dxa"/>
             <w:vAlign w:val="center"/>
             <w:hideMark/>
           </w:tcPr>
@@ -22519,7 +22597,7 @@
         </w:tc>
         <w:tc>
           <w:tcPr>
-            <w:tcW w:w="0" w:type="auto"/>
+            <w:tcW w:w="652" w:type="dxa"/>
             <w:vAlign w:val="center"/>
             <w:hideMark/>
           </w:tcPr>
@@ -22543,7 +22621,7 @@
         </w:tc>
         <w:tc>
           <w:tcPr>
-            <w:tcW w:w="0" w:type="auto"/>
+            <w:tcW w:w="492" w:type="dxa"/>
             <w:vAlign w:val="center"/>
             <w:hideMark/>
           </w:tcPr>
@@ -22567,7 +22645,7 @@
         </w:tc>
         <w:tc>
           <w:tcPr>
-            <w:tcW w:w="0" w:type="auto"/>
+            <w:tcW w:w="436" w:type="dxa"/>
             <w:vAlign w:val="center"/>
             <w:hideMark/>
           </w:tcPr>
@@ -22591,7 +22669,7 @@
         </w:tc>
         <w:tc>
           <w:tcPr>
-            <w:tcW w:w="0" w:type="auto"/>
+            <w:tcW w:w="573" w:type="dxa"/>
             <w:vAlign w:val="center"/>
             <w:hideMark/>
           </w:tcPr>
@@ -22615,7 +22693,7 @@
         </w:tc>
         <w:tc>
           <w:tcPr>
-            <w:tcW w:w="0" w:type="auto"/>
+            <w:tcW w:w="770" w:type="dxa"/>
             <w:vAlign w:val="center"/>
             <w:hideMark/>
           </w:tcPr>
@@ -22639,7 +22717,7 @@
         </w:tc>
         <w:tc>
           <w:tcPr>
-            <w:tcW w:w="0" w:type="auto"/>
+            <w:tcW w:w="367" w:type="dxa"/>
             <w:vAlign w:val="center"/>
             <w:hideMark/>
           </w:tcPr>
@@ -22663,7 +22741,7 @@
         </w:tc>
         <w:tc>
           <w:tcPr>
-            <w:tcW w:w="0" w:type="auto"/>
+            <w:tcW w:w="395" w:type="dxa"/>
             <w:vAlign w:val="center"/>
             <w:hideMark/>
           </w:tcPr>
@@ -22687,39 +22765,39 @@
         </w:tc>
         <w:tc>
           <w:tcPr>
-            <w:tcW w:w="0" w:type="auto"/>
-            <w:vAlign w:val="center"/>
-            <w:hideMark/>
-          </w:tcPr>
-          <w:p>
-            <w:pPr>
-              <w:rPr>
-                <w:rFonts w:ascii="Times New Roman" w:hAnsi="Times New Roman" w:cs="Times New Roman"/>
-                <w:sz w:val="18"/>
-                <w:szCs w:val="18"/>
-              </w:rPr>
-            </w:pPr>
-          </w:p>
-        </w:tc>
-        <w:tc>
-          <w:tcPr>
-            <w:tcW w:w="0" w:type="auto"/>
-            <w:vAlign w:val="center"/>
-            <w:hideMark/>
-          </w:tcPr>
-          <w:p>
-            <w:pPr>
-              <w:rPr>
-                <w:rFonts w:ascii="Times New Roman" w:hAnsi="Times New Roman" w:cs="Times New Roman"/>
-                <w:sz w:val="18"/>
-                <w:szCs w:val="18"/>
-              </w:rPr>
-            </w:pPr>
-          </w:p>
-        </w:tc>
-        <w:tc>
-          <w:tcPr>
-            <w:tcW w:w="0" w:type="auto"/>
+            <w:tcW w:w="475" w:type="dxa"/>
+            <w:vAlign w:val="center"/>
+            <w:hideMark/>
+          </w:tcPr>
+          <w:p>
+            <w:pPr>
+              <w:rPr>
+                <w:rFonts w:ascii="Times New Roman" w:hAnsi="Times New Roman" w:cs="Times New Roman"/>
+                <w:sz w:val="18"/>
+                <w:szCs w:val="18"/>
+              </w:rPr>
+            </w:pPr>
+          </w:p>
+        </w:tc>
+        <w:tc>
+          <w:tcPr>
+            <w:tcW w:w="396" w:type="dxa"/>
+            <w:vAlign w:val="center"/>
+            <w:hideMark/>
+          </w:tcPr>
+          <w:p>
+            <w:pPr>
+              <w:rPr>
+                <w:rFonts w:ascii="Times New Roman" w:hAnsi="Times New Roman" w:cs="Times New Roman"/>
+                <w:sz w:val="18"/>
+                <w:szCs w:val="18"/>
+              </w:rPr>
+            </w:pPr>
+          </w:p>
+        </w:tc>
+        <w:tc>
+          <w:tcPr>
+            <w:tcW w:w="377" w:type="dxa"/>
             <w:vAlign w:val="center"/>
             <w:hideMark/>
           </w:tcPr>
@@ -22743,7 +22821,7 @@
         </w:tc>
         <w:tc>
           <w:tcPr>
-            <w:tcW w:w="0" w:type="auto"/>
+            <w:tcW w:w="1610" w:type="dxa"/>
             <w:vAlign w:val="center"/>
             <w:hideMark/>
           </w:tcPr>
@@ -22767,23 +22845,23 @@
         </w:tc>
         <w:tc>
           <w:tcPr>
-            <w:tcW w:w="0" w:type="auto"/>
-            <w:vAlign w:val="center"/>
-            <w:hideMark/>
-          </w:tcPr>
-          <w:p>
-            <w:pPr>
-              <w:rPr>
-                <w:rFonts w:ascii="Times New Roman" w:hAnsi="Times New Roman" w:cs="Times New Roman"/>
-                <w:sz w:val="18"/>
-                <w:szCs w:val="18"/>
-              </w:rPr>
-            </w:pPr>
-          </w:p>
-        </w:tc>
-        <w:tc>
-          <w:tcPr>
-            <w:tcW w:w="0" w:type="auto"/>
+            <w:tcW w:w="465" w:type="dxa"/>
+            <w:vAlign w:val="center"/>
+            <w:hideMark/>
+          </w:tcPr>
+          <w:p>
+            <w:pPr>
+              <w:rPr>
+                <w:rFonts w:ascii="Times New Roman" w:hAnsi="Times New Roman" w:cs="Times New Roman"/>
+                <w:sz w:val="18"/>
+                <w:szCs w:val="18"/>
+              </w:rPr>
+            </w:pPr>
+          </w:p>
+        </w:tc>
+        <w:tc>
+          <w:tcPr>
+            <w:tcW w:w="504" w:type="dxa"/>
             <w:vAlign w:val="center"/>
             <w:hideMark/>
           </w:tcPr>
@@ -22812,7 +22890,7 @@
         </w:trPr>
         <w:tc>
           <w:tcPr>
-            <w:tcW w:w="0" w:type="auto"/>
+            <w:tcW w:w="517" w:type="dxa"/>
             <w:vAlign w:val="center"/>
             <w:hideMark/>
           </w:tcPr>
@@ -22836,7 +22914,7 @@
         </w:tc>
         <w:tc>
           <w:tcPr>
-            <w:tcW w:w="0" w:type="auto"/>
+            <w:tcW w:w="1188" w:type="dxa"/>
             <w:vAlign w:val="center"/>
             <w:hideMark/>
           </w:tcPr>
@@ -22860,7 +22938,7 @@
         </w:tc>
         <w:tc>
           <w:tcPr>
-            <w:tcW w:w="0" w:type="auto"/>
+            <w:tcW w:w="652" w:type="dxa"/>
             <w:vAlign w:val="center"/>
             <w:hideMark/>
           </w:tcPr>
@@ -22884,7 +22962,7 @@
         </w:tc>
         <w:tc>
           <w:tcPr>
-            <w:tcW w:w="0" w:type="auto"/>
+            <w:tcW w:w="492" w:type="dxa"/>
             <w:vAlign w:val="center"/>
             <w:hideMark/>
           </w:tcPr>
@@ -22908,7 +22986,7 @@
         </w:tc>
         <w:tc>
           <w:tcPr>
-            <w:tcW w:w="0" w:type="auto"/>
+            <w:tcW w:w="436" w:type="dxa"/>
             <w:vAlign w:val="center"/>
             <w:hideMark/>
           </w:tcPr>
@@ -22932,7 +23010,7 @@
         </w:tc>
         <w:tc>
           <w:tcPr>
-            <w:tcW w:w="0" w:type="auto"/>
+            <w:tcW w:w="573" w:type="dxa"/>
             <w:vAlign w:val="center"/>
             <w:hideMark/>
           </w:tcPr>
@@ -22956,7 +23034,7 @@
         </w:tc>
         <w:tc>
           <w:tcPr>
-            <w:tcW w:w="0" w:type="auto"/>
+            <w:tcW w:w="770" w:type="dxa"/>
             <w:vAlign w:val="center"/>
             <w:hideMark/>
           </w:tcPr>
@@ -22980,7 +23058,7 @@
         </w:tc>
         <w:tc>
           <w:tcPr>
-            <w:tcW w:w="0" w:type="auto"/>
+            <w:tcW w:w="367" w:type="dxa"/>
             <w:vAlign w:val="center"/>
             <w:hideMark/>
           </w:tcPr>
@@ -23004,7 +23082,7 @@
         </w:tc>
         <w:tc>
           <w:tcPr>
-            <w:tcW w:w="0" w:type="auto"/>
+            <w:tcW w:w="395" w:type="dxa"/>
             <w:vAlign w:val="center"/>
             <w:hideMark/>
           </w:tcPr>
@@ -23028,39 +23106,39 @@
         </w:tc>
         <w:tc>
           <w:tcPr>
-            <w:tcW w:w="0" w:type="auto"/>
-            <w:vAlign w:val="center"/>
-            <w:hideMark/>
-          </w:tcPr>
-          <w:p>
-            <w:pPr>
-              <w:rPr>
-                <w:rFonts w:ascii="Times New Roman" w:hAnsi="Times New Roman" w:cs="Times New Roman"/>
-                <w:sz w:val="18"/>
-                <w:szCs w:val="18"/>
-              </w:rPr>
-            </w:pPr>
-          </w:p>
-        </w:tc>
-        <w:tc>
-          <w:tcPr>
-            <w:tcW w:w="0" w:type="auto"/>
-            <w:vAlign w:val="center"/>
-            <w:hideMark/>
-          </w:tcPr>
-          <w:p>
-            <w:pPr>
-              <w:rPr>
-                <w:rFonts w:ascii="Times New Roman" w:hAnsi="Times New Roman" w:cs="Times New Roman"/>
-                <w:sz w:val="18"/>
-                <w:szCs w:val="18"/>
-              </w:rPr>
-            </w:pPr>
-          </w:p>
-        </w:tc>
-        <w:tc>
-          <w:tcPr>
-            <w:tcW w:w="0" w:type="auto"/>
+            <w:tcW w:w="475" w:type="dxa"/>
+            <w:vAlign w:val="center"/>
+            <w:hideMark/>
+          </w:tcPr>
+          <w:p>
+            <w:pPr>
+              <w:rPr>
+                <w:rFonts w:ascii="Times New Roman" w:hAnsi="Times New Roman" w:cs="Times New Roman"/>
+                <w:sz w:val="18"/>
+                <w:szCs w:val="18"/>
+              </w:rPr>
+            </w:pPr>
+          </w:p>
+        </w:tc>
+        <w:tc>
+          <w:tcPr>
+            <w:tcW w:w="396" w:type="dxa"/>
+            <w:vAlign w:val="center"/>
+            <w:hideMark/>
+          </w:tcPr>
+          <w:p>
+            <w:pPr>
+              <w:rPr>
+                <w:rFonts w:ascii="Times New Roman" w:hAnsi="Times New Roman" w:cs="Times New Roman"/>
+                <w:sz w:val="18"/>
+                <w:szCs w:val="18"/>
+              </w:rPr>
+            </w:pPr>
+          </w:p>
+        </w:tc>
+        <w:tc>
+          <w:tcPr>
+            <w:tcW w:w="377" w:type="dxa"/>
             <w:vAlign w:val="center"/>
             <w:hideMark/>
           </w:tcPr>
@@ -23084,7 +23162,7 @@
         </w:tc>
         <w:tc>
           <w:tcPr>
-            <w:tcW w:w="0" w:type="auto"/>
+            <w:tcW w:w="1610" w:type="dxa"/>
             <w:vAlign w:val="center"/>
             <w:hideMark/>
           </w:tcPr>
@@ -23108,23 +23186,23 @@
         </w:tc>
         <w:tc>
           <w:tcPr>
-            <w:tcW w:w="0" w:type="auto"/>
-            <w:vAlign w:val="center"/>
-            <w:hideMark/>
-          </w:tcPr>
-          <w:p>
-            <w:pPr>
-              <w:rPr>
-                <w:rFonts w:ascii="Times New Roman" w:hAnsi="Times New Roman" w:cs="Times New Roman"/>
-                <w:sz w:val="18"/>
-                <w:szCs w:val="18"/>
-              </w:rPr>
-            </w:pPr>
-          </w:p>
-        </w:tc>
-        <w:tc>
-          <w:tcPr>
-            <w:tcW w:w="0" w:type="auto"/>
+            <w:tcW w:w="465" w:type="dxa"/>
+            <w:vAlign w:val="center"/>
+            <w:hideMark/>
+          </w:tcPr>
+          <w:p>
+            <w:pPr>
+              <w:rPr>
+                <w:rFonts w:ascii="Times New Roman" w:hAnsi="Times New Roman" w:cs="Times New Roman"/>
+                <w:sz w:val="18"/>
+                <w:szCs w:val="18"/>
+              </w:rPr>
+            </w:pPr>
+          </w:p>
+        </w:tc>
+        <w:tc>
+          <w:tcPr>
+            <w:tcW w:w="504" w:type="dxa"/>
             <w:vAlign w:val="center"/>
             <w:hideMark/>
           </w:tcPr>
@@ -23178,6 +23256,14 @@
       <w:tblPr>
         <w:tblW w:w="0" w:type="auto"/>
         <w:tblCellSpacing w:w="15" w:type="dxa"/>
+        <w:tblBorders>
+          <w:top w:val="single" w:sz="4" w:space="0" w:color="auto"/>
+          <w:left w:val="single" w:sz="4" w:space="0" w:color="auto"/>
+          <w:bottom w:val="single" w:sz="4" w:space="0" w:color="auto"/>
+          <w:right w:val="single" w:sz="4" w:space="0" w:color="auto"/>
+          <w:insideH w:val="single" w:sz="4" w:space="0" w:color="auto"/>
+          <w:insideV w:val="single" w:sz="4" w:space="0" w:color="auto"/>
+        </w:tblBorders>
         <w:tblCellMar>
           <w:top w:w="15" w:type="dxa"/>
           <w:left w:w="15" w:type="dxa"/>
@@ -23187,21 +23273,21 @@
         <w:tblLook w:val="04A0" w:firstRow="1" w:lastRow="0" w:firstColumn="1" w:lastColumn="0" w:noHBand="0" w:noVBand="1"/>
       </w:tblPr>
       <w:tblGrid>
-        <w:gridCol w:w="417"/>
-        <w:gridCol w:w="895"/>
-        <w:gridCol w:w="730"/>
-        <w:gridCol w:w="582"/>
-        <w:gridCol w:w="660"/>
-        <w:gridCol w:w="754"/>
-        <w:gridCol w:w="862"/>
-        <w:gridCol w:w="393"/>
-        <w:gridCol w:w="416"/>
-        <w:gridCol w:w="574"/>
-        <w:gridCol w:w="476"/>
-        <w:gridCol w:w="449"/>
-        <w:gridCol w:w="942"/>
-        <w:gridCol w:w="838"/>
-        <w:gridCol w:w="719"/>
+        <w:gridCol w:w="436"/>
+        <w:gridCol w:w="903"/>
+        <w:gridCol w:w="750"/>
+        <w:gridCol w:w="589"/>
+        <w:gridCol w:w="642"/>
+        <w:gridCol w:w="744"/>
+        <w:gridCol w:w="869"/>
+        <w:gridCol w:w="411"/>
+        <w:gridCol w:w="435"/>
+        <w:gridCol w:w="579"/>
+        <w:gridCol w:w="485"/>
+        <w:gridCol w:w="459"/>
+        <w:gridCol w:w="913"/>
+        <w:gridCol w:w="794"/>
+        <w:gridCol w:w="688"/>
       </w:tblGrid>
       <w:tr>
         <w:trPr>
@@ -24335,6 +24421,7 @@
                 <w:sz w:val="18"/>
                 <w:szCs w:val="18"/>
               </w:rPr>
+              <w:lastRenderedPageBreak/>
               <w:t>3</w:t>
             </w:r>
           </w:p>
@@ -25010,6 +25097,14 @@
       <w:tblPr>
         <w:tblW w:w="0" w:type="auto"/>
         <w:tblCellSpacing w:w="15" w:type="dxa"/>
+        <w:tblBorders>
+          <w:top w:val="single" w:sz="4" w:space="0" w:color="auto"/>
+          <w:left w:val="single" w:sz="4" w:space="0" w:color="auto"/>
+          <w:bottom w:val="single" w:sz="4" w:space="0" w:color="auto"/>
+          <w:right w:val="single" w:sz="4" w:space="0" w:color="auto"/>
+          <w:insideH w:val="single" w:sz="4" w:space="0" w:color="auto"/>
+          <w:insideV w:val="single" w:sz="4" w:space="0" w:color="auto"/>
+        </w:tblBorders>
         <w:tblCellMar>
           <w:top w:w="15" w:type="dxa"/>
           <w:left w:w="15" w:type="dxa"/>
@@ -25019,21 +25114,21 @@
         <w:tblLook w:val="04A0" w:firstRow="1" w:lastRow="0" w:firstColumn="1" w:lastColumn="0" w:noHBand="0" w:noVBand="1"/>
       </w:tblPr>
       <w:tblGrid>
-        <w:gridCol w:w="416"/>
-        <w:gridCol w:w="1107"/>
-        <w:gridCol w:w="670"/>
-        <w:gridCol w:w="540"/>
-        <w:gridCol w:w="542"/>
-        <w:gridCol w:w="648"/>
-        <w:gridCol w:w="821"/>
-        <w:gridCol w:w="381"/>
-        <w:gridCol w:w="410"/>
-        <w:gridCol w:w="527"/>
-        <w:gridCol w:w="439"/>
-        <w:gridCol w:w="416"/>
-        <w:gridCol w:w="1591"/>
-        <w:gridCol w:w="636"/>
-        <w:gridCol w:w="563"/>
+        <w:gridCol w:w="437"/>
+        <w:gridCol w:w="1124"/>
+        <w:gridCol w:w="690"/>
+        <w:gridCol w:w="545"/>
+        <w:gridCol w:w="518"/>
+        <w:gridCol w:w="640"/>
+        <w:gridCol w:w="826"/>
+        <w:gridCol w:w="401"/>
+        <w:gridCol w:w="430"/>
+        <w:gridCol w:w="530"/>
+        <w:gridCol w:w="446"/>
+        <w:gridCol w:w="424"/>
+        <w:gridCol w:w="1563"/>
+        <w:gridCol w:w="582"/>
+        <w:gridCol w:w="541"/>
       </w:tblGrid>
       <w:tr>
         <w:trPr>
@@ -26866,6 +26961,14 @@
       <w:tblPr>
         <w:tblW w:w="0" w:type="auto"/>
         <w:tblCellSpacing w:w="15" w:type="dxa"/>
+        <w:tblBorders>
+          <w:top w:val="single" w:sz="4" w:space="0" w:color="auto"/>
+          <w:left w:val="single" w:sz="4" w:space="0" w:color="auto"/>
+          <w:bottom w:val="single" w:sz="4" w:space="0" w:color="auto"/>
+          <w:right w:val="single" w:sz="4" w:space="0" w:color="auto"/>
+          <w:insideH w:val="single" w:sz="4" w:space="0" w:color="auto"/>
+          <w:insideV w:val="single" w:sz="4" w:space="0" w:color="auto"/>
+        </w:tblBorders>
         <w:tblCellMar>
           <w:top w:w="15" w:type="dxa"/>
           <w:left w:w="15" w:type="dxa"/>
@@ -26875,21 +26978,21 @@
         <w:tblLook w:val="04A0" w:firstRow="1" w:lastRow="0" w:firstColumn="1" w:lastColumn="0" w:noHBand="0" w:noVBand="1"/>
       </w:tblPr>
       <w:tblGrid>
+        <w:gridCol w:w="436"/>
+        <w:gridCol w:w="1120"/>
+        <w:gridCol w:w="690"/>
+        <w:gridCol w:w="533"/>
+        <w:gridCol w:w="488"/>
+        <w:gridCol w:w="621"/>
+        <w:gridCol w:w="816"/>
+        <w:gridCol w:w="401"/>
+        <w:gridCol w:w="430"/>
+        <w:gridCol w:w="518"/>
+        <w:gridCol w:w="436"/>
         <w:gridCol w:w="416"/>
-        <w:gridCol w:w="1104"/>
-        <w:gridCol w:w="670"/>
-        <w:gridCol w:w="529"/>
-        <w:gridCol w:w="511"/>
-        <w:gridCol w:w="628"/>
-        <w:gridCol w:w="811"/>
-        <w:gridCol w:w="381"/>
-        <w:gridCol w:w="410"/>
-        <w:gridCol w:w="515"/>
-        <w:gridCol w:w="430"/>
-        <w:gridCol w:w="408"/>
-        <w:gridCol w:w="1717"/>
-        <w:gridCol w:w="583"/>
-        <w:gridCol w:w="594"/>
+        <w:gridCol w:w="1690"/>
+        <w:gridCol w:w="530"/>
+        <w:gridCol w:w="572"/>
       </w:tblGrid>
       <w:tr>
         <w:trPr>
@@ -29428,6 +29531,14 @@
       <w:tblPr>
         <w:tblW w:w="0" w:type="auto"/>
         <w:tblCellSpacing w:w="15" w:type="dxa"/>
+        <w:tblBorders>
+          <w:top w:val="single" w:sz="4" w:space="0" w:color="auto"/>
+          <w:left w:val="single" w:sz="4" w:space="0" w:color="auto"/>
+          <w:bottom w:val="single" w:sz="4" w:space="0" w:color="auto"/>
+          <w:right w:val="single" w:sz="4" w:space="0" w:color="auto"/>
+          <w:insideH w:val="single" w:sz="4" w:space="0" w:color="auto"/>
+          <w:insideV w:val="single" w:sz="4" w:space="0" w:color="auto"/>
+        </w:tblBorders>
         <w:tblCellMar>
           <w:top w:w="15" w:type="dxa"/>
           <w:left w:w="15" w:type="dxa"/>
@@ -29437,21 +29548,21 @@
         <w:tblLook w:val="04A0" w:firstRow="1" w:lastRow="0" w:firstColumn="1" w:lastColumn="0" w:noHBand="0" w:noVBand="1"/>
       </w:tblPr>
       <w:tblGrid>
-        <w:gridCol w:w="417"/>
-        <w:gridCol w:w="1020"/>
-        <w:gridCol w:w="730"/>
-        <w:gridCol w:w="549"/>
-        <w:gridCol w:w="567"/>
-        <w:gridCol w:w="664"/>
-        <w:gridCol w:w="830"/>
-        <w:gridCol w:w="381"/>
-        <w:gridCol w:w="410"/>
-        <w:gridCol w:w="537"/>
-        <w:gridCol w:w="447"/>
-        <w:gridCol w:w="423"/>
-        <w:gridCol w:w="1413"/>
-        <w:gridCol w:w="680"/>
-        <w:gridCol w:w="639"/>
+        <w:gridCol w:w="437"/>
+        <w:gridCol w:w="1033"/>
+        <w:gridCol w:w="750"/>
+        <w:gridCol w:w="556"/>
+        <w:gridCol w:w="550"/>
+        <w:gridCol w:w="660"/>
+        <w:gridCol w:w="837"/>
+        <w:gridCol w:w="401"/>
+        <w:gridCol w:w="430"/>
+        <w:gridCol w:w="543"/>
+        <w:gridCol w:w="456"/>
+        <w:gridCol w:w="433"/>
+        <w:gridCol w:w="1359"/>
+        <w:gridCol w:w="636"/>
+        <w:gridCol w:w="616"/>
       </w:tblGrid>
       <w:tr>
         <w:trPr>
@@ -31558,6 +31669,14 @@
       <w:tblPr>
         <w:tblW w:w="0" w:type="auto"/>
         <w:tblCellSpacing w:w="15" w:type="dxa"/>
+        <w:tblBorders>
+          <w:top w:val="single" w:sz="4" w:space="0" w:color="auto"/>
+          <w:left w:val="single" w:sz="4" w:space="0" w:color="auto"/>
+          <w:bottom w:val="single" w:sz="4" w:space="0" w:color="auto"/>
+          <w:right w:val="single" w:sz="4" w:space="0" w:color="auto"/>
+          <w:insideH w:val="single" w:sz="4" w:space="0" w:color="auto"/>
+          <w:insideV w:val="single" w:sz="4" w:space="0" w:color="auto"/>
+        </w:tblBorders>
         <w:tblCellMar>
           <w:top w:w="15" w:type="dxa"/>
           <w:left w:w="15" w:type="dxa"/>
@@ -31567,21 +31686,21 @@
         <w:tblLook w:val="04A0" w:firstRow="1" w:lastRow="0" w:firstColumn="1" w:lastColumn="0" w:noHBand="0" w:noVBand="1"/>
       </w:tblPr>
       <w:tblGrid>
-        <w:gridCol w:w="416"/>
-        <w:gridCol w:w="1028"/>
-        <w:gridCol w:w="730"/>
-        <w:gridCol w:w="573"/>
-        <w:gridCol w:w="633"/>
-        <w:gridCol w:w="706"/>
-        <w:gridCol w:w="853"/>
-        <w:gridCol w:w="381"/>
-        <w:gridCol w:w="410"/>
-        <w:gridCol w:w="563"/>
-        <w:gridCol w:w="468"/>
-        <w:gridCol w:w="442"/>
-        <w:gridCol w:w="1155"/>
-        <w:gridCol w:w="792"/>
-        <w:gridCol w:w="557"/>
+        <w:gridCol w:w="436"/>
+        <w:gridCol w:w="1040"/>
+        <w:gridCol w:w="750"/>
+        <w:gridCol w:w="577"/>
+        <w:gridCol w:w="608"/>
+        <w:gridCol w:w="697"/>
+        <w:gridCol w:w="858"/>
+        <w:gridCol w:w="401"/>
+        <w:gridCol w:w="430"/>
+        <w:gridCol w:w="566"/>
+        <w:gridCol w:w="474"/>
+        <w:gridCol w:w="449"/>
+        <w:gridCol w:w="1129"/>
+        <w:gridCol w:w="735"/>
+        <w:gridCol w:w="547"/>
       </w:tblGrid>
       <w:tr>
         <w:trPr>
@@ -33027,7 +33146,16 @@
                 <w:sz w:val="18"/>
                 <w:szCs w:val="18"/>
               </w:rPr>
-              <w:t>Giá trị quy định</w:t>
+              <w:t xml:space="preserve">Giá trị </w:t>
+            </w:r>
+            <w:r>
+              <w:rPr>
+                <w:rFonts w:ascii="Times New Roman" w:hAnsi="Times New Roman" w:cs="Times New Roman"/>
+                <w:sz w:val="18"/>
+                <w:szCs w:val="18"/>
+              </w:rPr>
+              <w:lastRenderedPageBreak/>
+              <w:t>quy định</w:t>
             </w:r>
           </w:p>
         </w:tc>
@@ -33056,6 +33184,7 @@
                 <w:sz w:val="18"/>
                 <w:szCs w:val="18"/>
               </w:rPr>
+              <w:lastRenderedPageBreak/>
               <w:t>4</w:t>
             </w:r>
           </w:p>
@@ -33356,7 +33485,6 @@
           <w:sz w:val="26"/>
           <w:szCs w:val="26"/>
         </w:rPr>
-        <w:lastRenderedPageBreak/>
         <w:t>3.4 Sơ đồ tuần tự (</w:t>
       </w:r>
       <w:r>

</xml_diff>

<commit_message>
docs: Sửa lại phần bảng file báo cáo (#30)
* docs: Sửa lại phần bảng file báo cáo

* ci: bump frontend-check Node to 22.x for Vite 7
</commit_message>
<xml_diff>
--- a/docs/QuanLyGargaOto/BaoCao_GARA_OTO.docx
+++ b/docs/QuanLyGargaOto/BaoCao_GARA_OTO.docx
@@ -116,6 +116,14 @@
     </w:p>
     <w:sdt>
       <w:sdtPr>
+        <w:rPr>
+          <w:rFonts w:asciiTheme="minorHAnsi" w:eastAsiaTheme="minorHAnsi" w:hAnsiTheme="minorHAnsi" w:cstheme="minorBidi"/>
+          <w:color w:val="auto"/>
+          <w:kern w:val="2"/>
+          <w:sz w:val="24"/>
+          <w:szCs w:val="24"/>
+          <w14:ligatures w14:val="standardContextual"/>
+        </w:rPr>
         <w:id w:val="-1340538631"/>
         <w:docPartObj>
           <w:docPartGallery w:val="Table of Contents"/>
@@ -124,15 +132,9 @@
       </w:sdtPr>
       <w:sdtEndPr>
         <w:rPr>
-          <w:rFonts w:asciiTheme="minorHAnsi" w:eastAsiaTheme="minorHAnsi" w:hAnsiTheme="minorHAnsi" w:cstheme="minorBidi"/>
           <w:b/>
           <w:bCs/>
           <w:noProof/>
-          <w:color w:val="auto"/>
-          <w:kern w:val="2"/>
-          <w:sz w:val="24"/>
-          <w:szCs w:val="24"/>
-          <w14:ligatures w14:val="standardContextual"/>
         </w:rPr>
       </w:sdtEndPr>
       <w:sdtContent>
@@ -8285,7 +8287,7 @@
           <w:noProof/>
         </w:rPr>
         <w:drawing>
-          <wp:inline distT="0" distB="0" distL="0" distR="0" wp14:anchorId="3FECF3C4" wp14:editId="3E7DA8E5">
+          <wp:inline distT="0" distB="0" distL="0" distR="0" wp14:anchorId="3FECF3C4" wp14:editId="240094E3">
             <wp:extent cx="4808220" cy="3566415"/>
             <wp:effectExtent l="0" t="0" r="0" b="0"/>
             <wp:docPr id="232891468" name="Picture 1"/>
@@ -8525,6 +8527,14 @@
         <w:tblW w:w="12345" w:type="dxa"/>
         <w:tblCellSpacing w:w="15" w:type="dxa"/>
         <w:tblInd w:w="-1276" w:type="dxa"/>
+        <w:tblBorders>
+          <w:top w:val="single" w:sz="4" w:space="0" w:color="auto"/>
+          <w:left w:val="single" w:sz="4" w:space="0" w:color="auto"/>
+          <w:bottom w:val="single" w:sz="4" w:space="0" w:color="auto"/>
+          <w:right w:val="single" w:sz="4" w:space="0" w:color="auto"/>
+          <w:insideH w:val="single" w:sz="4" w:space="0" w:color="auto"/>
+          <w:insideV w:val="single" w:sz="4" w:space="0" w:color="auto"/>
+        </w:tblBorders>
         <w:tblCellMar>
           <w:top w:w="15" w:type="dxa"/>
           <w:left w:w="15" w:type="dxa"/>
@@ -8539,15 +8549,15 @@
         <w:gridCol w:w="1028"/>
         <w:gridCol w:w="848"/>
         <w:gridCol w:w="990"/>
-        <w:gridCol w:w="850"/>
-        <w:gridCol w:w="905"/>
-        <w:gridCol w:w="399"/>
-        <w:gridCol w:w="420"/>
-        <w:gridCol w:w="623"/>
-        <w:gridCol w:w="515"/>
-        <w:gridCol w:w="483"/>
-        <w:gridCol w:w="1021"/>
-        <w:gridCol w:w="1047"/>
+        <w:gridCol w:w="843"/>
+        <w:gridCol w:w="913"/>
+        <w:gridCol w:w="418"/>
+        <w:gridCol w:w="439"/>
+        <w:gridCol w:w="629"/>
+        <w:gridCol w:w="524"/>
+        <w:gridCol w:w="494"/>
+        <w:gridCol w:w="994"/>
+        <w:gridCol w:w="1009"/>
         <w:gridCol w:w="696"/>
       </w:tblGrid>
       <w:tr>
@@ -10341,6 +10351,14 @@
       <w:tblPr>
         <w:tblW w:w="0" w:type="auto"/>
         <w:tblCellSpacing w:w="15" w:type="dxa"/>
+        <w:tblBorders>
+          <w:top w:val="single" w:sz="4" w:space="0" w:color="auto"/>
+          <w:left w:val="single" w:sz="4" w:space="0" w:color="auto"/>
+          <w:bottom w:val="single" w:sz="4" w:space="0" w:color="auto"/>
+          <w:right w:val="single" w:sz="4" w:space="0" w:color="auto"/>
+          <w:insideH w:val="single" w:sz="4" w:space="0" w:color="auto"/>
+          <w:insideV w:val="single" w:sz="4" w:space="0" w:color="auto"/>
+        </w:tblBorders>
         <w:tblCellMar>
           <w:top w:w="15" w:type="dxa"/>
           <w:left w:w="15" w:type="dxa"/>
@@ -10350,21 +10368,21 @@
         <w:tblLook w:val="04A0" w:firstRow="1" w:lastRow="0" w:firstColumn="1" w:lastColumn="0" w:noHBand="0" w:noVBand="1"/>
       </w:tblPr>
       <w:tblGrid>
-        <w:gridCol w:w="416"/>
-        <w:gridCol w:w="943"/>
-        <w:gridCol w:w="730"/>
-        <w:gridCol w:w="585"/>
-        <w:gridCol w:w="667"/>
-        <w:gridCol w:w="727"/>
-        <w:gridCol w:w="865"/>
-        <w:gridCol w:w="381"/>
-        <w:gridCol w:w="410"/>
-        <w:gridCol w:w="577"/>
-        <w:gridCol w:w="479"/>
-        <w:gridCol w:w="451"/>
-        <w:gridCol w:w="1100"/>
-        <w:gridCol w:w="850"/>
-        <w:gridCol w:w="526"/>
+        <w:gridCol w:w="436"/>
+        <w:gridCol w:w="952"/>
+        <w:gridCol w:w="750"/>
+        <w:gridCol w:w="589"/>
+        <w:gridCol w:w="642"/>
+        <w:gridCol w:w="719"/>
+        <w:gridCol w:w="869"/>
+        <w:gridCol w:w="401"/>
+        <w:gridCol w:w="430"/>
+        <w:gridCol w:w="579"/>
+        <w:gridCol w:w="484"/>
+        <w:gridCol w:w="458"/>
+        <w:gridCol w:w="1069"/>
+        <w:gridCol w:w="792"/>
+        <w:gridCol w:w="527"/>
       </w:tblGrid>
       <w:tr>
         <w:trPr>
@@ -11539,6 +11557,14 @@
       <w:tblPr>
         <w:tblW w:w="0" w:type="auto"/>
         <w:tblCellSpacing w:w="15" w:type="dxa"/>
+        <w:tblBorders>
+          <w:top w:val="single" w:sz="4" w:space="0" w:color="auto"/>
+          <w:left w:val="single" w:sz="4" w:space="0" w:color="auto"/>
+          <w:bottom w:val="single" w:sz="4" w:space="0" w:color="auto"/>
+          <w:right w:val="single" w:sz="4" w:space="0" w:color="auto"/>
+          <w:insideH w:val="single" w:sz="4" w:space="0" w:color="auto"/>
+          <w:insideV w:val="single" w:sz="4" w:space="0" w:color="auto"/>
+        </w:tblBorders>
         <w:tblCellMar>
           <w:top w:w="15" w:type="dxa"/>
           <w:left w:w="15" w:type="dxa"/>
@@ -11548,21 +11574,21 @@
         <w:tblLook w:val="04A0" w:firstRow="1" w:lastRow="0" w:firstColumn="1" w:lastColumn="0" w:noHBand="0" w:noVBand="1"/>
       </w:tblPr>
       <w:tblGrid>
-        <w:gridCol w:w="416"/>
-        <w:gridCol w:w="1181"/>
-        <w:gridCol w:w="670"/>
-        <w:gridCol w:w="544"/>
-        <w:gridCol w:w="553"/>
-        <w:gridCol w:w="655"/>
-        <w:gridCol w:w="825"/>
-        <w:gridCol w:w="381"/>
-        <w:gridCol w:w="410"/>
-        <w:gridCol w:w="532"/>
-        <w:gridCol w:w="443"/>
-        <w:gridCol w:w="419"/>
-        <w:gridCol w:w="1423"/>
-        <w:gridCol w:w="655"/>
+        <w:gridCol w:w="437"/>
+        <w:gridCol w:w="1201"/>
+        <w:gridCol w:w="690"/>
+        <w:gridCol w:w="549"/>
+        <w:gridCol w:w="529"/>
+        <w:gridCol w:w="647"/>
+        <w:gridCol w:w="830"/>
+        <w:gridCol w:w="401"/>
+        <w:gridCol w:w="430"/>
+        <w:gridCol w:w="534"/>
+        <w:gridCol w:w="449"/>
+        <w:gridCol w:w="427"/>
+        <w:gridCol w:w="1394"/>
         <w:gridCol w:w="600"/>
+        <w:gridCol w:w="579"/>
       </w:tblGrid>
       <w:tr>
         <w:trPr>
@@ -13751,6 +13777,14 @@
         <w:tblOverlap w:val="never"/>
         <w:tblW w:w="0" w:type="auto"/>
         <w:tblCellSpacing w:w="15" w:type="dxa"/>
+        <w:tblBorders>
+          <w:top w:val="single" w:sz="4" w:space="0" w:color="auto"/>
+          <w:left w:val="single" w:sz="4" w:space="0" w:color="auto"/>
+          <w:bottom w:val="single" w:sz="4" w:space="0" w:color="auto"/>
+          <w:right w:val="single" w:sz="4" w:space="0" w:color="auto"/>
+          <w:insideH w:val="single" w:sz="4" w:space="0" w:color="auto"/>
+          <w:insideV w:val="single" w:sz="4" w:space="0" w:color="auto"/>
+        </w:tblBorders>
         <w:tblCellMar>
           <w:top w:w="15" w:type="dxa"/>
           <w:left w:w="15" w:type="dxa"/>
@@ -13760,21 +13794,21 @@
         <w:tblLook w:val="04A0" w:firstRow="1" w:lastRow="0" w:firstColumn="1" w:lastColumn="0" w:noHBand="0" w:noVBand="1"/>
       </w:tblPr>
       <w:tblGrid>
-        <w:gridCol w:w="417"/>
-        <w:gridCol w:w="958"/>
-        <w:gridCol w:w="730"/>
-        <w:gridCol w:w="550"/>
-        <w:gridCol w:w="570"/>
-        <w:gridCol w:w="1058"/>
-        <w:gridCol w:w="831"/>
-        <w:gridCol w:w="381"/>
-        <w:gridCol w:w="410"/>
-        <w:gridCol w:w="538"/>
-        <w:gridCol w:w="448"/>
-        <w:gridCol w:w="424"/>
-        <w:gridCol w:w="1062"/>
-        <w:gridCol w:w="684"/>
-        <w:gridCol w:w="646"/>
+        <w:gridCol w:w="437"/>
+        <w:gridCol w:w="969"/>
+        <w:gridCol w:w="750"/>
+        <w:gridCol w:w="557"/>
+        <w:gridCol w:w="552"/>
+        <w:gridCol w:w="1029"/>
+        <w:gridCol w:w="838"/>
+        <w:gridCol w:w="401"/>
+        <w:gridCol w:w="430"/>
+        <w:gridCol w:w="543"/>
+        <w:gridCol w:w="456"/>
+        <w:gridCol w:w="434"/>
+        <w:gridCol w:w="1041"/>
+        <w:gridCol w:w="640"/>
+        <w:gridCol w:w="620"/>
       </w:tblGrid>
       <w:tr>
         <w:trPr>
@@ -15940,6 +15974,14 @@
       <w:tblPr>
         <w:tblW w:w="0" w:type="auto"/>
         <w:tblCellSpacing w:w="15" w:type="dxa"/>
+        <w:tblBorders>
+          <w:top w:val="single" w:sz="4" w:space="0" w:color="auto"/>
+          <w:left w:val="single" w:sz="4" w:space="0" w:color="auto"/>
+          <w:bottom w:val="single" w:sz="4" w:space="0" w:color="auto"/>
+          <w:right w:val="single" w:sz="4" w:space="0" w:color="auto"/>
+          <w:insideH w:val="single" w:sz="4" w:space="0" w:color="auto"/>
+          <w:insideV w:val="single" w:sz="4" w:space="0" w:color="auto"/>
+        </w:tblBorders>
         <w:tblCellMar>
           <w:top w:w="15" w:type="dxa"/>
           <w:left w:w="15" w:type="dxa"/>
@@ -15949,21 +15991,21 @@
         <w:tblLook w:val="04A0" w:firstRow="1" w:lastRow="0" w:firstColumn="1" w:lastColumn="0" w:noHBand="0" w:noVBand="1"/>
       </w:tblPr>
       <w:tblGrid>
-        <w:gridCol w:w="417"/>
-        <w:gridCol w:w="1038"/>
-        <w:gridCol w:w="730"/>
-        <w:gridCol w:w="563"/>
-        <w:gridCol w:w="607"/>
-        <w:gridCol w:w="689"/>
-        <w:gridCol w:w="844"/>
-        <w:gridCol w:w="381"/>
-        <w:gridCol w:w="410"/>
-        <w:gridCol w:w="553"/>
-        <w:gridCol w:w="460"/>
-        <w:gridCol w:w="434"/>
-        <w:gridCol w:w="1167"/>
-        <w:gridCol w:w="747"/>
-        <w:gridCol w:w="667"/>
+        <w:gridCol w:w="437"/>
+        <w:gridCol w:w="1052"/>
+        <w:gridCol w:w="750"/>
+        <w:gridCol w:w="569"/>
+        <w:gridCol w:w="586"/>
+        <w:gridCol w:w="683"/>
+        <w:gridCol w:w="850"/>
+        <w:gridCol w:w="401"/>
+        <w:gridCol w:w="430"/>
+        <w:gridCol w:w="557"/>
+        <w:gridCol w:w="467"/>
+        <w:gridCol w:w="443"/>
+        <w:gridCol w:w="1147"/>
+        <w:gridCol w:w="698"/>
+        <w:gridCol w:w="627"/>
       </w:tblGrid>
       <w:tr>
         <w:trPr>
@@ -17445,6 +17487,14 @@
       <w:tblPr>
         <w:tblW w:w="0" w:type="auto"/>
         <w:tblCellSpacing w:w="15" w:type="dxa"/>
+        <w:tblBorders>
+          <w:top w:val="single" w:sz="4" w:space="0" w:color="auto"/>
+          <w:left w:val="single" w:sz="4" w:space="0" w:color="auto"/>
+          <w:bottom w:val="single" w:sz="4" w:space="0" w:color="auto"/>
+          <w:right w:val="single" w:sz="4" w:space="0" w:color="auto"/>
+          <w:insideH w:val="single" w:sz="4" w:space="0" w:color="auto"/>
+          <w:insideV w:val="single" w:sz="4" w:space="0" w:color="auto"/>
+        </w:tblBorders>
         <w:tblCellMar>
           <w:top w:w="15" w:type="dxa"/>
           <w:left w:w="15" w:type="dxa"/>
@@ -17454,21 +17504,21 @@
         <w:tblLook w:val="04A0" w:firstRow="1" w:lastRow="0" w:firstColumn="1" w:lastColumn="0" w:noHBand="0" w:noVBand="1"/>
       </w:tblPr>
       <w:tblGrid>
-        <w:gridCol w:w="417"/>
-        <w:gridCol w:w="1026"/>
-        <w:gridCol w:w="730"/>
-        <w:gridCol w:w="566"/>
-        <w:gridCol w:w="614"/>
-        <w:gridCol w:w="729"/>
-        <w:gridCol w:w="847"/>
-        <w:gridCol w:w="381"/>
-        <w:gridCol w:w="410"/>
-        <w:gridCol w:w="556"/>
-        <w:gridCol w:w="462"/>
         <w:gridCol w:w="436"/>
-        <w:gridCol w:w="1160"/>
-        <w:gridCol w:w="760"/>
-        <w:gridCol w:w="613"/>
+        <w:gridCol w:w="1037"/>
+        <w:gridCol w:w="750"/>
+        <w:gridCol w:w="571"/>
+        <w:gridCol w:w="591"/>
+        <w:gridCol w:w="712"/>
+        <w:gridCol w:w="852"/>
+        <w:gridCol w:w="401"/>
+        <w:gridCol w:w="430"/>
+        <w:gridCol w:w="559"/>
+        <w:gridCol w:w="468"/>
+        <w:gridCol w:w="444"/>
+        <w:gridCol w:w="1137"/>
+        <w:gridCol w:w="706"/>
+        <w:gridCol w:w="603"/>
       </w:tblGrid>
       <w:tr>
         <w:trPr>
@@ -19261,6 +19311,7 @@
                 <w:sz w:val="18"/>
                 <w:szCs w:val="18"/>
               </w:rPr>
+              <w:lastRenderedPageBreak/>
               <w:t>5</w:t>
             </w:r>
           </w:p>
@@ -19602,7 +19653,6 @@
                 <w:sz w:val="18"/>
                 <w:szCs w:val="18"/>
               </w:rPr>
-              <w:lastRenderedPageBreak/>
               <w:t>6</w:t>
             </w:r>
           </w:p>
@@ -19951,6 +20001,15 @@
       <w:tblPr>
         <w:tblW w:w="0" w:type="auto"/>
         <w:tblCellSpacing w:w="15" w:type="dxa"/>
+        <w:tblBorders>
+          <w:top w:val="single" w:sz="4" w:space="0" w:color="auto"/>
+          <w:left w:val="single" w:sz="4" w:space="0" w:color="auto"/>
+          <w:bottom w:val="single" w:sz="4" w:space="0" w:color="auto"/>
+          <w:right w:val="single" w:sz="4" w:space="0" w:color="auto"/>
+          <w:insideH w:val="single" w:sz="4" w:space="0" w:color="auto"/>
+          <w:insideV w:val="single" w:sz="4" w:space="0" w:color="auto"/>
+        </w:tblBorders>
+        <w:tblLayout w:type="fixed"/>
         <w:tblCellMar>
           <w:top w:w="15" w:type="dxa"/>
           <w:left w:w="15" w:type="dxa"/>
@@ -19960,21 +20019,21 @@
         <w:tblLook w:val="04A0" w:firstRow="1" w:lastRow="0" w:firstColumn="1" w:lastColumn="0" w:noHBand="0" w:noVBand="1"/>
       </w:tblPr>
       <w:tblGrid>
-        <w:gridCol w:w="416"/>
-        <w:gridCol w:w="1344"/>
-        <w:gridCol w:w="670"/>
-        <w:gridCol w:w="515"/>
-        <w:gridCol w:w="473"/>
-        <w:gridCol w:w="604"/>
-        <w:gridCol w:w="797"/>
-        <w:gridCol w:w="381"/>
-        <w:gridCol w:w="410"/>
-        <w:gridCol w:w="500"/>
-        <w:gridCol w:w="418"/>
+        <w:gridCol w:w="562"/>
+        <w:gridCol w:w="1218"/>
+        <w:gridCol w:w="682"/>
+        <w:gridCol w:w="522"/>
+        <w:gridCol w:w="466"/>
+        <w:gridCol w:w="603"/>
+        <w:gridCol w:w="800"/>
         <w:gridCol w:w="397"/>
-        <w:gridCol w:w="1691"/>
-        <w:gridCol w:w="518"/>
-        <w:gridCol w:w="573"/>
+        <w:gridCol w:w="425"/>
+        <w:gridCol w:w="505"/>
+        <w:gridCol w:w="426"/>
+        <w:gridCol w:w="407"/>
+        <w:gridCol w:w="1640"/>
+        <w:gridCol w:w="495"/>
+        <w:gridCol w:w="549"/>
       </w:tblGrid>
       <w:tr>
         <w:trPr>
@@ -19983,7 +20042,7 @@
         </w:trPr>
         <w:tc>
           <w:tcPr>
-            <w:tcW w:w="0" w:type="auto"/>
+            <w:tcW w:w="517" w:type="dxa"/>
             <w:vAlign w:val="center"/>
             <w:hideMark/>
           </w:tcPr>
@@ -20011,7 +20070,7 @@
         </w:tc>
         <w:tc>
           <w:tcPr>
-            <w:tcW w:w="0" w:type="auto"/>
+            <w:tcW w:w="1188" w:type="dxa"/>
             <w:vAlign w:val="center"/>
             <w:hideMark/>
           </w:tcPr>
@@ -20039,7 +20098,7 @@
         </w:tc>
         <w:tc>
           <w:tcPr>
-            <w:tcW w:w="0" w:type="auto"/>
+            <w:tcW w:w="652" w:type="dxa"/>
             <w:vAlign w:val="center"/>
             <w:hideMark/>
           </w:tcPr>
@@ -20067,7 +20126,7 @@
         </w:tc>
         <w:tc>
           <w:tcPr>
-            <w:tcW w:w="0" w:type="auto"/>
+            <w:tcW w:w="492" w:type="dxa"/>
             <w:vAlign w:val="center"/>
             <w:hideMark/>
           </w:tcPr>
@@ -20095,7 +20154,7 @@
         </w:tc>
         <w:tc>
           <w:tcPr>
-            <w:tcW w:w="0" w:type="auto"/>
+            <w:tcW w:w="436" w:type="dxa"/>
             <w:vAlign w:val="center"/>
             <w:hideMark/>
           </w:tcPr>
@@ -20123,7 +20182,7 @@
         </w:tc>
         <w:tc>
           <w:tcPr>
-            <w:tcW w:w="0" w:type="auto"/>
+            <w:tcW w:w="573" w:type="dxa"/>
             <w:vAlign w:val="center"/>
             <w:hideMark/>
           </w:tcPr>
@@ -20151,7 +20210,7 @@
         </w:tc>
         <w:tc>
           <w:tcPr>
-            <w:tcW w:w="0" w:type="auto"/>
+            <w:tcW w:w="770" w:type="dxa"/>
             <w:vAlign w:val="center"/>
             <w:hideMark/>
           </w:tcPr>
@@ -20179,7 +20238,7 @@
         </w:tc>
         <w:tc>
           <w:tcPr>
-            <w:tcW w:w="0" w:type="auto"/>
+            <w:tcW w:w="367" w:type="dxa"/>
             <w:vAlign w:val="center"/>
             <w:hideMark/>
           </w:tcPr>
@@ -20207,7 +20266,7 @@
         </w:tc>
         <w:tc>
           <w:tcPr>
-            <w:tcW w:w="0" w:type="auto"/>
+            <w:tcW w:w="395" w:type="dxa"/>
             <w:vAlign w:val="center"/>
             <w:hideMark/>
           </w:tcPr>
@@ -20235,7 +20294,7 @@
         </w:tc>
         <w:tc>
           <w:tcPr>
-            <w:tcW w:w="0" w:type="auto"/>
+            <w:tcW w:w="475" w:type="dxa"/>
             <w:vAlign w:val="center"/>
             <w:hideMark/>
           </w:tcPr>
@@ -20263,7 +20322,7 @@
         </w:tc>
         <w:tc>
           <w:tcPr>
-            <w:tcW w:w="0" w:type="auto"/>
+            <w:tcW w:w="396" w:type="dxa"/>
             <w:vAlign w:val="center"/>
             <w:hideMark/>
           </w:tcPr>
@@ -20291,7 +20350,7 @@
         </w:tc>
         <w:tc>
           <w:tcPr>
-            <w:tcW w:w="0" w:type="auto"/>
+            <w:tcW w:w="377" w:type="dxa"/>
             <w:vAlign w:val="center"/>
             <w:hideMark/>
           </w:tcPr>
@@ -20319,7 +20378,7 @@
         </w:tc>
         <w:tc>
           <w:tcPr>
-            <w:tcW w:w="0" w:type="auto"/>
+            <w:tcW w:w="1610" w:type="dxa"/>
             <w:vAlign w:val="center"/>
             <w:hideMark/>
           </w:tcPr>
@@ -20347,7 +20406,7 @@
         </w:tc>
         <w:tc>
           <w:tcPr>
-            <w:tcW w:w="0" w:type="auto"/>
+            <w:tcW w:w="465" w:type="dxa"/>
             <w:vAlign w:val="center"/>
             <w:hideMark/>
           </w:tcPr>
@@ -20375,7 +20434,7 @@
         </w:tc>
         <w:tc>
           <w:tcPr>
-            <w:tcW w:w="0" w:type="auto"/>
+            <w:tcW w:w="504" w:type="dxa"/>
             <w:vAlign w:val="center"/>
             <w:hideMark/>
           </w:tcPr>
@@ -20408,7 +20467,7 @@
         </w:trPr>
         <w:tc>
           <w:tcPr>
-            <w:tcW w:w="0" w:type="auto"/>
+            <w:tcW w:w="517" w:type="dxa"/>
             <w:vAlign w:val="center"/>
             <w:hideMark/>
           </w:tcPr>
@@ -20432,7 +20491,7 @@
         </w:tc>
         <w:tc>
           <w:tcPr>
-            <w:tcW w:w="0" w:type="auto"/>
+            <w:tcW w:w="1188" w:type="dxa"/>
             <w:vAlign w:val="center"/>
             <w:hideMark/>
           </w:tcPr>
@@ -20456,7 +20515,7 @@
         </w:tc>
         <w:tc>
           <w:tcPr>
-            <w:tcW w:w="0" w:type="auto"/>
+            <w:tcW w:w="652" w:type="dxa"/>
             <w:vAlign w:val="center"/>
             <w:hideMark/>
           </w:tcPr>
@@ -20480,7 +20539,7 @@
         </w:tc>
         <w:tc>
           <w:tcPr>
-            <w:tcW w:w="0" w:type="auto"/>
+            <w:tcW w:w="492" w:type="dxa"/>
             <w:vAlign w:val="center"/>
             <w:hideMark/>
           </w:tcPr>
@@ -20504,7 +20563,7 @@
         </w:tc>
         <w:tc>
           <w:tcPr>
-            <w:tcW w:w="0" w:type="auto"/>
+            <w:tcW w:w="436" w:type="dxa"/>
             <w:vAlign w:val="center"/>
             <w:hideMark/>
           </w:tcPr>
@@ -20528,7 +20587,7 @@
         </w:tc>
         <w:tc>
           <w:tcPr>
-            <w:tcW w:w="0" w:type="auto"/>
+            <w:tcW w:w="573" w:type="dxa"/>
             <w:vAlign w:val="center"/>
             <w:hideMark/>
           </w:tcPr>
@@ -20552,7 +20611,7 @@
         </w:tc>
         <w:tc>
           <w:tcPr>
-            <w:tcW w:w="0" w:type="auto"/>
+            <w:tcW w:w="770" w:type="dxa"/>
             <w:vAlign w:val="center"/>
             <w:hideMark/>
           </w:tcPr>
@@ -20576,7 +20635,7 @@
         </w:tc>
         <w:tc>
           <w:tcPr>
-            <w:tcW w:w="0" w:type="auto"/>
+            <w:tcW w:w="367" w:type="dxa"/>
             <w:vAlign w:val="center"/>
             <w:hideMark/>
           </w:tcPr>
@@ -20600,7 +20659,7 @@
         </w:tc>
         <w:tc>
           <w:tcPr>
-            <w:tcW w:w="0" w:type="auto"/>
+            <w:tcW w:w="395" w:type="dxa"/>
             <w:vAlign w:val="center"/>
             <w:hideMark/>
           </w:tcPr>
@@ -20624,7 +20683,7 @@
         </w:tc>
         <w:tc>
           <w:tcPr>
-            <w:tcW w:w="0" w:type="auto"/>
+            <w:tcW w:w="475" w:type="dxa"/>
             <w:vAlign w:val="center"/>
             <w:hideMark/>
           </w:tcPr>
@@ -20648,7 +20707,7 @@
         </w:tc>
         <w:tc>
           <w:tcPr>
-            <w:tcW w:w="0" w:type="auto"/>
+            <w:tcW w:w="396" w:type="dxa"/>
             <w:vAlign w:val="center"/>
             <w:hideMark/>
           </w:tcPr>
@@ -20672,7 +20731,7 @@
         </w:tc>
         <w:tc>
           <w:tcPr>
-            <w:tcW w:w="0" w:type="auto"/>
+            <w:tcW w:w="377" w:type="dxa"/>
             <w:vAlign w:val="center"/>
             <w:hideMark/>
           </w:tcPr>
@@ -20696,7 +20755,7 @@
         </w:tc>
         <w:tc>
           <w:tcPr>
-            <w:tcW w:w="0" w:type="auto"/>
+            <w:tcW w:w="1610" w:type="dxa"/>
             <w:vAlign w:val="center"/>
             <w:hideMark/>
           </w:tcPr>
@@ -20720,23 +20779,23 @@
         </w:tc>
         <w:tc>
           <w:tcPr>
-            <w:tcW w:w="0" w:type="auto"/>
-            <w:vAlign w:val="center"/>
-            <w:hideMark/>
-          </w:tcPr>
-          <w:p>
-            <w:pPr>
-              <w:rPr>
-                <w:rFonts w:ascii="Times New Roman" w:hAnsi="Times New Roman" w:cs="Times New Roman"/>
-                <w:sz w:val="18"/>
-                <w:szCs w:val="18"/>
-              </w:rPr>
-            </w:pPr>
-          </w:p>
-        </w:tc>
-        <w:tc>
-          <w:tcPr>
-            <w:tcW w:w="0" w:type="auto"/>
+            <w:tcW w:w="465" w:type="dxa"/>
+            <w:vAlign w:val="center"/>
+            <w:hideMark/>
+          </w:tcPr>
+          <w:p>
+            <w:pPr>
+              <w:rPr>
+                <w:rFonts w:ascii="Times New Roman" w:hAnsi="Times New Roman" w:cs="Times New Roman"/>
+                <w:sz w:val="18"/>
+                <w:szCs w:val="18"/>
+              </w:rPr>
+            </w:pPr>
+          </w:p>
+        </w:tc>
+        <w:tc>
+          <w:tcPr>
+            <w:tcW w:w="504" w:type="dxa"/>
             <w:vAlign w:val="center"/>
             <w:hideMark/>
           </w:tcPr>
@@ -20765,7 +20824,7 @@
         </w:trPr>
         <w:tc>
           <w:tcPr>
-            <w:tcW w:w="0" w:type="auto"/>
+            <w:tcW w:w="517" w:type="dxa"/>
             <w:vAlign w:val="center"/>
             <w:hideMark/>
           </w:tcPr>
@@ -20789,7 +20848,7 @@
         </w:tc>
         <w:tc>
           <w:tcPr>
-            <w:tcW w:w="0" w:type="auto"/>
+            <w:tcW w:w="1188" w:type="dxa"/>
             <w:vAlign w:val="center"/>
             <w:hideMark/>
           </w:tcPr>
@@ -20813,7 +20872,7 @@
         </w:tc>
         <w:tc>
           <w:tcPr>
-            <w:tcW w:w="0" w:type="auto"/>
+            <w:tcW w:w="652" w:type="dxa"/>
             <w:vAlign w:val="center"/>
             <w:hideMark/>
           </w:tcPr>
@@ -20837,7 +20896,7 @@
         </w:tc>
         <w:tc>
           <w:tcPr>
-            <w:tcW w:w="0" w:type="auto"/>
+            <w:tcW w:w="492" w:type="dxa"/>
             <w:vAlign w:val="center"/>
             <w:hideMark/>
           </w:tcPr>
@@ -20861,7 +20920,7 @@
         </w:tc>
         <w:tc>
           <w:tcPr>
-            <w:tcW w:w="0" w:type="auto"/>
+            <w:tcW w:w="436" w:type="dxa"/>
             <w:vAlign w:val="center"/>
             <w:hideMark/>
           </w:tcPr>
@@ -20885,7 +20944,7 @@
         </w:tc>
         <w:tc>
           <w:tcPr>
-            <w:tcW w:w="0" w:type="auto"/>
+            <w:tcW w:w="573" w:type="dxa"/>
             <w:vAlign w:val="center"/>
             <w:hideMark/>
           </w:tcPr>
@@ -20909,23 +20968,23 @@
         </w:tc>
         <w:tc>
           <w:tcPr>
-            <w:tcW w:w="0" w:type="auto"/>
-            <w:vAlign w:val="center"/>
-            <w:hideMark/>
-          </w:tcPr>
-          <w:p>
-            <w:pPr>
-              <w:rPr>
-                <w:rFonts w:ascii="Times New Roman" w:hAnsi="Times New Roman" w:cs="Times New Roman"/>
-                <w:sz w:val="18"/>
-                <w:szCs w:val="18"/>
-              </w:rPr>
-            </w:pPr>
-          </w:p>
-        </w:tc>
-        <w:tc>
-          <w:tcPr>
-            <w:tcW w:w="0" w:type="auto"/>
+            <w:tcW w:w="770" w:type="dxa"/>
+            <w:vAlign w:val="center"/>
+            <w:hideMark/>
+          </w:tcPr>
+          <w:p>
+            <w:pPr>
+              <w:rPr>
+                <w:rFonts w:ascii="Times New Roman" w:hAnsi="Times New Roman" w:cs="Times New Roman"/>
+                <w:sz w:val="18"/>
+                <w:szCs w:val="18"/>
+              </w:rPr>
+            </w:pPr>
+          </w:p>
+        </w:tc>
+        <w:tc>
+          <w:tcPr>
+            <w:tcW w:w="367" w:type="dxa"/>
             <w:vAlign w:val="center"/>
             <w:hideMark/>
           </w:tcPr>
@@ -20949,7 +21008,7 @@
         </w:tc>
         <w:tc>
           <w:tcPr>
-            <w:tcW w:w="0" w:type="auto"/>
+            <w:tcW w:w="395" w:type="dxa"/>
             <w:vAlign w:val="center"/>
             <w:hideMark/>
           </w:tcPr>
@@ -20973,39 +21032,39 @@
         </w:tc>
         <w:tc>
           <w:tcPr>
-            <w:tcW w:w="0" w:type="auto"/>
-            <w:vAlign w:val="center"/>
-            <w:hideMark/>
-          </w:tcPr>
-          <w:p>
-            <w:pPr>
-              <w:rPr>
-                <w:rFonts w:ascii="Times New Roman" w:hAnsi="Times New Roman" w:cs="Times New Roman"/>
-                <w:sz w:val="18"/>
-                <w:szCs w:val="18"/>
-              </w:rPr>
-            </w:pPr>
-          </w:p>
-        </w:tc>
-        <w:tc>
-          <w:tcPr>
-            <w:tcW w:w="0" w:type="auto"/>
-            <w:vAlign w:val="center"/>
-            <w:hideMark/>
-          </w:tcPr>
-          <w:p>
-            <w:pPr>
-              <w:rPr>
-                <w:rFonts w:ascii="Times New Roman" w:hAnsi="Times New Roman" w:cs="Times New Roman"/>
-                <w:sz w:val="18"/>
-                <w:szCs w:val="18"/>
-              </w:rPr>
-            </w:pPr>
-          </w:p>
-        </w:tc>
-        <w:tc>
-          <w:tcPr>
-            <w:tcW w:w="0" w:type="auto"/>
+            <w:tcW w:w="475" w:type="dxa"/>
+            <w:vAlign w:val="center"/>
+            <w:hideMark/>
+          </w:tcPr>
+          <w:p>
+            <w:pPr>
+              <w:rPr>
+                <w:rFonts w:ascii="Times New Roman" w:hAnsi="Times New Roman" w:cs="Times New Roman"/>
+                <w:sz w:val="18"/>
+                <w:szCs w:val="18"/>
+              </w:rPr>
+            </w:pPr>
+          </w:p>
+        </w:tc>
+        <w:tc>
+          <w:tcPr>
+            <w:tcW w:w="396" w:type="dxa"/>
+            <w:vAlign w:val="center"/>
+            <w:hideMark/>
+          </w:tcPr>
+          <w:p>
+            <w:pPr>
+              <w:rPr>
+                <w:rFonts w:ascii="Times New Roman" w:hAnsi="Times New Roman" w:cs="Times New Roman"/>
+                <w:sz w:val="18"/>
+                <w:szCs w:val="18"/>
+              </w:rPr>
+            </w:pPr>
+          </w:p>
+        </w:tc>
+        <w:tc>
+          <w:tcPr>
+            <w:tcW w:w="377" w:type="dxa"/>
             <w:vAlign w:val="center"/>
             <w:hideMark/>
           </w:tcPr>
@@ -21029,7 +21088,7 @@
         </w:tc>
         <w:tc>
           <w:tcPr>
-            <w:tcW w:w="0" w:type="auto"/>
+            <w:tcW w:w="1610" w:type="dxa"/>
             <w:vAlign w:val="center"/>
             <w:hideMark/>
           </w:tcPr>
@@ -21053,7 +21112,7 @@
         </w:tc>
         <w:tc>
           <w:tcPr>
-            <w:tcW w:w="0" w:type="auto"/>
+            <w:tcW w:w="465" w:type="dxa"/>
             <w:vAlign w:val="center"/>
             <w:hideMark/>
           </w:tcPr>
@@ -21077,7 +21136,7 @@
         </w:tc>
         <w:tc>
           <w:tcPr>
-            <w:tcW w:w="0" w:type="auto"/>
+            <w:tcW w:w="504" w:type="dxa"/>
             <w:vAlign w:val="center"/>
             <w:hideMark/>
           </w:tcPr>
@@ -21106,7 +21165,7 @@
         </w:trPr>
         <w:tc>
           <w:tcPr>
-            <w:tcW w:w="0" w:type="auto"/>
+            <w:tcW w:w="517" w:type="dxa"/>
             <w:vAlign w:val="center"/>
             <w:hideMark/>
           </w:tcPr>
@@ -21130,7 +21189,7 @@
         </w:tc>
         <w:tc>
           <w:tcPr>
-            <w:tcW w:w="0" w:type="auto"/>
+            <w:tcW w:w="1188" w:type="dxa"/>
             <w:vAlign w:val="center"/>
             <w:hideMark/>
           </w:tcPr>
@@ -21154,7 +21213,7 @@
         </w:tc>
         <w:tc>
           <w:tcPr>
-            <w:tcW w:w="0" w:type="auto"/>
+            <w:tcW w:w="652" w:type="dxa"/>
             <w:vAlign w:val="center"/>
             <w:hideMark/>
           </w:tcPr>
@@ -21178,7 +21237,7 @@
         </w:tc>
         <w:tc>
           <w:tcPr>
-            <w:tcW w:w="0" w:type="auto"/>
+            <w:tcW w:w="492" w:type="dxa"/>
             <w:vAlign w:val="center"/>
             <w:hideMark/>
           </w:tcPr>
@@ -21202,7 +21261,7 @@
         </w:tc>
         <w:tc>
           <w:tcPr>
-            <w:tcW w:w="0" w:type="auto"/>
+            <w:tcW w:w="436" w:type="dxa"/>
             <w:vAlign w:val="center"/>
             <w:hideMark/>
           </w:tcPr>
@@ -21226,7 +21285,7 @@
         </w:tc>
         <w:tc>
           <w:tcPr>
-            <w:tcW w:w="0" w:type="auto"/>
+            <w:tcW w:w="573" w:type="dxa"/>
             <w:vAlign w:val="center"/>
             <w:hideMark/>
           </w:tcPr>
@@ -21250,23 +21309,23 @@
         </w:tc>
         <w:tc>
           <w:tcPr>
-            <w:tcW w:w="0" w:type="auto"/>
-            <w:vAlign w:val="center"/>
-            <w:hideMark/>
-          </w:tcPr>
-          <w:p>
-            <w:pPr>
-              <w:rPr>
-                <w:rFonts w:ascii="Times New Roman" w:hAnsi="Times New Roman" w:cs="Times New Roman"/>
-                <w:sz w:val="18"/>
-                <w:szCs w:val="18"/>
-              </w:rPr>
-            </w:pPr>
-          </w:p>
-        </w:tc>
-        <w:tc>
-          <w:tcPr>
-            <w:tcW w:w="0" w:type="auto"/>
+            <w:tcW w:w="770" w:type="dxa"/>
+            <w:vAlign w:val="center"/>
+            <w:hideMark/>
+          </w:tcPr>
+          <w:p>
+            <w:pPr>
+              <w:rPr>
+                <w:rFonts w:ascii="Times New Roman" w:hAnsi="Times New Roman" w:cs="Times New Roman"/>
+                <w:sz w:val="18"/>
+                <w:szCs w:val="18"/>
+              </w:rPr>
+            </w:pPr>
+          </w:p>
+        </w:tc>
+        <w:tc>
+          <w:tcPr>
+            <w:tcW w:w="367" w:type="dxa"/>
             <w:vAlign w:val="center"/>
             <w:hideMark/>
           </w:tcPr>
@@ -21290,7 +21349,7 @@
         </w:tc>
         <w:tc>
           <w:tcPr>
-            <w:tcW w:w="0" w:type="auto"/>
+            <w:tcW w:w="395" w:type="dxa"/>
             <w:vAlign w:val="center"/>
             <w:hideMark/>
           </w:tcPr>
@@ -21314,39 +21373,39 @@
         </w:tc>
         <w:tc>
           <w:tcPr>
-            <w:tcW w:w="0" w:type="auto"/>
-            <w:vAlign w:val="center"/>
-            <w:hideMark/>
-          </w:tcPr>
-          <w:p>
-            <w:pPr>
-              <w:rPr>
-                <w:rFonts w:ascii="Times New Roman" w:hAnsi="Times New Roman" w:cs="Times New Roman"/>
-                <w:sz w:val="18"/>
-                <w:szCs w:val="18"/>
-              </w:rPr>
-            </w:pPr>
-          </w:p>
-        </w:tc>
-        <w:tc>
-          <w:tcPr>
-            <w:tcW w:w="0" w:type="auto"/>
-            <w:vAlign w:val="center"/>
-            <w:hideMark/>
-          </w:tcPr>
-          <w:p>
-            <w:pPr>
-              <w:rPr>
-                <w:rFonts w:ascii="Times New Roman" w:hAnsi="Times New Roman" w:cs="Times New Roman"/>
-                <w:sz w:val="18"/>
-                <w:szCs w:val="18"/>
-              </w:rPr>
-            </w:pPr>
-          </w:p>
-        </w:tc>
-        <w:tc>
-          <w:tcPr>
-            <w:tcW w:w="0" w:type="auto"/>
+            <w:tcW w:w="475" w:type="dxa"/>
+            <w:vAlign w:val="center"/>
+            <w:hideMark/>
+          </w:tcPr>
+          <w:p>
+            <w:pPr>
+              <w:rPr>
+                <w:rFonts w:ascii="Times New Roman" w:hAnsi="Times New Roman" w:cs="Times New Roman"/>
+                <w:sz w:val="18"/>
+                <w:szCs w:val="18"/>
+              </w:rPr>
+            </w:pPr>
+          </w:p>
+        </w:tc>
+        <w:tc>
+          <w:tcPr>
+            <w:tcW w:w="396" w:type="dxa"/>
+            <w:vAlign w:val="center"/>
+            <w:hideMark/>
+          </w:tcPr>
+          <w:p>
+            <w:pPr>
+              <w:rPr>
+                <w:rFonts w:ascii="Times New Roman" w:hAnsi="Times New Roman" w:cs="Times New Roman"/>
+                <w:sz w:val="18"/>
+                <w:szCs w:val="18"/>
+              </w:rPr>
+            </w:pPr>
+          </w:p>
+        </w:tc>
+        <w:tc>
+          <w:tcPr>
+            <w:tcW w:w="377" w:type="dxa"/>
             <w:vAlign w:val="center"/>
             <w:hideMark/>
           </w:tcPr>
@@ -21370,7 +21429,7 @@
         </w:tc>
         <w:tc>
           <w:tcPr>
-            <w:tcW w:w="0" w:type="auto"/>
+            <w:tcW w:w="1610" w:type="dxa"/>
             <w:vAlign w:val="center"/>
             <w:hideMark/>
           </w:tcPr>
@@ -21394,7 +21453,7 @@
         </w:tc>
         <w:tc>
           <w:tcPr>
-            <w:tcW w:w="0" w:type="auto"/>
+            <w:tcW w:w="465" w:type="dxa"/>
             <w:vAlign w:val="center"/>
             <w:hideMark/>
           </w:tcPr>
@@ -21418,7 +21477,7 @@
         </w:tc>
         <w:tc>
           <w:tcPr>
-            <w:tcW w:w="0" w:type="auto"/>
+            <w:tcW w:w="504" w:type="dxa"/>
             <w:vAlign w:val="center"/>
             <w:hideMark/>
           </w:tcPr>
@@ -21447,7 +21506,7 @@
         </w:trPr>
         <w:tc>
           <w:tcPr>
-            <w:tcW w:w="0" w:type="auto"/>
+            <w:tcW w:w="517" w:type="dxa"/>
             <w:vAlign w:val="center"/>
             <w:hideMark/>
           </w:tcPr>
@@ -21471,7 +21530,7 @@
         </w:tc>
         <w:tc>
           <w:tcPr>
-            <w:tcW w:w="0" w:type="auto"/>
+            <w:tcW w:w="1188" w:type="dxa"/>
             <w:vAlign w:val="center"/>
             <w:hideMark/>
           </w:tcPr>
@@ -21495,7 +21554,7 @@
         </w:tc>
         <w:tc>
           <w:tcPr>
-            <w:tcW w:w="0" w:type="auto"/>
+            <w:tcW w:w="652" w:type="dxa"/>
             <w:vAlign w:val="center"/>
             <w:hideMark/>
           </w:tcPr>
@@ -21519,7 +21578,7 @@
         </w:tc>
         <w:tc>
           <w:tcPr>
-            <w:tcW w:w="0" w:type="auto"/>
+            <w:tcW w:w="492" w:type="dxa"/>
             <w:vAlign w:val="center"/>
             <w:hideMark/>
           </w:tcPr>
@@ -21543,7 +21602,7 @@
         </w:tc>
         <w:tc>
           <w:tcPr>
-            <w:tcW w:w="0" w:type="auto"/>
+            <w:tcW w:w="436" w:type="dxa"/>
             <w:vAlign w:val="center"/>
             <w:hideMark/>
           </w:tcPr>
@@ -21567,7 +21626,7 @@
         </w:tc>
         <w:tc>
           <w:tcPr>
-            <w:tcW w:w="0" w:type="auto"/>
+            <w:tcW w:w="573" w:type="dxa"/>
             <w:vAlign w:val="center"/>
             <w:hideMark/>
           </w:tcPr>
@@ -21591,23 +21650,23 @@
         </w:tc>
         <w:tc>
           <w:tcPr>
-            <w:tcW w:w="0" w:type="auto"/>
-            <w:vAlign w:val="center"/>
-            <w:hideMark/>
-          </w:tcPr>
-          <w:p>
-            <w:pPr>
-              <w:rPr>
-                <w:rFonts w:ascii="Times New Roman" w:hAnsi="Times New Roman" w:cs="Times New Roman"/>
-                <w:sz w:val="18"/>
-                <w:szCs w:val="18"/>
-              </w:rPr>
-            </w:pPr>
-          </w:p>
-        </w:tc>
-        <w:tc>
-          <w:tcPr>
-            <w:tcW w:w="0" w:type="auto"/>
+            <w:tcW w:w="770" w:type="dxa"/>
+            <w:vAlign w:val="center"/>
+            <w:hideMark/>
+          </w:tcPr>
+          <w:p>
+            <w:pPr>
+              <w:rPr>
+                <w:rFonts w:ascii="Times New Roman" w:hAnsi="Times New Roman" w:cs="Times New Roman"/>
+                <w:sz w:val="18"/>
+                <w:szCs w:val="18"/>
+              </w:rPr>
+            </w:pPr>
+          </w:p>
+        </w:tc>
+        <w:tc>
+          <w:tcPr>
+            <w:tcW w:w="367" w:type="dxa"/>
             <w:vAlign w:val="center"/>
             <w:hideMark/>
           </w:tcPr>
@@ -21631,7 +21690,7 @@
         </w:tc>
         <w:tc>
           <w:tcPr>
-            <w:tcW w:w="0" w:type="auto"/>
+            <w:tcW w:w="395" w:type="dxa"/>
             <w:vAlign w:val="center"/>
             <w:hideMark/>
           </w:tcPr>
@@ -21655,39 +21714,39 @@
         </w:tc>
         <w:tc>
           <w:tcPr>
-            <w:tcW w:w="0" w:type="auto"/>
-            <w:vAlign w:val="center"/>
-            <w:hideMark/>
-          </w:tcPr>
-          <w:p>
-            <w:pPr>
-              <w:rPr>
-                <w:rFonts w:ascii="Times New Roman" w:hAnsi="Times New Roman" w:cs="Times New Roman"/>
-                <w:sz w:val="18"/>
-                <w:szCs w:val="18"/>
-              </w:rPr>
-            </w:pPr>
-          </w:p>
-        </w:tc>
-        <w:tc>
-          <w:tcPr>
-            <w:tcW w:w="0" w:type="auto"/>
-            <w:vAlign w:val="center"/>
-            <w:hideMark/>
-          </w:tcPr>
-          <w:p>
-            <w:pPr>
-              <w:rPr>
-                <w:rFonts w:ascii="Times New Roman" w:hAnsi="Times New Roman" w:cs="Times New Roman"/>
-                <w:sz w:val="18"/>
-                <w:szCs w:val="18"/>
-              </w:rPr>
-            </w:pPr>
-          </w:p>
-        </w:tc>
-        <w:tc>
-          <w:tcPr>
-            <w:tcW w:w="0" w:type="auto"/>
+            <w:tcW w:w="475" w:type="dxa"/>
+            <w:vAlign w:val="center"/>
+            <w:hideMark/>
+          </w:tcPr>
+          <w:p>
+            <w:pPr>
+              <w:rPr>
+                <w:rFonts w:ascii="Times New Roman" w:hAnsi="Times New Roman" w:cs="Times New Roman"/>
+                <w:sz w:val="18"/>
+                <w:szCs w:val="18"/>
+              </w:rPr>
+            </w:pPr>
+          </w:p>
+        </w:tc>
+        <w:tc>
+          <w:tcPr>
+            <w:tcW w:w="396" w:type="dxa"/>
+            <w:vAlign w:val="center"/>
+            <w:hideMark/>
+          </w:tcPr>
+          <w:p>
+            <w:pPr>
+              <w:rPr>
+                <w:rFonts w:ascii="Times New Roman" w:hAnsi="Times New Roman" w:cs="Times New Roman"/>
+                <w:sz w:val="18"/>
+                <w:szCs w:val="18"/>
+              </w:rPr>
+            </w:pPr>
+          </w:p>
+        </w:tc>
+        <w:tc>
+          <w:tcPr>
+            <w:tcW w:w="377" w:type="dxa"/>
             <w:vAlign w:val="center"/>
             <w:hideMark/>
           </w:tcPr>
@@ -21711,7 +21770,7 @@
         </w:tc>
         <w:tc>
           <w:tcPr>
-            <w:tcW w:w="0" w:type="auto"/>
+            <w:tcW w:w="1610" w:type="dxa"/>
             <w:vAlign w:val="center"/>
             <w:hideMark/>
           </w:tcPr>
@@ -21735,7 +21794,7 @@
         </w:tc>
         <w:tc>
           <w:tcPr>
-            <w:tcW w:w="0" w:type="auto"/>
+            <w:tcW w:w="465" w:type="dxa"/>
             <w:vAlign w:val="center"/>
             <w:hideMark/>
           </w:tcPr>
@@ -21759,7 +21818,7 @@
         </w:tc>
         <w:tc>
           <w:tcPr>
-            <w:tcW w:w="0" w:type="auto"/>
+            <w:tcW w:w="504" w:type="dxa"/>
             <w:vAlign w:val="center"/>
             <w:hideMark/>
           </w:tcPr>
@@ -21788,7 +21847,7 @@
         </w:trPr>
         <w:tc>
           <w:tcPr>
-            <w:tcW w:w="0" w:type="auto"/>
+            <w:tcW w:w="517" w:type="dxa"/>
             <w:vAlign w:val="center"/>
             <w:hideMark/>
           </w:tcPr>
@@ -21812,7 +21871,7 @@
         </w:tc>
         <w:tc>
           <w:tcPr>
-            <w:tcW w:w="0" w:type="auto"/>
+            <w:tcW w:w="1188" w:type="dxa"/>
             <w:vAlign w:val="center"/>
             <w:hideMark/>
           </w:tcPr>
@@ -21836,7 +21895,7 @@
         </w:tc>
         <w:tc>
           <w:tcPr>
-            <w:tcW w:w="0" w:type="auto"/>
+            <w:tcW w:w="652" w:type="dxa"/>
             <w:vAlign w:val="center"/>
             <w:hideMark/>
           </w:tcPr>
@@ -21860,7 +21919,7 @@
         </w:tc>
         <w:tc>
           <w:tcPr>
-            <w:tcW w:w="0" w:type="auto"/>
+            <w:tcW w:w="492" w:type="dxa"/>
             <w:vAlign w:val="center"/>
             <w:hideMark/>
           </w:tcPr>
@@ -21884,7 +21943,7 @@
         </w:tc>
         <w:tc>
           <w:tcPr>
-            <w:tcW w:w="0" w:type="auto"/>
+            <w:tcW w:w="436" w:type="dxa"/>
             <w:vAlign w:val="center"/>
             <w:hideMark/>
           </w:tcPr>
@@ -21908,55 +21967,65 @@
         </w:tc>
         <w:tc>
           <w:tcPr>
-            <w:tcW w:w="0" w:type="auto"/>
-            <w:vAlign w:val="center"/>
-            <w:hideMark/>
-          </w:tcPr>
-          <w:p>
-            <w:pPr>
-              <w:rPr>
-                <w:rFonts w:ascii="Times New Roman" w:hAnsi="Times New Roman" w:cs="Times New Roman"/>
-                <w:sz w:val="18"/>
-                <w:szCs w:val="18"/>
-              </w:rPr>
-            </w:pPr>
-            <w:r>
-              <w:rPr>
-                <w:rFonts w:ascii="Times New Roman" w:hAnsi="Times New Roman" w:cs="Times New Roman"/>
-                <w:sz w:val="18"/>
-                <w:szCs w:val="18"/>
-              </w:rPr>
-              <w:t>Số nguyên dương</w:t>
-            </w:r>
-          </w:p>
-        </w:tc>
-        <w:tc>
-          <w:tcPr>
-            <w:tcW w:w="0" w:type="auto"/>
-            <w:vAlign w:val="center"/>
-            <w:hideMark/>
-          </w:tcPr>
-          <w:p>
-            <w:pPr>
-              <w:rPr>
-                <w:rFonts w:ascii="Times New Roman" w:hAnsi="Times New Roman" w:cs="Times New Roman"/>
-                <w:sz w:val="18"/>
-                <w:szCs w:val="18"/>
-              </w:rPr>
-            </w:pPr>
-            <w:r>
-              <w:rPr>
-                <w:rFonts w:ascii="Times New Roman" w:hAnsi="Times New Roman" w:cs="Times New Roman"/>
-                <w:sz w:val="18"/>
-                <w:szCs w:val="18"/>
-              </w:rPr>
+            <w:tcW w:w="573" w:type="dxa"/>
+            <w:vAlign w:val="center"/>
+            <w:hideMark/>
+          </w:tcPr>
+          <w:p>
+            <w:pPr>
+              <w:rPr>
+                <w:rFonts w:ascii="Times New Roman" w:hAnsi="Times New Roman" w:cs="Times New Roman"/>
+                <w:sz w:val="18"/>
+                <w:szCs w:val="18"/>
+              </w:rPr>
+            </w:pPr>
+            <w:r>
+              <w:rPr>
+                <w:rFonts w:ascii="Times New Roman" w:hAnsi="Times New Roman" w:cs="Times New Roman"/>
+                <w:sz w:val="18"/>
+                <w:szCs w:val="18"/>
+              </w:rPr>
+              <w:t>Số nguyê</w:t>
+            </w:r>
+            <w:r>
+              <w:rPr>
+                <w:rFonts w:ascii="Times New Roman" w:hAnsi="Times New Roman" w:cs="Times New Roman"/>
+                <w:sz w:val="18"/>
+                <w:szCs w:val="18"/>
+              </w:rPr>
+              <w:lastRenderedPageBreak/>
+              <w:t>n dương</w:t>
+            </w:r>
+          </w:p>
+        </w:tc>
+        <w:tc>
+          <w:tcPr>
+            <w:tcW w:w="770" w:type="dxa"/>
+            <w:vAlign w:val="center"/>
+            <w:hideMark/>
+          </w:tcPr>
+          <w:p>
+            <w:pPr>
+              <w:rPr>
+                <w:rFonts w:ascii="Times New Roman" w:hAnsi="Times New Roman" w:cs="Times New Roman"/>
+                <w:sz w:val="18"/>
+                <w:szCs w:val="18"/>
+              </w:rPr>
+            </w:pPr>
+            <w:r>
+              <w:rPr>
+                <w:rFonts w:ascii="Times New Roman" w:hAnsi="Times New Roman" w:cs="Times New Roman"/>
+                <w:sz w:val="18"/>
+                <w:szCs w:val="18"/>
+              </w:rPr>
+              <w:lastRenderedPageBreak/>
               <w:t>1</w:t>
             </w:r>
           </w:p>
         </w:tc>
         <w:tc>
           <w:tcPr>
-            <w:tcW w:w="0" w:type="auto"/>
+            <w:tcW w:w="367" w:type="dxa"/>
             <w:vAlign w:val="center"/>
             <w:hideMark/>
           </w:tcPr>
@@ -21980,7 +22049,7 @@
         </w:tc>
         <w:tc>
           <w:tcPr>
-            <w:tcW w:w="0" w:type="auto"/>
+            <w:tcW w:w="395" w:type="dxa"/>
             <w:vAlign w:val="center"/>
             <w:hideMark/>
           </w:tcPr>
@@ -22004,39 +22073,39 @@
         </w:tc>
         <w:tc>
           <w:tcPr>
-            <w:tcW w:w="0" w:type="auto"/>
-            <w:vAlign w:val="center"/>
-            <w:hideMark/>
-          </w:tcPr>
-          <w:p>
-            <w:pPr>
-              <w:rPr>
-                <w:rFonts w:ascii="Times New Roman" w:hAnsi="Times New Roman" w:cs="Times New Roman"/>
-                <w:sz w:val="18"/>
-                <w:szCs w:val="18"/>
-              </w:rPr>
-            </w:pPr>
-          </w:p>
-        </w:tc>
-        <w:tc>
-          <w:tcPr>
-            <w:tcW w:w="0" w:type="auto"/>
-            <w:vAlign w:val="center"/>
-            <w:hideMark/>
-          </w:tcPr>
-          <w:p>
-            <w:pPr>
-              <w:rPr>
-                <w:rFonts w:ascii="Times New Roman" w:hAnsi="Times New Roman" w:cs="Times New Roman"/>
-                <w:sz w:val="18"/>
-                <w:szCs w:val="18"/>
-              </w:rPr>
-            </w:pPr>
-          </w:p>
-        </w:tc>
-        <w:tc>
-          <w:tcPr>
-            <w:tcW w:w="0" w:type="auto"/>
+            <w:tcW w:w="475" w:type="dxa"/>
+            <w:vAlign w:val="center"/>
+            <w:hideMark/>
+          </w:tcPr>
+          <w:p>
+            <w:pPr>
+              <w:rPr>
+                <w:rFonts w:ascii="Times New Roman" w:hAnsi="Times New Roman" w:cs="Times New Roman"/>
+                <w:sz w:val="18"/>
+                <w:szCs w:val="18"/>
+              </w:rPr>
+            </w:pPr>
+          </w:p>
+        </w:tc>
+        <w:tc>
+          <w:tcPr>
+            <w:tcW w:w="396" w:type="dxa"/>
+            <w:vAlign w:val="center"/>
+            <w:hideMark/>
+          </w:tcPr>
+          <w:p>
+            <w:pPr>
+              <w:rPr>
+                <w:rFonts w:ascii="Times New Roman" w:hAnsi="Times New Roman" w:cs="Times New Roman"/>
+                <w:sz w:val="18"/>
+                <w:szCs w:val="18"/>
+              </w:rPr>
+            </w:pPr>
+          </w:p>
+        </w:tc>
+        <w:tc>
+          <w:tcPr>
+            <w:tcW w:w="377" w:type="dxa"/>
             <w:vAlign w:val="center"/>
             <w:hideMark/>
           </w:tcPr>
@@ -22060,7 +22129,7 @@
         </w:tc>
         <w:tc>
           <w:tcPr>
-            <w:tcW w:w="0" w:type="auto"/>
+            <w:tcW w:w="1610" w:type="dxa"/>
             <w:vAlign w:val="center"/>
             <w:hideMark/>
           </w:tcPr>
@@ -22084,41 +22153,50 @@
         </w:tc>
         <w:tc>
           <w:tcPr>
-            <w:tcW w:w="0" w:type="auto"/>
-            <w:vAlign w:val="center"/>
-            <w:hideMark/>
-          </w:tcPr>
-          <w:p>
-            <w:pPr>
-              <w:rPr>
-                <w:rFonts w:ascii="Times New Roman" w:hAnsi="Times New Roman" w:cs="Times New Roman"/>
-                <w:sz w:val="18"/>
-                <w:szCs w:val="18"/>
-              </w:rPr>
-            </w:pPr>
-          </w:p>
-        </w:tc>
-        <w:tc>
-          <w:tcPr>
-            <w:tcW w:w="0" w:type="auto"/>
-            <w:vAlign w:val="center"/>
-            <w:hideMark/>
-          </w:tcPr>
-          <w:p>
-            <w:pPr>
-              <w:rPr>
-                <w:rFonts w:ascii="Times New Roman" w:hAnsi="Times New Roman" w:cs="Times New Roman"/>
-                <w:sz w:val="18"/>
-                <w:szCs w:val="18"/>
-              </w:rPr>
-            </w:pPr>
-            <w:r>
-              <w:rPr>
-                <w:rFonts w:ascii="Times New Roman" w:hAnsi="Times New Roman" w:cs="Times New Roman"/>
-                <w:sz w:val="18"/>
-                <w:szCs w:val="18"/>
-              </w:rPr>
-              <w:t>Số lượng vật tư sử dụng</w:t>
+            <w:tcW w:w="465" w:type="dxa"/>
+            <w:vAlign w:val="center"/>
+            <w:hideMark/>
+          </w:tcPr>
+          <w:p>
+            <w:pPr>
+              <w:rPr>
+                <w:rFonts w:ascii="Times New Roman" w:hAnsi="Times New Roman" w:cs="Times New Roman"/>
+                <w:sz w:val="18"/>
+                <w:szCs w:val="18"/>
+              </w:rPr>
+            </w:pPr>
+          </w:p>
+        </w:tc>
+        <w:tc>
+          <w:tcPr>
+            <w:tcW w:w="504" w:type="dxa"/>
+            <w:vAlign w:val="center"/>
+            <w:hideMark/>
+          </w:tcPr>
+          <w:p>
+            <w:pPr>
+              <w:rPr>
+                <w:rFonts w:ascii="Times New Roman" w:hAnsi="Times New Roman" w:cs="Times New Roman"/>
+                <w:sz w:val="18"/>
+                <w:szCs w:val="18"/>
+              </w:rPr>
+            </w:pPr>
+            <w:r>
+              <w:rPr>
+                <w:rFonts w:ascii="Times New Roman" w:hAnsi="Times New Roman" w:cs="Times New Roman"/>
+                <w:sz w:val="18"/>
+                <w:szCs w:val="18"/>
+              </w:rPr>
+              <w:t xml:space="preserve">Số lượng vật tư </w:t>
+            </w:r>
+            <w:r>
+              <w:rPr>
+                <w:rFonts w:ascii="Times New Roman" w:hAnsi="Times New Roman" w:cs="Times New Roman"/>
+                <w:sz w:val="18"/>
+                <w:szCs w:val="18"/>
+              </w:rPr>
+              <w:lastRenderedPageBreak/>
+              <w:t>sử dụng</w:t>
             </w:r>
           </w:p>
         </w:tc>
@@ -22129,31 +22207,32 @@
         </w:trPr>
         <w:tc>
           <w:tcPr>
-            <w:tcW w:w="0" w:type="auto"/>
-            <w:vAlign w:val="center"/>
-            <w:hideMark/>
-          </w:tcPr>
-          <w:p>
-            <w:pPr>
-              <w:rPr>
-                <w:rFonts w:ascii="Times New Roman" w:hAnsi="Times New Roman" w:cs="Times New Roman"/>
-                <w:sz w:val="18"/>
-                <w:szCs w:val="18"/>
-              </w:rPr>
-            </w:pPr>
-            <w:r>
-              <w:rPr>
-                <w:rFonts w:ascii="Times New Roman" w:hAnsi="Times New Roman" w:cs="Times New Roman"/>
-                <w:sz w:val="18"/>
-                <w:szCs w:val="18"/>
-              </w:rPr>
+            <w:tcW w:w="517" w:type="dxa"/>
+            <w:vAlign w:val="center"/>
+            <w:hideMark/>
+          </w:tcPr>
+          <w:p>
+            <w:pPr>
+              <w:rPr>
+                <w:rFonts w:ascii="Times New Roman" w:hAnsi="Times New Roman" w:cs="Times New Roman"/>
+                <w:sz w:val="18"/>
+                <w:szCs w:val="18"/>
+              </w:rPr>
+            </w:pPr>
+            <w:r>
+              <w:rPr>
+                <w:rFonts w:ascii="Times New Roman" w:hAnsi="Times New Roman" w:cs="Times New Roman"/>
+                <w:sz w:val="18"/>
+                <w:szCs w:val="18"/>
+              </w:rPr>
+              <w:lastRenderedPageBreak/>
               <w:t>6</w:t>
             </w:r>
           </w:p>
         </w:tc>
         <w:tc>
           <w:tcPr>
-            <w:tcW w:w="0" w:type="auto"/>
+            <w:tcW w:w="1188" w:type="dxa"/>
             <w:vAlign w:val="center"/>
             <w:hideMark/>
           </w:tcPr>
@@ -22177,7 +22256,7 @@
         </w:tc>
         <w:tc>
           <w:tcPr>
-            <w:tcW w:w="0" w:type="auto"/>
+            <w:tcW w:w="652" w:type="dxa"/>
             <w:vAlign w:val="center"/>
             <w:hideMark/>
           </w:tcPr>
@@ -22201,7 +22280,7 @@
         </w:tc>
         <w:tc>
           <w:tcPr>
-            <w:tcW w:w="0" w:type="auto"/>
+            <w:tcW w:w="492" w:type="dxa"/>
             <w:vAlign w:val="center"/>
             <w:hideMark/>
           </w:tcPr>
@@ -22225,7 +22304,7 @@
         </w:tc>
         <w:tc>
           <w:tcPr>
-            <w:tcW w:w="0" w:type="auto"/>
+            <w:tcW w:w="436" w:type="dxa"/>
             <w:vAlign w:val="center"/>
             <w:hideMark/>
           </w:tcPr>
@@ -22249,7 +22328,7 @@
         </w:tc>
         <w:tc>
           <w:tcPr>
-            <w:tcW w:w="0" w:type="auto"/>
+            <w:tcW w:w="573" w:type="dxa"/>
             <w:vAlign w:val="center"/>
             <w:hideMark/>
           </w:tcPr>
@@ -22273,7 +22352,7 @@
         </w:tc>
         <w:tc>
           <w:tcPr>
-            <w:tcW w:w="0" w:type="auto"/>
+            <w:tcW w:w="770" w:type="dxa"/>
             <w:vAlign w:val="center"/>
             <w:hideMark/>
           </w:tcPr>
@@ -22297,7 +22376,7 @@
         </w:tc>
         <w:tc>
           <w:tcPr>
-            <w:tcW w:w="0" w:type="auto"/>
+            <w:tcW w:w="367" w:type="dxa"/>
             <w:vAlign w:val="center"/>
             <w:hideMark/>
           </w:tcPr>
@@ -22321,7 +22400,7 @@
         </w:tc>
         <w:tc>
           <w:tcPr>
-            <w:tcW w:w="0" w:type="auto"/>
+            <w:tcW w:w="395" w:type="dxa"/>
             <w:vAlign w:val="center"/>
             <w:hideMark/>
           </w:tcPr>
@@ -22345,39 +22424,39 @@
         </w:tc>
         <w:tc>
           <w:tcPr>
-            <w:tcW w:w="0" w:type="auto"/>
-            <w:vAlign w:val="center"/>
-            <w:hideMark/>
-          </w:tcPr>
-          <w:p>
-            <w:pPr>
-              <w:rPr>
-                <w:rFonts w:ascii="Times New Roman" w:hAnsi="Times New Roman" w:cs="Times New Roman"/>
-                <w:sz w:val="18"/>
-                <w:szCs w:val="18"/>
-              </w:rPr>
-            </w:pPr>
-          </w:p>
-        </w:tc>
-        <w:tc>
-          <w:tcPr>
-            <w:tcW w:w="0" w:type="auto"/>
-            <w:vAlign w:val="center"/>
-            <w:hideMark/>
-          </w:tcPr>
-          <w:p>
-            <w:pPr>
-              <w:rPr>
-                <w:rFonts w:ascii="Times New Roman" w:hAnsi="Times New Roman" w:cs="Times New Roman"/>
-                <w:sz w:val="18"/>
-                <w:szCs w:val="18"/>
-              </w:rPr>
-            </w:pPr>
-          </w:p>
-        </w:tc>
-        <w:tc>
-          <w:tcPr>
-            <w:tcW w:w="0" w:type="auto"/>
+            <w:tcW w:w="475" w:type="dxa"/>
+            <w:vAlign w:val="center"/>
+            <w:hideMark/>
+          </w:tcPr>
+          <w:p>
+            <w:pPr>
+              <w:rPr>
+                <w:rFonts w:ascii="Times New Roman" w:hAnsi="Times New Roman" w:cs="Times New Roman"/>
+                <w:sz w:val="18"/>
+                <w:szCs w:val="18"/>
+              </w:rPr>
+            </w:pPr>
+          </w:p>
+        </w:tc>
+        <w:tc>
+          <w:tcPr>
+            <w:tcW w:w="396" w:type="dxa"/>
+            <w:vAlign w:val="center"/>
+            <w:hideMark/>
+          </w:tcPr>
+          <w:p>
+            <w:pPr>
+              <w:rPr>
+                <w:rFonts w:ascii="Times New Roman" w:hAnsi="Times New Roman" w:cs="Times New Roman"/>
+                <w:sz w:val="18"/>
+                <w:szCs w:val="18"/>
+              </w:rPr>
+            </w:pPr>
+          </w:p>
+        </w:tc>
+        <w:tc>
+          <w:tcPr>
+            <w:tcW w:w="377" w:type="dxa"/>
             <w:vAlign w:val="center"/>
             <w:hideMark/>
           </w:tcPr>
@@ -22401,7 +22480,7 @@
         </w:tc>
         <w:tc>
           <w:tcPr>
-            <w:tcW w:w="0" w:type="auto"/>
+            <w:tcW w:w="1610" w:type="dxa"/>
             <w:vAlign w:val="center"/>
             <w:hideMark/>
           </w:tcPr>
@@ -22425,23 +22504,23 @@
         </w:tc>
         <w:tc>
           <w:tcPr>
-            <w:tcW w:w="0" w:type="auto"/>
-            <w:vAlign w:val="center"/>
-            <w:hideMark/>
-          </w:tcPr>
-          <w:p>
-            <w:pPr>
-              <w:rPr>
-                <w:rFonts w:ascii="Times New Roman" w:hAnsi="Times New Roman" w:cs="Times New Roman"/>
-                <w:sz w:val="18"/>
-                <w:szCs w:val="18"/>
-              </w:rPr>
-            </w:pPr>
-          </w:p>
-        </w:tc>
-        <w:tc>
-          <w:tcPr>
-            <w:tcW w:w="0" w:type="auto"/>
+            <w:tcW w:w="465" w:type="dxa"/>
+            <w:vAlign w:val="center"/>
+            <w:hideMark/>
+          </w:tcPr>
+          <w:p>
+            <w:pPr>
+              <w:rPr>
+                <w:rFonts w:ascii="Times New Roman" w:hAnsi="Times New Roman" w:cs="Times New Roman"/>
+                <w:sz w:val="18"/>
+                <w:szCs w:val="18"/>
+              </w:rPr>
+            </w:pPr>
+          </w:p>
+        </w:tc>
+        <w:tc>
+          <w:tcPr>
+            <w:tcW w:w="504" w:type="dxa"/>
             <w:vAlign w:val="center"/>
             <w:hideMark/>
           </w:tcPr>
@@ -22470,32 +22549,31 @@
         </w:trPr>
         <w:tc>
           <w:tcPr>
-            <w:tcW w:w="0" w:type="auto"/>
-            <w:vAlign w:val="center"/>
-            <w:hideMark/>
-          </w:tcPr>
-          <w:p>
-            <w:pPr>
-              <w:rPr>
-                <w:rFonts w:ascii="Times New Roman" w:hAnsi="Times New Roman" w:cs="Times New Roman"/>
-                <w:sz w:val="18"/>
-                <w:szCs w:val="18"/>
-              </w:rPr>
-            </w:pPr>
-            <w:r>
-              <w:rPr>
-                <w:rFonts w:ascii="Times New Roman" w:hAnsi="Times New Roman" w:cs="Times New Roman"/>
-                <w:sz w:val="18"/>
-                <w:szCs w:val="18"/>
-              </w:rPr>
-              <w:lastRenderedPageBreak/>
+            <w:tcW w:w="517" w:type="dxa"/>
+            <w:vAlign w:val="center"/>
+            <w:hideMark/>
+          </w:tcPr>
+          <w:p>
+            <w:pPr>
+              <w:rPr>
+                <w:rFonts w:ascii="Times New Roman" w:hAnsi="Times New Roman" w:cs="Times New Roman"/>
+                <w:sz w:val="18"/>
+                <w:szCs w:val="18"/>
+              </w:rPr>
+            </w:pPr>
+            <w:r>
+              <w:rPr>
+                <w:rFonts w:ascii="Times New Roman" w:hAnsi="Times New Roman" w:cs="Times New Roman"/>
+                <w:sz w:val="18"/>
+                <w:szCs w:val="18"/>
+              </w:rPr>
               <w:t>7</w:t>
             </w:r>
           </w:p>
         </w:tc>
         <w:tc>
           <w:tcPr>
-            <w:tcW w:w="0" w:type="auto"/>
+            <w:tcW w:w="1188" w:type="dxa"/>
             <w:vAlign w:val="center"/>
             <w:hideMark/>
           </w:tcPr>
@@ -22519,7 +22597,7 @@
         </w:tc>
         <w:tc>
           <w:tcPr>
-            <w:tcW w:w="0" w:type="auto"/>
+            <w:tcW w:w="652" w:type="dxa"/>
             <w:vAlign w:val="center"/>
             <w:hideMark/>
           </w:tcPr>
@@ -22543,7 +22621,7 @@
         </w:tc>
         <w:tc>
           <w:tcPr>
-            <w:tcW w:w="0" w:type="auto"/>
+            <w:tcW w:w="492" w:type="dxa"/>
             <w:vAlign w:val="center"/>
             <w:hideMark/>
           </w:tcPr>
@@ -22567,7 +22645,7 @@
         </w:tc>
         <w:tc>
           <w:tcPr>
-            <w:tcW w:w="0" w:type="auto"/>
+            <w:tcW w:w="436" w:type="dxa"/>
             <w:vAlign w:val="center"/>
             <w:hideMark/>
           </w:tcPr>
@@ -22591,7 +22669,7 @@
         </w:tc>
         <w:tc>
           <w:tcPr>
-            <w:tcW w:w="0" w:type="auto"/>
+            <w:tcW w:w="573" w:type="dxa"/>
             <w:vAlign w:val="center"/>
             <w:hideMark/>
           </w:tcPr>
@@ -22615,7 +22693,7 @@
         </w:tc>
         <w:tc>
           <w:tcPr>
-            <w:tcW w:w="0" w:type="auto"/>
+            <w:tcW w:w="770" w:type="dxa"/>
             <w:vAlign w:val="center"/>
             <w:hideMark/>
           </w:tcPr>
@@ -22639,7 +22717,7 @@
         </w:tc>
         <w:tc>
           <w:tcPr>
-            <w:tcW w:w="0" w:type="auto"/>
+            <w:tcW w:w="367" w:type="dxa"/>
             <w:vAlign w:val="center"/>
             <w:hideMark/>
           </w:tcPr>
@@ -22663,7 +22741,7 @@
         </w:tc>
         <w:tc>
           <w:tcPr>
-            <w:tcW w:w="0" w:type="auto"/>
+            <w:tcW w:w="395" w:type="dxa"/>
             <w:vAlign w:val="center"/>
             <w:hideMark/>
           </w:tcPr>
@@ -22687,39 +22765,39 @@
         </w:tc>
         <w:tc>
           <w:tcPr>
-            <w:tcW w:w="0" w:type="auto"/>
-            <w:vAlign w:val="center"/>
-            <w:hideMark/>
-          </w:tcPr>
-          <w:p>
-            <w:pPr>
-              <w:rPr>
-                <w:rFonts w:ascii="Times New Roman" w:hAnsi="Times New Roman" w:cs="Times New Roman"/>
-                <w:sz w:val="18"/>
-                <w:szCs w:val="18"/>
-              </w:rPr>
-            </w:pPr>
-          </w:p>
-        </w:tc>
-        <w:tc>
-          <w:tcPr>
-            <w:tcW w:w="0" w:type="auto"/>
-            <w:vAlign w:val="center"/>
-            <w:hideMark/>
-          </w:tcPr>
-          <w:p>
-            <w:pPr>
-              <w:rPr>
-                <w:rFonts w:ascii="Times New Roman" w:hAnsi="Times New Roman" w:cs="Times New Roman"/>
-                <w:sz w:val="18"/>
-                <w:szCs w:val="18"/>
-              </w:rPr>
-            </w:pPr>
-          </w:p>
-        </w:tc>
-        <w:tc>
-          <w:tcPr>
-            <w:tcW w:w="0" w:type="auto"/>
+            <w:tcW w:w="475" w:type="dxa"/>
+            <w:vAlign w:val="center"/>
+            <w:hideMark/>
+          </w:tcPr>
+          <w:p>
+            <w:pPr>
+              <w:rPr>
+                <w:rFonts w:ascii="Times New Roman" w:hAnsi="Times New Roman" w:cs="Times New Roman"/>
+                <w:sz w:val="18"/>
+                <w:szCs w:val="18"/>
+              </w:rPr>
+            </w:pPr>
+          </w:p>
+        </w:tc>
+        <w:tc>
+          <w:tcPr>
+            <w:tcW w:w="396" w:type="dxa"/>
+            <w:vAlign w:val="center"/>
+            <w:hideMark/>
+          </w:tcPr>
+          <w:p>
+            <w:pPr>
+              <w:rPr>
+                <w:rFonts w:ascii="Times New Roman" w:hAnsi="Times New Roman" w:cs="Times New Roman"/>
+                <w:sz w:val="18"/>
+                <w:szCs w:val="18"/>
+              </w:rPr>
+            </w:pPr>
+          </w:p>
+        </w:tc>
+        <w:tc>
+          <w:tcPr>
+            <w:tcW w:w="377" w:type="dxa"/>
             <w:vAlign w:val="center"/>
             <w:hideMark/>
           </w:tcPr>
@@ -22743,7 +22821,7 @@
         </w:tc>
         <w:tc>
           <w:tcPr>
-            <w:tcW w:w="0" w:type="auto"/>
+            <w:tcW w:w="1610" w:type="dxa"/>
             <w:vAlign w:val="center"/>
             <w:hideMark/>
           </w:tcPr>
@@ -22767,23 +22845,23 @@
         </w:tc>
         <w:tc>
           <w:tcPr>
-            <w:tcW w:w="0" w:type="auto"/>
-            <w:vAlign w:val="center"/>
-            <w:hideMark/>
-          </w:tcPr>
-          <w:p>
-            <w:pPr>
-              <w:rPr>
-                <w:rFonts w:ascii="Times New Roman" w:hAnsi="Times New Roman" w:cs="Times New Roman"/>
-                <w:sz w:val="18"/>
-                <w:szCs w:val="18"/>
-              </w:rPr>
-            </w:pPr>
-          </w:p>
-        </w:tc>
-        <w:tc>
-          <w:tcPr>
-            <w:tcW w:w="0" w:type="auto"/>
+            <w:tcW w:w="465" w:type="dxa"/>
+            <w:vAlign w:val="center"/>
+            <w:hideMark/>
+          </w:tcPr>
+          <w:p>
+            <w:pPr>
+              <w:rPr>
+                <w:rFonts w:ascii="Times New Roman" w:hAnsi="Times New Roman" w:cs="Times New Roman"/>
+                <w:sz w:val="18"/>
+                <w:szCs w:val="18"/>
+              </w:rPr>
+            </w:pPr>
+          </w:p>
+        </w:tc>
+        <w:tc>
+          <w:tcPr>
+            <w:tcW w:w="504" w:type="dxa"/>
             <w:vAlign w:val="center"/>
             <w:hideMark/>
           </w:tcPr>
@@ -22812,7 +22890,7 @@
         </w:trPr>
         <w:tc>
           <w:tcPr>
-            <w:tcW w:w="0" w:type="auto"/>
+            <w:tcW w:w="517" w:type="dxa"/>
             <w:vAlign w:val="center"/>
             <w:hideMark/>
           </w:tcPr>
@@ -22836,7 +22914,7 @@
         </w:tc>
         <w:tc>
           <w:tcPr>
-            <w:tcW w:w="0" w:type="auto"/>
+            <w:tcW w:w="1188" w:type="dxa"/>
             <w:vAlign w:val="center"/>
             <w:hideMark/>
           </w:tcPr>
@@ -22860,7 +22938,7 @@
         </w:tc>
         <w:tc>
           <w:tcPr>
-            <w:tcW w:w="0" w:type="auto"/>
+            <w:tcW w:w="652" w:type="dxa"/>
             <w:vAlign w:val="center"/>
             <w:hideMark/>
           </w:tcPr>
@@ -22884,7 +22962,7 @@
         </w:tc>
         <w:tc>
           <w:tcPr>
-            <w:tcW w:w="0" w:type="auto"/>
+            <w:tcW w:w="492" w:type="dxa"/>
             <w:vAlign w:val="center"/>
             <w:hideMark/>
           </w:tcPr>
@@ -22908,7 +22986,7 @@
         </w:tc>
         <w:tc>
           <w:tcPr>
-            <w:tcW w:w="0" w:type="auto"/>
+            <w:tcW w:w="436" w:type="dxa"/>
             <w:vAlign w:val="center"/>
             <w:hideMark/>
           </w:tcPr>
@@ -22932,7 +23010,7 @@
         </w:tc>
         <w:tc>
           <w:tcPr>
-            <w:tcW w:w="0" w:type="auto"/>
+            <w:tcW w:w="573" w:type="dxa"/>
             <w:vAlign w:val="center"/>
             <w:hideMark/>
           </w:tcPr>
@@ -22956,7 +23034,7 @@
         </w:tc>
         <w:tc>
           <w:tcPr>
-            <w:tcW w:w="0" w:type="auto"/>
+            <w:tcW w:w="770" w:type="dxa"/>
             <w:vAlign w:val="center"/>
             <w:hideMark/>
           </w:tcPr>
@@ -22980,7 +23058,7 @@
         </w:tc>
         <w:tc>
           <w:tcPr>
-            <w:tcW w:w="0" w:type="auto"/>
+            <w:tcW w:w="367" w:type="dxa"/>
             <w:vAlign w:val="center"/>
             <w:hideMark/>
           </w:tcPr>
@@ -23004,7 +23082,7 @@
         </w:tc>
         <w:tc>
           <w:tcPr>
-            <w:tcW w:w="0" w:type="auto"/>
+            <w:tcW w:w="395" w:type="dxa"/>
             <w:vAlign w:val="center"/>
             <w:hideMark/>
           </w:tcPr>
@@ -23028,39 +23106,39 @@
         </w:tc>
         <w:tc>
           <w:tcPr>
-            <w:tcW w:w="0" w:type="auto"/>
-            <w:vAlign w:val="center"/>
-            <w:hideMark/>
-          </w:tcPr>
-          <w:p>
-            <w:pPr>
-              <w:rPr>
-                <w:rFonts w:ascii="Times New Roman" w:hAnsi="Times New Roman" w:cs="Times New Roman"/>
-                <w:sz w:val="18"/>
-                <w:szCs w:val="18"/>
-              </w:rPr>
-            </w:pPr>
-          </w:p>
-        </w:tc>
-        <w:tc>
-          <w:tcPr>
-            <w:tcW w:w="0" w:type="auto"/>
-            <w:vAlign w:val="center"/>
-            <w:hideMark/>
-          </w:tcPr>
-          <w:p>
-            <w:pPr>
-              <w:rPr>
-                <w:rFonts w:ascii="Times New Roman" w:hAnsi="Times New Roman" w:cs="Times New Roman"/>
-                <w:sz w:val="18"/>
-                <w:szCs w:val="18"/>
-              </w:rPr>
-            </w:pPr>
-          </w:p>
-        </w:tc>
-        <w:tc>
-          <w:tcPr>
-            <w:tcW w:w="0" w:type="auto"/>
+            <w:tcW w:w="475" w:type="dxa"/>
+            <w:vAlign w:val="center"/>
+            <w:hideMark/>
+          </w:tcPr>
+          <w:p>
+            <w:pPr>
+              <w:rPr>
+                <w:rFonts w:ascii="Times New Roman" w:hAnsi="Times New Roman" w:cs="Times New Roman"/>
+                <w:sz w:val="18"/>
+                <w:szCs w:val="18"/>
+              </w:rPr>
+            </w:pPr>
+          </w:p>
+        </w:tc>
+        <w:tc>
+          <w:tcPr>
+            <w:tcW w:w="396" w:type="dxa"/>
+            <w:vAlign w:val="center"/>
+            <w:hideMark/>
+          </w:tcPr>
+          <w:p>
+            <w:pPr>
+              <w:rPr>
+                <w:rFonts w:ascii="Times New Roman" w:hAnsi="Times New Roman" w:cs="Times New Roman"/>
+                <w:sz w:val="18"/>
+                <w:szCs w:val="18"/>
+              </w:rPr>
+            </w:pPr>
+          </w:p>
+        </w:tc>
+        <w:tc>
+          <w:tcPr>
+            <w:tcW w:w="377" w:type="dxa"/>
             <w:vAlign w:val="center"/>
             <w:hideMark/>
           </w:tcPr>
@@ -23084,7 +23162,7 @@
         </w:tc>
         <w:tc>
           <w:tcPr>
-            <w:tcW w:w="0" w:type="auto"/>
+            <w:tcW w:w="1610" w:type="dxa"/>
             <w:vAlign w:val="center"/>
             <w:hideMark/>
           </w:tcPr>
@@ -23108,23 +23186,23 @@
         </w:tc>
         <w:tc>
           <w:tcPr>
-            <w:tcW w:w="0" w:type="auto"/>
-            <w:vAlign w:val="center"/>
-            <w:hideMark/>
-          </w:tcPr>
-          <w:p>
-            <w:pPr>
-              <w:rPr>
-                <w:rFonts w:ascii="Times New Roman" w:hAnsi="Times New Roman" w:cs="Times New Roman"/>
-                <w:sz w:val="18"/>
-                <w:szCs w:val="18"/>
-              </w:rPr>
-            </w:pPr>
-          </w:p>
-        </w:tc>
-        <w:tc>
-          <w:tcPr>
-            <w:tcW w:w="0" w:type="auto"/>
+            <w:tcW w:w="465" w:type="dxa"/>
+            <w:vAlign w:val="center"/>
+            <w:hideMark/>
+          </w:tcPr>
+          <w:p>
+            <w:pPr>
+              <w:rPr>
+                <w:rFonts w:ascii="Times New Roman" w:hAnsi="Times New Roman" w:cs="Times New Roman"/>
+                <w:sz w:val="18"/>
+                <w:szCs w:val="18"/>
+              </w:rPr>
+            </w:pPr>
+          </w:p>
+        </w:tc>
+        <w:tc>
+          <w:tcPr>
+            <w:tcW w:w="504" w:type="dxa"/>
             <w:vAlign w:val="center"/>
             <w:hideMark/>
           </w:tcPr>
@@ -23178,6 +23256,14 @@
       <w:tblPr>
         <w:tblW w:w="0" w:type="auto"/>
         <w:tblCellSpacing w:w="15" w:type="dxa"/>
+        <w:tblBorders>
+          <w:top w:val="single" w:sz="4" w:space="0" w:color="auto"/>
+          <w:left w:val="single" w:sz="4" w:space="0" w:color="auto"/>
+          <w:bottom w:val="single" w:sz="4" w:space="0" w:color="auto"/>
+          <w:right w:val="single" w:sz="4" w:space="0" w:color="auto"/>
+          <w:insideH w:val="single" w:sz="4" w:space="0" w:color="auto"/>
+          <w:insideV w:val="single" w:sz="4" w:space="0" w:color="auto"/>
+        </w:tblBorders>
         <w:tblCellMar>
           <w:top w:w="15" w:type="dxa"/>
           <w:left w:w="15" w:type="dxa"/>
@@ -23187,21 +23273,21 @@
         <w:tblLook w:val="04A0" w:firstRow="1" w:lastRow="0" w:firstColumn="1" w:lastColumn="0" w:noHBand="0" w:noVBand="1"/>
       </w:tblPr>
       <w:tblGrid>
-        <w:gridCol w:w="417"/>
-        <w:gridCol w:w="895"/>
-        <w:gridCol w:w="730"/>
-        <w:gridCol w:w="582"/>
-        <w:gridCol w:w="660"/>
-        <w:gridCol w:w="754"/>
-        <w:gridCol w:w="862"/>
-        <w:gridCol w:w="393"/>
-        <w:gridCol w:w="416"/>
-        <w:gridCol w:w="574"/>
-        <w:gridCol w:w="476"/>
-        <w:gridCol w:w="449"/>
-        <w:gridCol w:w="942"/>
-        <w:gridCol w:w="838"/>
-        <w:gridCol w:w="719"/>
+        <w:gridCol w:w="436"/>
+        <w:gridCol w:w="903"/>
+        <w:gridCol w:w="750"/>
+        <w:gridCol w:w="589"/>
+        <w:gridCol w:w="642"/>
+        <w:gridCol w:w="744"/>
+        <w:gridCol w:w="869"/>
+        <w:gridCol w:w="411"/>
+        <w:gridCol w:w="435"/>
+        <w:gridCol w:w="579"/>
+        <w:gridCol w:w="485"/>
+        <w:gridCol w:w="459"/>
+        <w:gridCol w:w="913"/>
+        <w:gridCol w:w="794"/>
+        <w:gridCol w:w="688"/>
       </w:tblGrid>
       <w:tr>
         <w:trPr>
@@ -24335,6 +24421,7 @@
                 <w:sz w:val="18"/>
                 <w:szCs w:val="18"/>
               </w:rPr>
+              <w:lastRenderedPageBreak/>
               <w:t>3</w:t>
             </w:r>
           </w:p>
@@ -25010,6 +25097,14 @@
       <w:tblPr>
         <w:tblW w:w="0" w:type="auto"/>
         <w:tblCellSpacing w:w="15" w:type="dxa"/>
+        <w:tblBorders>
+          <w:top w:val="single" w:sz="4" w:space="0" w:color="auto"/>
+          <w:left w:val="single" w:sz="4" w:space="0" w:color="auto"/>
+          <w:bottom w:val="single" w:sz="4" w:space="0" w:color="auto"/>
+          <w:right w:val="single" w:sz="4" w:space="0" w:color="auto"/>
+          <w:insideH w:val="single" w:sz="4" w:space="0" w:color="auto"/>
+          <w:insideV w:val="single" w:sz="4" w:space="0" w:color="auto"/>
+        </w:tblBorders>
         <w:tblCellMar>
           <w:top w:w="15" w:type="dxa"/>
           <w:left w:w="15" w:type="dxa"/>
@@ -25019,21 +25114,21 @@
         <w:tblLook w:val="04A0" w:firstRow="1" w:lastRow="0" w:firstColumn="1" w:lastColumn="0" w:noHBand="0" w:noVBand="1"/>
       </w:tblPr>
       <w:tblGrid>
-        <w:gridCol w:w="416"/>
-        <w:gridCol w:w="1107"/>
-        <w:gridCol w:w="670"/>
-        <w:gridCol w:w="540"/>
-        <w:gridCol w:w="542"/>
-        <w:gridCol w:w="648"/>
-        <w:gridCol w:w="821"/>
-        <w:gridCol w:w="381"/>
-        <w:gridCol w:w="410"/>
-        <w:gridCol w:w="527"/>
-        <w:gridCol w:w="439"/>
-        <w:gridCol w:w="416"/>
-        <w:gridCol w:w="1591"/>
-        <w:gridCol w:w="636"/>
-        <w:gridCol w:w="563"/>
+        <w:gridCol w:w="437"/>
+        <w:gridCol w:w="1124"/>
+        <w:gridCol w:w="690"/>
+        <w:gridCol w:w="545"/>
+        <w:gridCol w:w="518"/>
+        <w:gridCol w:w="640"/>
+        <w:gridCol w:w="826"/>
+        <w:gridCol w:w="401"/>
+        <w:gridCol w:w="430"/>
+        <w:gridCol w:w="530"/>
+        <w:gridCol w:w="446"/>
+        <w:gridCol w:w="424"/>
+        <w:gridCol w:w="1563"/>
+        <w:gridCol w:w="582"/>
+        <w:gridCol w:w="541"/>
       </w:tblGrid>
       <w:tr>
         <w:trPr>
@@ -26866,6 +26961,14 @@
       <w:tblPr>
         <w:tblW w:w="0" w:type="auto"/>
         <w:tblCellSpacing w:w="15" w:type="dxa"/>
+        <w:tblBorders>
+          <w:top w:val="single" w:sz="4" w:space="0" w:color="auto"/>
+          <w:left w:val="single" w:sz="4" w:space="0" w:color="auto"/>
+          <w:bottom w:val="single" w:sz="4" w:space="0" w:color="auto"/>
+          <w:right w:val="single" w:sz="4" w:space="0" w:color="auto"/>
+          <w:insideH w:val="single" w:sz="4" w:space="0" w:color="auto"/>
+          <w:insideV w:val="single" w:sz="4" w:space="0" w:color="auto"/>
+        </w:tblBorders>
         <w:tblCellMar>
           <w:top w:w="15" w:type="dxa"/>
           <w:left w:w="15" w:type="dxa"/>
@@ -26875,21 +26978,21 @@
         <w:tblLook w:val="04A0" w:firstRow="1" w:lastRow="0" w:firstColumn="1" w:lastColumn="0" w:noHBand="0" w:noVBand="1"/>
       </w:tblPr>
       <w:tblGrid>
+        <w:gridCol w:w="436"/>
+        <w:gridCol w:w="1120"/>
+        <w:gridCol w:w="690"/>
+        <w:gridCol w:w="533"/>
+        <w:gridCol w:w="488"/>
+        <w:gridCol w:w="621"/>
+        <w:gridCol w:w="816"/>
+        <w:gridCol w:w="401"/>
+        <w:gridCol w:w="430"/>
+        <w:gridCol w:w="518"/>
+        <w:gridCol w:w="436"/>
         <w:gridCol w:w="416"/>
-        <w:gridCol w:w="1104"/>
-        <w:gridCol w:w="670"/>
-        <w:gridCol w:w="529"/>
-        <w:gridCol w:w="511"/>
-        <w:gridCol w:w="628"/>
-        <w:gridCol w:w="811"/>
-        <w:gridCol w:w="381"/>
-        <w:gridCol w:w="410"/>
-        <w:gridCol w:w="515"/>
-        <w:gridCol w:w="430"/>
-        <w:gridCol w:w="408"/>
-        <w:gridCol w:w="1717"/>
-        <w:gridCol w:w="583"/>
-        <w:gridCol w:w="594"/>
+        <w:gridCol w:w="1690"/>
+        <w:gridCol w:w="530"/>
+        <w:gridCol w:w="572"/>
       </w:tblGrid>
       <w:tr>
         <w:trPr>
@@ -29428,6 +29531,14 @@
       <w:tblPr>
         <w:tblW w:w="0" w:type="auto"/>
         <w:tblCellSpacing w:w="15" w:type="dxa"/>
+        <w:tblBorders>
+          <w:top w:val="single" w:sz="4" w:space="0" w:color="auto"/>
+          <w:left w:val="single" w:sz="4" w:space="0" w:color="auto"/>
+          <w:bottom w:val="single" w:sz="4" w:space="0" w:color="auto"/>
+          <w:right w:val="single" w:sz="4" w:space="0" w:color="auto"/>
+          <w:insideH w:val="single" w:sz="4" w:space="0" w:color="auto"/>
+          <w:insideV w:val="single" w:sz="4" w:space="0" w:color="auto"/>
+        </w:tblBorders>
         <w:tblCellMar>
           <w:top w:w="15" w:type="dxa"/>
           <w:left w:w="15" w:type="dxa"/>
@@ -29437,21 +29548,21 @@
         <w:tblLook w:val="04A0" w:firstRow="1" w:lastRow="0" w:firstColumn="1" w:lastColumn="0" w:noHBand="0" w:noVBand="1"/>
       </w:tblPr>
       <w:tblGrid>
-        <w:gridCol w:w="417"/>
-        <w:gridCol w:w="1020"/>
-        <w:gridCol w:w="730"/>
-        <w:gridCol w:w="549"/>
-        <w:gridCol w:w="567"/>
-        <w:gridCol w:w="664"/>
-        <w:gridCol w:w="830"/>
-        <w:gridCol w:w="381"/>
-        <w:gridCol w:w="410"/>
-        <w:gridCol w:w="537"/>
-        <w:gridCol w:w="447"/>
-        <w:gridCol w:w="423"/>
-        <w:gridCol w:w="1413"/>
-        <w:gridCol w:w="680"/>
-        <w:gridCol w:w="639"/>
+        <w:gridCol w:w="437"/>
+        <w:gridCol w:w="1033"/>
+        <w:gridCol w:w="750"/>
+        <w:gridCol w:w="556"/>
+        <w:gridCol w:w="550"/>
+        <w:gridCol w:w="660"/>
+        <w:gridCol w:w="837"/>
+        <w:gridCol w:w="401"/>
+        <w:gridCol w:w="430"/>
+        <w:gridCol w:w="543"/>
+        <w:gridCol w:w="456"/>
+        <w:gridCol w:w="433"/>
+        <w:gridCol w:w="1359"/>
+        <w:gridCol w:w="636"/>
+        <w:gridCol w:w="616"/>
       </w:tblGrid>
       <w:tr>
         <w:trPr>
@@ -31558,6 +31669,14 @@
       <w:tblPr>
         <w:tblW w:w="0" w:type="auto"/>
         <w:tblCellSpacing w:w="15" w:type="dxa"/>
+        <w:tblBorders>
+          <w:top w:val="single" w:sz="4" w:space="0" w:color="auto"/>
+          <w:left w:val="single" w:sz="4" w:space="0" w:color="auto"/>
+          <w:bottom w:val="single" w:sz="4" w:space="0" w:color="auto"/>
+          <w:right w:val="single" w:sz="4" w:space="0" w:color="auto"/>
+          <w:insideH w:val="single" w:sz="4" w:space="0" w:color="auto"/>
+          <w:insideV w:val="single" w:sz="4" w:space="0" w:color="auto"/>
+        </w:tblBorders>
         <w:tblCellMar>
           <w:top w:w="15" w:type="dxa"/>
           <w:left w:w="15" w:type="dxa"/>
@@ -31567,21 +31686,21 @@
         <w:tblLook w:val="04A0" w:firstRow="1" w:lastRow="0" w:firstColumn="1" w:lastColumn="0" w:noHBand="0" w:noVBand="1"/>
       </w:tblPr>
       <w:tblGrid>
-        <w:gridCol w:w="416"/>
-        <w:gridCol w:w="1028"/>
-        <w:gridCol w:w="730"/>
-        <w:gridCol w:w="573"/>
-        <w:gridCol w:w="633"/>
-        <w:gridCol w:w="706"/>
-        <w:gridCol w:w="853"/>
-        <w:gridCol w:w="381"/>
-        <w:gridCol w:w="410"/>
-        <w:gridCol w:w="563"/>
-        <w:gridCol w:w="468"/>
-        <w:gridCol w:w="442"/>
-        <w:gridCol w:w="1155"/>
-        <w:gridCol w:w="792"/>
-        <w:gridCol w:w="557"/>
+        <w:gridCol w:w="436"/>
+        <w:gridCol w:w="1040"/>
+        <w:gridCol w:w="750"/>
+        <w:gridCol w:w="577"/>
+        <w:gridCol w:w="608"/>
+        <w:gridCol w:w="697"/>
+        <w:gridCol w:w="858"/>
+        <w:gridCol w:w="401"/>
+        <w:gridCol w:w="430"/>
+        <w:gridCol w:w="566"/>
+        <w:gridCol w:w="474"/>
+        <w:gridCol w:w="449"/>
+        <w:gridCol w:w="1129"/>
+        <w:gridCol w:w="735"/>
+        <w:gridCol w:w="547"/>
       </w:tblGrid>
       <w:tr>
         <w:trPr>
@@ -33027,7 +33146,16 @@
                 <w:sz w:val="18"/>
                 <w:szCs w:val="18"/>
               </w:rPr>
-              <w:t>Giá trị quy định</w:t>
+              <w:t xml:space="preserve">Giá trị </w:t>
+            </w:r>
+            <w:r>
+              <w:rPr>
+                <w:rFonts w:ascii="Times New Roman" w:hAnsi="Times New Roman" w:cs="Times New Roman"/>
+                <w:sz w:val="18"/>
+                <w:szCs w:val="18"/>
+              </w:rPr>
+              <w:lastRenderedPageBreak/>
+              <w:t>quy định</w:t>
             </w:r>
           </w:p>
         </w:tc>
@@ -33056,6 +33184,7 @@
                 <w:sz w:val="18"/>
                 <w:szCs w:val="18"/>
               </w:rPr>
+              <w:lastRenderedPageBreak/>
               <w:t>4</w:t>
             </w:r>
           </w:p>
@@ -33356,7 +33485,6 @@
           <w:sz w:val="26"/>
           <w:szCs w:val="26"/>
         </w:rPr>
-        <w:lastRenderedPageBreak/>
         <w:t>3.4 Sơ đồ tuần tự (</w:t>
       </w:r>
       <w:r>

</xml_diff>